<commit_message>
feat: faithfully recreate 4-page PDM institutional report preview and docx template populator
</commit_message>
<xml_diff>
--- a/exports/FinLITE-Exported-Report.docx
+++ b/exports/FinLITE-Exported-Report.docx
@@ -57,7 +57,7 @@
         <w:rPr>
           <w:rFonts w:ascii="Times New Roman" w:hAnsi="Times New Roman"/>
         </w:rPr>
-        <w:t>September 10, 2026</w:t>
+        <w:t>April 29, 2026</w:t>
       </w:r>
     </w:p>
     <w:p>
@@ -178,16 +178,8 @@
         <w:rPr>
           <w:rFonts w:ascii="Times New Roman" w:hAnsi="Times New Roman"/>
         </w:rPr>
-        <w:t>Dear {{COORDINATOR_</w:t>
+        <w:t>Dear Mrs. Estrella,</w:t>
       </w:r>
-      <w:proofErr w:type="gramStart"/>
-      <w:r>
-        <w:rPr>
-          <w:rFonts w:ascii="Times New Roman" w:hAnsi="Times New Roman"/>
-        </w:rPr>
-        <w:t>SALUTATION}},</w:t>
-      </w:r>
-      <w:proofErr w:type="gramEnd"/>
     </w:p>
     <w:p>
       <w:pPr>
@@ -239,7 +231,7 @@
         <w:rPr>
           <w:rFonts w:ascii="Times New Roman" w:hAnsi="Times New Roman"/>
         </w:rPr>
-        <w:t>This is to respectfully submit the attached "LITE Financial Report" for the 1st SEMESTER Academic Year 2026-2027.</w:t>
+        <w:t>This is to respectfully submit the attached "LITE Financial Report" for the 2nd SEMESTER Academic Year 2025–2026.</w:t>
       </w:r>
     </w:p>
     <w:p>
@@ -421,10 +413,10 @@
         <w:rPr>
           <w:rFonts w:ascii="Times New Roman" w:hAnsi="Times New Roman"/>
         </w:rPr>
-        <w:t>ANDREI GERONIMO</w:t>
+        <w:t>EULYSIES DOMANTAY</w:t>
         <w:tab/>
         <w:tab/>
-        <w:t>JUAN DELA CRUZ</w:t>
+        <w:t>ANDREI GERONIMO</w:t>
         <w:tab/>
         <w:tab/>
         <w:t>MARIELLE CABANAG</w:t>
@@ -703,7 +695,7 @@
         <w:rPr>
           <w:rFonts w:ascii="Times New Roman" w:hAnsi="Times New Roman"/>
         </w:rPr>
-        <w:t>1st SEMESTER</w:t>
+        <w:t>2nd SEMESTER</w:t>
       </w:r>
     </w:p>
     <w:p>
@@ -719,7 +711,7 @@
         <w:rPr>
           <w:rFonts w:ascii="Times New Roman" w:hAnsi="Times New Roman"/>
         </w:rPr>
-        <w:t>ACADEMIC YEAR 2026-2027</w:t>
+        <w:t>ACADEMIC YEAR 2025–2026</w:t>
       </w:r>
     </w:p>
     <w:p>
@@ -745,7 +737,7 @@
         <w:rPr>
           <w:rFonts w:ascii="Times New Roman" w:hAnsi="Times New Roman"/>
         </w:rPr>
-        <w:t>As of September 2026</w:t>
+        <w:t>As of Club Week 2026</w:t>
       </w:r>
     </w:p>
     <w:p>
@@ -938,7 +930,7 @@
               <w:rPr>
                 <w:rFonts w:ascii="Times New Roman" w:hAnsi="Times New Roman"/>
               </w:rPr>
-              <w:t>{{INCOME_ITEM_1_PARTICULARS}}</w:t>
+              <w:t>Cosplay 5-Peso Vote &amp; Org-Shirt Rebate</w:t>
             </w:r>
           </w:p>
         </w:tc>
@@ -967,7 +959,7 @@
               <w:rPr>
                 <w:rFonts w:ascii="Times New Roman" w:hAnsi="Times New Roman"/>
               </w:rPr>
-              <w:t>{{INCOME_ITEM_1_AMOUNT}}</w:t>
+              <w:t>P18,580.00</w:t>
             </w:r>
           </w:p>
         </w:tc>
@@ -987,7 +979,7 @@
               <w:rPr>
                 <w:rFonts w:ascii="Times New Roman" w:hAnsi="Times New Roman"/>
               </w:rPr>
-              <w:t>{{INCOME_ITEM_2_PARTICULARS}}</w:t>
+              <w:t>E-sports: Honor of Kings &amp; Crossfire</w:t>
             </w:r>
           </w:p>
         </w:tc>
@@ -1016,7 +1008,7 @@
               <w:rPr>
                 <w:rFonts w:ascii="Times New Roman" w:hAnsi="Times New Roman"/>
               </w:rPr>
-              <w:t>{{INCOME_ITEM_2_AMOUNT}}</w:t>
+              <w:t>P2,000.00</w:t>
             </w:r>
           </w:p>
         </w:tc>
@@ -1037,7 +1029,7 @@
               <w:rPr>
                 <w:rFonts w:ascii="Times New Roman" w:hAnsi="Times New Roman"/>
               </w:rPr>
-              <w:t>{{INCOME_ITEM_3_PARTICULARS}}</w:t>
+              <w:t>Game Exhibit: Day 1 &amp; Day 2</w:t>
             </w:r>
           </w:p>
         </w:tc>
@@ -1071,7 +1063,7 @@
               <w:rPr>
                 <w:rFonts w:ascii="Times New Roman" w:hAnsi="Times New Roman"/>
               </w:rPr>
-              <w:t>{{INCOME_ITEM_3_AMOUNT}}</w:t>
+              <w:t>P5,550.00</w:t>
             </w:r>
           </w:p>
         </w:tc>
@@ -1851,7 +1843,7 @@
               <w:rPr>
                 <w:rFonts w:ascii="Times New Roman" w:hAnsi="Times New Roman"/>
               </w:rPr>
-              <w:t>{{EXPENSE_1_PARTICULARS}}</w:t>
+              <w:t>Candle</w:t>
             </w:r>
           </w:p>
         </w:tc>
@@ -1877,7 +1869,7 @@
               <w:rPr>
                 <w:rFonts w:ascii="Times New Roman" w:hAnsi="Times New Roman"/>
               </w:rPr>
-              <w:t>{{EXPENSE_1_AMOUNT}}</w:t>
+              <w:t>P7.00</w:t>
             </w:r>
           </w:p>
         </w:tc>
@@ -1895,7 +1887,7 @@
               <w:rPr>
                 <w:rFonts w:ascii="Times New Roman" w:hAnsi="Times New Roman"/>
               </w:rPr>
-              <w:t>{{EXPENSE_2_PARTICULARS}}</w:t>
+              <w:t>Glue Stick</w:t>
             </w:r>
           </w:p>
         </w:tc>
@@ -1921,7 +1913,7 @@
               <w:rPr>
                 <w:rFonts w:ascii="Times New Roman" w:hAnsi="Times New Roman"/>
               </w:rPr>
-              <w:t>{{EXPENSE_2_AMOUNT}}</w:t>
+              <w:t>P10.00</w:t>
             </w:r>
           </w:p>
         </w:tc>
@@ -1939,7 +1931,7 @@
               <w:rPr>
                 <w:rFonts w:ascii="Times New Roman" w:hAnsi="Times New Roman"/>
               </w:rPr>
-              <w:t>{{EXPENSE_3_PARTICULARS}}</w:t>
+              <w:t>Envelope</w:t>
             </w:r>
           </w:p>
         </w:tc>
@@ -1965,7 +1957,7 @@
               <w:rPr>
                 <w:rFonts w:ascii="Times New Roman" w:hAnsi="Times New Roman"/>
               </w:rPr>
-              <w:t>{{EXPENSE_3_AMOUNT}}</w:t>
+              <w:t>P20.00</w:t>
             </w:r>
           </w:p>
         </w:tc>
@@ -1983,7 +1975,7 @@
               <w:rPr>
                 <w:rFonts w:ascii="Times New Roman" w:hAnsi="Times New Roman"/>
               </w:rPr>
-              <w:t>{{EXPENSE_4_PARTICULARS}}</w:t>
+              <w:t>Green Folder</w:t>
             </w:r>
           </w:p>
         </w:tc>
@@ -2012,7 +2004,7 @@
               <w:rPr>
                 <w:rFonts w:ascii="Times New Roman" w:hAnsi="Times New Roman"/>
               </w:rPr>
-              <w:t>{{EXPENSE_4_AMOUNT}}</w:t>
+              <w:t>P48.00</w:t>
             </w:r>
           </w:p>
         </w:tc>
@@ -2030,7 +2022,7 @@
               <w:rPr>
                 <w:rFonts w:ascii="Times New Roman" w:hAnsi="Times New Roman"/>
               </w:rPr>
-              <w:t>{{EXPENSE_5_PARTICULARS}}</w:t>
+              <w:t>BestBuy Certificate Holder</w:t>
             </w:r>
           </w:p>
         </w:tc>
@@ -2056,7 +2048,7 @@
               <w:rPr>
                 <w:rFonts w:ascii="Times New Roman" w:hAnsi="Times New Roman"/>
               </w:rPr>
-              <w:t>{{EXPENSE_5_AMOUNT}}</w:t>
+              <w:t>P135.00</w:t>
             </w:r>
           </w:p>
         </w:tc>
@@ -2074,7 +2066,7 @@
               <w:rPr>
                 <w:rFonts w:ascii="Times New Roman" w:hAnsi="Times New Roman"/>
               </w:rPr>
-              <w:t>{{EXPENSE_6_PARTICULARS}}</w:t>
+              <w:t>Ribbon</w:t>
             </w:r>
           </w:p>
         </w:tc>
@@ -2100,7 +2092,7 @@
               <w:rPr>
                 <w:rFonts w:ascii="Times New Roman" w:hAnsi="Times New Roman"/>
               </w:rPr>
-              <w:t>{{EXPENSE_6_AMOUNT}}</w:t>
+              <w:t>P150.00</w:t>
             </w:r>
           </w:p>
         </w:tc>
@@ -2118,7 +2110,7 @@
               <w:rPr>
                 <w:rFonts w:ascii="Times New Roman" w:hAnsi="Times New Roman"/>
               </w:rPr>
-              <w:t>{{EXPENSE_7_PARTICULARS}}</w:t>
+              <w:t>Vellum Board A4</w:t>
             </w:r>
           </w:p>
         </w:tc>
@@ -2144,7 +2136,7 @@
               <w:rPr>
                 <w:rFonts w:ascii="Times New Roman" w:hAnsi="Times New Roman"/>
               </w:rPr>
-              <w:t>{{EXPENSE_7_AMOUNT}}</w:t>
+              <w:t>P152.00</w:t>
             </w:r>
           </w:p>
         </w:tc>
@@ -2165,7 +2157,7 @@
               <w:rPr>
                 <w:rFonts w:ascii="Times New Roman" w:hAnsi="Times New Roman"/>
               </w:rPr>
-              <w:t>{{EXPENSE_8_PARTICULARS}}</w:t>
+              <w:t>Students' Travel Fare</w:t>
             </w:r>
           </w:p>
         </w:tc>
@@ -2191,7 +2183,7 @@
               <w:rPr>
                 <w:rFonts w:ascii="Times New Roman" w:hAnsi="Times New Roman"/>
               </w:rPr>
-              <w:t>{{EXPENSE_8_AMOUNT}}</w:t>
+              <w:t>P200.00</w:t>
             </w:r>
           </w:p>
         </w:tc>
@@ -2209,7 +2201,7 @@
               <w:rPr>
                 <w:rFonts w:ascii="Times New Roman" w:hAnsi="Times New Roman"/>
               </w:rPr>
-              <w:t>{{EXPENSE_9_PARTICULARS}}</w:t>
+              <w:t>Sash</w:t>
             </w:r>
           </w:p>
         </w:tc>
@@ -2235,7 +2227,7 @@
               <w:rPr>
                 <w:rFonts w:ascii="Times New Roman" w:hAnsi="Times New Roman"/>
               </w:rPr>
-              <w:t>{{EXPENSE_9_AMOUNT}}</w:t>
+              <w:t>P380.00</w:t>
             </w:r>
           </w:p>
         </w:tc>
@@ -2253,7 +2245,7 @@
               <w:rPr>
                 <w:rFonts w:ascii="Times New Roman" w:hAnsi="Times New Roman"/>
               </w:rPr>
-              <w:t>{{EXPENSE_10_PARTICULARS}}</w:t>
+              <w:t>Cosplay Tarpaulin</w:t>
             </w:r>
           </w:p>
         </w:tc>
@@ -2279,7 +2271,7 @@
               <w:rPr>
                 <w:rFonts w:ascii="Times New Roman" w:hAnsi="Times New Roman"/>
               </w:rPr>
-              <w:t>{{EXPENSE_10_AMOUNT}}</w:t>
+              <w:t>P670.00</w:t>
             </w:r>
           </w:p>
         </w:tc>
@@ -2297,7 +2289,7 @@
               <w:rPr>
                 <w:rFonts w:ascii="Times New Roman" w:hAnsi="Times New Roman"/>
               </w:rPr>
-              <w:t>{{EXPENSE_11_PARTICULARS}}</w:t>
+              <w:t>Career Day</w:t>
             </w:r>
           </w:p>
         </w:tc>
@@ -2323,7 +2315,7 @@
               <w:rPr>
                 <w:rFonts w:ascii="Times New Roman" w:hAnsi="Times New Roman"/>
               </w:rPr>
-              <w:t>{{EXPENSE_11_AMOUNT}}</w:t>
+              <w:t>P1,840.00</w:t>
             </w:r>
           </w:p>
         </w:tc>
@@ -2341,7 +2333,7 @@
               <w:rPr>
                 <w:rFonts w:ascii="Times New Roman" w:hAnsi="Times New Roman"/>
               </w:rPr>
-              <w:t>{{EXPENSE_12_PARTICULARS}}</w:t>
+              <w:t>Judge Token</w:t>
             </w:r>
           </w:p>
         </w:tc>
@@ -2367,7 +2359,7 @@
               <w:rPr>
                 <w:rFonts w:ascii="Times New Roman" w:hAnsi="Times New Roman"/>
               </w:rPr>
-              <w:t>{{EXPENSE_12_AMOUNT}}</w:t>
+              <w:t>P2,510.00</w:t>
             </w:r>
           </w:p>
         </w:tc>
@@ -2385,7 +2377,7 @@
               <w:rPr>
                 <w:rFonts w:ascii="Times New Roman" w:hAnsi="Times New Roman"/>
               </w:rPr>
-              <w:t>{{EXPENSE_13_PARTICULARS}}</w:t>
+              <w:t>Outreach Donation</w:t>
             </w:r>
           </w:p>
         </w:tc>
@@ -2411,7 +2403,7 @@
               <w:rPr>
                 <w:rFonts w:ascii="Times New Roman" w:hAnsi="Times New Roman"/>
               </w:rPr>
-              <w:t>{{EXPENSE_13_AMOUNT}}</w:t>
+              <w:t>P1,000.00</w:t>
             </w:r>
           </w:p>
         </w:tc>
@@ -2429,8 +2421,7 @@
               <w:rPr>
                 <w:rFonts w:ascii="Times New Roman" w:hAnsi="Times New Roman"/>
               </w:rPr>
-              <w:lastRenderedPageBreak/>
-              <w:t>{{EXPENSE_14_PARTICULARS}}</w:t>
+              <w:t>Leadership Seminar</w:t>
             </w:r>
           </w:p>
         </w:tc>
@@ -2456,7 +2447,7 @@
               <w:rPr>
                 <w:rFonts w:ascii="Times New Roman" w:hAnsi="Times New Roman"/>
               </w:rPr>
-              <w:t>{{EXPENSE_14_AMOUNT}}</w:t>
+              <w:t>P500.00</w:t>
             </w:r>
           </w:p>
         </w:tc>
@@ -2474,7 +2465,7 @@
               <w:rPr>
                 <w:rFonts w:ascii="Times New Roman" w:hAnsi="Times New Roman"/>
               </w:rPr>
-              <w:t>{{EXPENSE_15_PARTICULARS}}</w:t>
+              <w:t>Day 1 &amp; 2 Lunch</w:t>
             </w:r>
           </w:p>
         </w:tc>
@@ -2500,7 +2491,7 @@
               <w:rPr>
                 <w:rFonts w:ascii="Times New Roman" w:hAnsi="Times New Roman"/>
               </w:rPr>
-              <w:t>{{EXPENSE_15_AMOUNT}}</w:t>
+              <w:t>P3,655.00</w:t>
             </w:r>
           </w:p>
         </w:tc>
@@ -2518,7 +2509,7 @@
               <w:rPr>
                 <w:rFonts w:ascii="Times New Roman" w:hAnsi="Times New Roman"/>
               </w:rPr>
-              <w:t>{{EXPENSE_16_PARTICULARS}}</w:t>
+              <w:t>Big Brew Drinks</w:t>
             </w:r>
           </w:p>
         </w:tc>
@@ -2544,7 +2535,7 @@
               <w:rPr>
                 <w:rFonts w:ascii="Times New Roman" w:hAnsi="Times New Roman"/>
               </w:rPr>
-              <w:t>{{EXPENSE_16_AMOUNT}}</w:t>
+              <w:t>P800.00</w:t>
             </w:r>
           </w:p>
         </w:tc>
@@ -2562,7 +2553,7 @@
               <w:rPr>
                 <w:rFonts w:ascii="Times New Roman" w:hAnsi="Times New Roman"/>
               </w:rPr>
-              <w:t>{{EXPENSE_17_PARTICULARS}}</w:t>
+              <w:t>Cash Prize</w:t>
             </w:r>
           </w:p>
         </w:tc>
@@ -2588,7 +2579,7 @@
               <w:rPr>
                 <w:rFonts w:ascii="Times New Roman" w:hAnsi="Times New Roman"/>
               </w:rPr>
-              <w:t>{{EXPENSE_17_AMOUNT}}</w:t>
+              <w:t>P4,000.00</w:t>
             </w:r>
           </w:p>
         </w:tc>
@@ -2606,7 +2597,7 @@
               <w:rPr>
                 <w:rFonts w:ascii="Times New Roman" w:hAnsi="Times New Roman"/>
               </w:rPr>
-              <w:t>{{EXPENSE_18_PARTICULARS}}</w:t>
+              <w:t>Dinner</w:t>
             </w:r>
           </w:p>
         </w:tc>
@@ -2632,7 +2623,7 @@
               <w:rPr>
                 <w:rFonts w:ascii="Times New Roman" w:hAnsi="Times New Roman"/>
               </w:rPr>
-              <w:t>{{EXPENSE_18_AMOUNT}}</w:t>
+              <w:t>P5,000.00</w:t>
             </w:r>
           </w:p>
         </w:tc>
@@ -2650,7 +2641,7 @@
               <w:rPr>
                 <w:rFonts w:ascii="Times New Roman" w:hAnsi="Times New Roman"/>
               </w:rPr>
-              <w:t>{{EXPENSE_19_PARTICULARS}}</w:t>
+              <w:t>Public Forum (Net)</w:t>
             </w:r>
           </w:p>
         </w:tc>
@@ -2672,7 +2663,7 @@
               <w:rPr>
                 <w:rFonts w:ascii="Times New Roman" w:hAnsi="Times New Roman"/>
               </w:rPr>
-              <w:t>{{EXPENSE_19_AMOUNT}}</w:t>
+              <w:t>P1,750.00</w:t>
             </w:r>
           </w:p>
         </w:tc>
@@ -2690,7 +2681,7 @@
               <w:rPr>
                 <w:rFonts w:ascii="Times New Roman" w:hAnsi="Times New Roman"/>
               </w:rPr>
-              <w:t>{{EXPENSE_20_PARTICULARS}}</w:t>
+              <w:t>Cash Shortage</w:t>
             </w:r>
           </w:p>
         </w:tc>
@@ -2715,7 +2706,7 @@
               <w:rPr>
                 <w:rFonts w:ascii="Times New Roman" w:hAnsi="Times New Roman"/>
               </w:rPr>
-              <w:t>{{EXPENSE_20_AMOUNT}}</w:t>
+              <w:t>P161.00</w:t>
             </w:r>
           </w:p>
         </w:tc>
@@ -3009,7 +3000,7 @@
         <w:rPr>
           <w:rFonts w:ascii="Times New Roman" w:hAnsi="Times New Roman"/>
         </w:rPr>
-        <w:t>As of September 2026</w:t>
+        <w:t>As of April 2026</w:t>
       </w:r>
     </w:p>
     <w:tbl>
@@ -3403,10 +3394,10 @@
         <w:rPr>
           <w:rFonts w:ascii="Times New Roman" w:hAnsi="Times New Roman"/>
         </w:rPr>
-        <w:t>ANDREI GERONIMO</w:t>
+        <w:t>EULYSIES DOMANTAY</w:t>
         <w:tab/>
         <w:tab/>
-        <w:t>JUAN DELA CRUZ</w:t>
+        <w:t>ANDREI GERONIMO</w:t>
         <w:tab/>
         <w:tab/>
         <w:t>MARIELLE CABANAG</w:t>

</xml_diff>

<commit_message>
fix: enforce consistent Calibri 11pt and invisible table borders across preview and docx export
</commit_message>
<xml_diff>
--- a/exports/FinLITE-Exported-Report.docx
+++ b/exports/FinLITE-Exported-Report.docx
@@ -55,9 +55,10 @@
       </w:pPr>
       <w:r>
         <w:rPr>
-          <w:rFonts w:ascii="Times New Roman" w:hAnsi="Times New Roman"/>
-        </w:rPr>
-        <w:t>April 29, 2026</w:t>
+          <w:rFonts w:ascii="Calibri" w:hAnsi="Calibri"/>
+          <w:sz w:val="22"/>
+        </w:rPr>
+        <w:t>October 14, 2026</w:t>
       </w:r>
     </w:p>
     <w:p>
@@ -93,7 +94,8 @@
       </w:pPr>
       <w:r>
         <w:rPr>
-          <w:rFonts w:ascii="Times New Roman" w:hAnsi="Times New Roman"/>
+          <w:rFonts w:ascii="Calibri" w:hAnsi="Calibri"/>
+          <w:sz w:val="22"/>
         </w:rPr>
         <w:t>Ms. Ligaya H. Estrella</w:t>
       </w:r>
@@ -115,7 +117,8 @@
       </w:pPr>
       <w:r>
         <w:rPr>
-          <w:rFonts w:ascii="Times New Roman" w:hAnsi="Times New Roman"/>
+          <w:rFonts w:ascii="Calibri" w:hAnsi="Calibri"/>
+          <w:sz w:val="22"/>
         </w:rPr>
         <w:t>Co-curricular Affairs Coordinator</w:t>
       </w:r>
@@ -137,7 +140,9 @@
       </w:pPr>
       <w:r>
         <w:rPr>
+          <w:rFonts w:ascii="Calibri" w:hAnsi="Calibri"/>
           <w:color w:val="000000"/>
+          <w:sz w:val="22"/>
         </w:rPr>
         <w:t>This School</w:t>
       </w:r>
@@ -176,7 +181,8 @@
       </w:pPr>
       <w:r>
         <w:rPr>
-          <w:rFonts w:ascii="Times New Roman" w:hAnsi="Times New Roman"/>
+          <w:rFonts w:ascii="Calibri" w:hAnsi="Calibri"/>
+          <w:sz w:val="22"/>
         </w:rPr>
         <w:t>Dear Mrs. Estrella,</w:t>
       </w:r>
@@ -229,9 +235,45 @@
       </w:pPr>
       <w:r>
         <w:rPr>
-          <w:rFonts w:ascii="Times New Roman" w:hAnsi="Times New Roman"/>
-        </w:rPr>
-        <w:t>This is to respectfully submit the attached "LITE Financial Report" for the 2nd SEMESTER Academic Year 2025–2026.</w:t>
+          <w:rFonts w:ascii="Calibri" w:hAnsi="Calibri"/>
+          <w:color w:val="000000"/>
+          <w:sz w:val="22"/>
+        </w:rPr>
+        <w:t>This is to respectfully submit the attached “LITE Financial Report” for the 2</w:t>
+      </w:r>
+      <w:r>
+        <w:rPr>
+          <w:rFonts w:ascii="Calibri" w:hAnsi="Calibri"/>
+          <w:color w:val="000000"/>
+          <w:sz w:val="22"/>
+          <w:vertAlign w:val="superscript"/>
+        </w:rPr>
+        <w:t>nd</w:t>
+      </w:r>
+      <w:r>
+        <w:rPr>
+          <w:rFonts w:ascii="Calibri" w:hAnsi="Calibri"/>
+          <w:color w:val="000000"/>
+          <w:sz w:val="22"/>
+        </w:rPr>
+        <w:t xml:space="preserve"> Semester Academic</w:t>
+      </w:r>
+      <w:r>
+        <w:rPr>
+          <w:rFonts w:ascii="Calibri" w:hAnsi="Calibri"/>
+          <w:color w:val="000000"/>
+          <w:sz w:val="22"/>
+          <w:szCs w:val="24"/>
+        </w:rPr>
+        <w:t xml:space="preserve"> </w:t>
+      </w:r>
+      <w:r>
+        <w:rPr>
+          <w:rFonts w:ascii="Calibri" w:hAnsi="Calibri"/>
+          <w:color w:val="000000"/>
+          <w:sz w:val="22"/>
+        </w:rPr>
+        <w:t>Year 2025 – 2026.</w:t>
       </w:r>
     </w:p>
     <w:p>
@@ -283,7 +325,9 @@
       </w:pPr>
       <w:r>
         <w:rPr>
+          <w:rFonts w:ascii="Calibri" w:hAnsi="Calibri"/>
           <w:color w:val="000000"/>
+          <w:sz w:val="22"/>
         </w:rPr>
         <w:t>Respectfully,</w:t>
       </w:r>
@@ -319,7 +363,9 @@
       </w:pPr>
       <w:r>
         <w:rPr>
+          <w:rFonts w:ascii="Calibri" w:hAnsi="Calibri"/>
           <w:color w:val="000000"/>
+          <w:sz w:val="22"/>
         </w:rPr>
         <w:t>LITE Officers</w:t>
       </w:r>
@@ -373,7 +419,9 @@
       </w:pPr>
       <w:r>
         <w:rPr>
+          <w:rFonts w:ascii="Calibri" w:hAnsi="Calibri"/>
           <w:color w:val="000000"/>
+          <w:sz w:val="22"/>
         </w:rPr>
         <w:t>Prepared by:</w:t>
       </w:r>
@@ -411,9 +459,10 @@
       </w:pPr>
       <w:r>
         <w:rPr>
-          <w:rFonts w:ascii="Times New Roman" w:hAnsi="Times New Roman"/>
-        </w:rPr>
-        <w:t>EULYSIES DOMANTAY</w:t>
+          <w:rFonts w:ascii="Calibri" w:hAnsi="Calibri"/>
+          <w:sz w:val="22"/>
+        </w:rPr>
+        <w:t xml:space="preserve">EULYSIES DOMANTAY </w:t>
         <w:tab/>
         <w:tab/>
         <w:t>ANDREI GERONIMO</w:t>
@@ -439,7 +488,8 @@
       </w:pPr>
       <w:r>
         <w:rPr>
-          <w:rFonts w:ascii="Times New Roman" w:hAnsi="Times New Roman"/>
+          <w:rFonts w:ascii="Calibri" w:hAnsi="Calibri"/>
+          <w:sz w:val="22"/>
         </w:rPr>
         <w:t>LITE PRESIDENT</w:t>
         <w:tab/>
@@ -502,7 +552,8 @@
       </w:pPr>
       <w:r>
         <w:rPr>
-          <w:sz w:val="24"/>
+          <w:rFonts w:ascii="Calibri" w:hAnsi="Calibri"/>
+          <w:sz w:val="22"/>
           <w:szCs w:val="24"/>
         </w:rPr>
         <w:t>Approved by:</w:t>
@@ -529,9 +580,14 @@
       </w:pPr>
       <w:r>
         <w:rPr>
-          <w:rFonts w:ascii="Times New Roman" w:hAnsi="Times New Roman"/>
+          <w:rFonts w:ascii="Calibri" w:hAnsi="Calibri"/>
+          <w:sz w:val="22"/>
         </w:rPr>
         <w:t>KIMBERLY DAWN JATULAN</w:t>
+        <w:tab/>
+        <w:tab/>
+        <w:tab/>
+        <w:tab/>
       </w:r>
     </w:p>
     <w:p>
@@ -544,9 +600,16 @@
       </w:pPr>
       <w:r>
         <w:rPr>
-          <w:rFonts w:ascii="Times New Roman" w:hAnsi="Times New Roman"/>
+          <w:rFonts w:ascii="Calibri" w:hAnsi="Calibri"/>
+          <w:sz w:val="22"/>
         </w:rPr>
         <w:t>LITE ADVISER</w:t>
+        <w:tab/>
+        <w:tab/>
+        <w:tab/>
+        <w:tab/>
+        <w:tab/>
+        <w:tab/>
       </w:r>
     </w:p>
     <w:p>
@@ -568,7 +631,8 @@
       </w:pPr>
       <w:r>
         <w:rPr>
-          <w:sz w:val="24"/>
+          <w:rFonts w:ascii="Calibri" w:hAnsi="Calibri"/>
+          <w:sz w:val="22"/>
           <w:szCs w:val="24"/>
         </w:rPr>
         <w:t>Noted by:</w:t>
@@ -595,9 +659,10 @@
       </w:pPr>
       <w:r>
         <w:rPr>
-          <w:rFonts w:ascii="Times New Roman" w:hAnsi="Times New Roman"/>
-        </w:rPr>
-        <w:t>JOVYLYN ORTIZ-CESAR, MBA, MSIT</w:t>
+          <w:rFonts w:ascii="Calibri" w:hAnsi="Calibri"/>
+          <w:sz w:val="22"/>
+        </w:rPr>
+        <w:t xml:space="preserve">JOVYLYN ORTIZ-CESAR, MBA, MSIT </w:t>
         <w:tab/>
         <w:tab/>
         <w:tab/>
@@ -614,7 +679,8 @@
       </w:pPr>
       <w:r>
         <w:rPr>
-          <w:rFonts w:ascii="Times New Roman" w:hAnsi="Times New Roman"/>
+          <w:rFonts w:ascii="Calibri" w:hAnsi="Calibri"/>
+          <w:sz w:val="22"/>
         </w:rPr>
         <w:t>PROGRAM DIRECTOR</w:t>
         <w:tab/>
@@ -639,6 +705,10 @@
         <w:spacing w:after="0"/>
       </w:pPr>
       <w:r>
+        <w:rPr>
+          <w:rFonts w:ascii="Calibri" w:hAnsi="Calibri"/>
+          <w:sz w:val="22"/>
+        </w:rPr>
         <w:t>cc: Co-Curricular</w:t>
       </w:r>
     </w:p>
@@ -647,7 +717,10 @@
         <w:spacing w:after="0"/>
       </w:pPr>
       <w:r>
-        <w:lastRenderedPageBreak/>
+        <w:rPr>
+          <w:rFonts w:ascii="Calibri" w:hAnsi="Calibri"/>
+          <w:sz w:val="22"/>
+        </w:rPr>
         <w:t>cc: Dean’s Office</w:t>
       </w:r>
     </w:p>
@@ -676,8 +749,10 @@
       </w:pPr>
       <w:r>
         <w:rPr>
+          <w:rFonts w:ascii="Calibri" w:hAnsi="Calibri"/>
           <w:b/>
           <w:bCs/>
+          <w:sz w:val="22"/>
         </w:rPr>
         <w:t>LITE FINANCIAL REPORT</w:t>
       </w:r>
@@ -693,9 +768,10 @@
       </w:pPr>
       <w:r>
         <w:rPr>
-          <w:rFonts w:ascii="Times New Roman" w:hAnsi="Times New Roman"/>
-        </w:rPr>
-        <w:t>2nd SEMESTER</w:t>
+          <w:rFonts w:ascii="Calibri" w:hAnsi="Calibri"/>
+          <w:sz w:val="22"/>
+        </w:rPr>
+        <w:t xml:space="preserve">2nd SEMESTER </w:t>
       </w:r>
     </w:p>
     <w:p>
@@ -709,7 +785,8 @@
       </w:pPr>
       <w:r>
         <w:rPr>
-          <w:rFonts w:ascii="Times New Roman" w:hAnsi="Times New Roman"/>
+          <w:rFonts w:ascii="Calibri" w:hAnsi="Calibri"/>
+          <w:sz w:val="22"/>
         </w:rPr>
         <w:t>ACADEMIC YEAR 2025–2026</w:t>
       </w:r>
@@ -735,9 +812,10 @@
       </w:pPr>
       <w:r>
         <w:rPr>
-          <w:rFonts w:ascii="Times New Roman" w:hAnsi="Times New Roman"/>
-        </w:rPr>
-        <w:t>As of Club Week 2026</w:t>
+          <w:rFonts w:ascii="Calibri" w:hAnsi="Calibri"/>
+          <w:sz w:val="22"/>
+        </w:rPr>
+        <w:t>As of Club Week 2026 &amp; E-Sports Cup</w:t>
       </w:r>
     </w:p>
     <w:p>
@@ -769,9 +847,9 @@
       <w:tblGrid>
         <w:gridCol w:w="2469"/>
         <w:gridCol w:w="3717"/>
-        <w:gridCol w:w="240"/>
-        <w:gridCol w:w="243"/>
-        <w:gridCol w:w="2691"/>
+        <w:gridCol w:w="1469"/>
+        <w:gridCol w:w="425"/>
+        <w:gridCol w:w="1280"/>
       </w:tblGrid>
       <w:tr>
         <w:tc>
@@ -789,10 +867,10 @@
             </w:pPr>
             <w:r>
               <w:rPr>
-                <w:rFonts w:ascii="Times New Roman" w:hAnsi="Times New Roman"/>
-                <w:b/>
-              </w:rPr>
-              <w:t>INITIAL BUDGET (Carried over from Previous Term)</w:t>
+                <w:rFonts w:ascii="Calibri" w:hAnsi="Calibri"/>
+                <w:sz w:val="22"/>
+              </w:rPr>
+              <w:t>INITIAL BUDGET AS OF FEBRUARY (Carried over from 1st Sem)</w:t>
             </w:r>
           </w:p>
         </w:tc>
@@ -811,7 +889,8 @@
             </w:pPr>
             <w:r>
               <w:rPr>
-                <w:rFonts w:ascii="Times New Roman" w:hAnsi="Times New Roman"/>
+                <w:rFonts w:ascii="Calibri" w:hAnsi="Calibri"/>
+                <w:sz w:val="22"/>
               </w:rPr>
               <w:t>Cash from the Box</w:t>
             </w:r>
@@ -833,27 +912,25 @@
         </w:tc>
         <w:tc>
           <w:tcPr>
-            <w:tcW w:w="240" w:type="dxa"/>
+            <w:tcW w:w="1469" w:type="dxa"/>
           </w:tcPr>
           <w:p/>
         </w:tc>
         <w:tc>
           <w:tcPr>
-            <w:tcW w:w="243" w:type="dxa"/>
+            <w:tcW w:w="425" w:type="dxa"/>
           </w:tcPr>
           <w:p/>
         </w:tc>
         <w:tc>
           <w:tcPr>
-            <w:tcW w:w="2691" w:type="dxa"/>
-          </w:tcPr>
-          <w:p>
-            <w:pPr>
-              <w:jc w:val="right"/>
-            </w:pPr>
-            <w:r>
-              <w:rPr>
-                <w:rFonts w:ascii="Times New Roman" w:hAnsi="Times New Roman"/>
+            <w:tcW w:w="1280" w:type="dxa"/>
+          </w:tcPr>
+          <w:p>
+            <w:r>
+              <w:rPr>
+                <w:rFonts w:ascii="Calibri" w:hAnsi="Calibri"/>
+                <w:sz w:val="22"/>
               </w:rPr>
               <w:t>P5,308.00</w:t>
             </w:r>
@@ -876,20 +953,20 @@
         <w:tblW w:w="9360" w:type="dxa"/>
         <w:tblInd w:w="0" w:type="dxa"/>
         <w:tblBorders>
-          <w:top w:val="single" w:sz="4" w:space="0" w:color="auto"/>
-          <w:left w:val="single" w:sz="4" w:space="0" w:color="auto"/>
-          <w:bottom w:val="single" w:sz="4" w:space="0" w:color="auto"/>
-          <w:right w:val="single" w:sz="4" w:space="0" w:color="auto"/>
-          <w:insideH w:val="single" w:sz="4" w:space="0" w:color="auto"/>
-          <w:insideV w:val="single" w:sz="4" w:space="0" w:color="auto"/>
+          <w:top w:val="nil"/>
+          <w:left w:val="nil"/>
+          <w:bottom w:val="nil"/>
+          <w:right w:val="nil"/>
+          <w:insideH w:val="nil"/>
+          <w:insideV w:val="nil"/>
         </w:tblBorders>
         <w:tblLayout w:type="fixed"/>
         <w:tblLook w:val="0400" w:firstRow="0" w:lastRow="0" w:firstColumn="0" w:lastColumn="0" w:noHBand="0" w:noVBand="1"/>
       </w:tblPr>
       <w:tblGrid>
         <w:gridCol w:w="3059"/>
-        <w:gridCol w:w="2328"/>
-        <w:gridCol w:w="3973"/>
+        <w:gridCol w:w="5021"/>
+        <w:gridCol w:w="1280"/>
       </w:tblGrid>
       <w:tr>
         <w:tc>
@@ -907,10 +984,12 @@
             </w:pPr>
             <w:r>
               <w:rPr>
-                <w:rFonts w:ascii="Times New Roman" w:hAnsi="Times New Roman"/>
+                <w:rFonts w:ascii="Calibri" w:hAnsi="Calibri"/>
                 <w:b/>
-              </w:rPr>
-              <w:t>Income / Inflow Collections:</w:t>
+                <w:bCs/>
+                <w:sz w:val="22"/>
+              </w:rPr>
+              <w:t>Income:</w:t>
             </w:r>
           </w:p>
         </w:tc>
@@ -928,15 +1007,16 @@
             </w:pPr>
             <w:r>
               <w:rPr>
-                <w:rFonts w:ascii="Times New Roman" w:hAnsi="Times New Roman"/>
-              </w:rPr>
-              <w:t>Cosplay 5-Peso Vote &amp; Org-Shirt Rebate</w:t>
-            </w:r>
-          </w:p>
-        </w:tc>
-        <w:tc>
-          <w:tcPr>
-            <w:tcW w:w="2328" w:type="dxa"/>
+                <w:rFonts w:ascii="Calibri" w:hAnsi="Calibri"/>
+                <w:sz w:val="22"/>
+              </w:rPr>
+              <w:t>Cosplay 5-Peso Vote</w:t>
+            </w:r>
+          </w:p>
+        </w:tc>
+        <w:tc>
+          <w:tcPr>
+            <w:tcW w:w="5021" w:type="dxa"/>
           </w:tcPr>
           <w:p>
             <w:pPr>
@@ -946,7 +1026,7 @@
         </w:tc>
         <w:tc>
           <w:tcPr>
-            <w:tcW w:w="3973" w:type="dxa"/>
+            <w:tcW w:w="1280" w:type="dxa"/>
           </w:tcPr>
           <w:p>
             <w:pPr>
@@ -957,9 +1037,10 @@
             </w:pPr>
             <w:r>
               <w:rPr>
-                <w:rFonts w:ascii="Times New Roman" w:hAnsi="Times New Roman"/>
-              </w:rPr>
-              <w:t>P18,580.00</w:t>
+                <w:rFonts w:ascii="Calibri" w:hAnsi="Calibri"/>
+                <w:sz w:val="22"/>
+              </w:rPr>
+              <w:t>P9,760.00</w:t>
             </w:r>
           </w:p>
         </w:tc>
@@ -977,15 +1058,16 @@
             </w:pPr>
             <w:r>
               <w:rPr>
-                <w:rFonts w:ascii="Times New Roman" w:hAnsi="Times New Roman"/>
-              </w:rPr>
-              <w:t>E-sports: Honor of Kings &amp; Crossfire</w:t>
-            </w:r>
-          </w:p>
-        </w:tc>
-        <w:tc>
-          <w:tcPr>
-            <w:tcW w:w="2328" w:type="dxa"/>
+                <w:rFonts w:ascii="Calibri" w:hAnsi="Calibri"/>
+                <w:sz w:val="22"/>
+              </w:rPr>
+              <w:t>Org-Shirt Rebate</w:t>
+            </w:r>
+          </w:p>
+        </w:tc>
+        <w:tc>
+          <w:tcPr>
+            <w:tcW w:w="5021" w:type="dxa"/>
           </w:tcPr>
           <w:p>
             <w:pPr>
@@ -995,7 +1077,10 @@
         </w:tc>
         <w:tc>
           <w:tcPr>
-            <w:tcW w:w="3973" w:type="dxa"/>
+            <w:tcW w:w="1280" w:type="dxa"/>
+            <w:tcBorders>
+              <w:bottom w:val="single" w:sz="4" w:space="0" w:color="000000"/>
+            </w:tcBorders>
           </w:tcPr>
           <w:p>
             <w:pPr>
@@ -1006,9 +1091,10 @@
             </w:pPr>
             <w:r>
               <w:rPr>
-                <w:rFonts w:ascii="Times New Roman" w:hAnsi="Times New Roman"/>
-              </w:rPr>
-              <w:t>P2,000.00</w:t>
+                <w:rFonts w:ascii="Calibri" w:hAnsi="Calibri"/>
+                <w:sz w:val="22"/>
+              </w:rPr>
+              <w:t>P8,820.00</w:t>
             </w:r>
           </w:p>
         </w:tc>
@@ -1025,17 +1111,11 @@
                 <w:bCs/>
               </w:rPr>
             </w:pPr>
-            <w:r>
-              <w:rPr>
-                <w:rFonts w:ascii="Times New Roman" w:hAnsi="Times New Roman"/>
-              </w:rPr>
-              <w:t>Game Exhibit: Day 1 &amp; Day 2</w:t>
-            </w:r>
-          </w:p>
-        </w:tc>
-        <w:tc>
-          <w:tcPr>
-            <w:tcW w:w="2328" w:type="dxa"/>
+          </w:p>
+        </w:tc>
+        <w:tc>
+          <w:tcPr>
+            <w:tcW w:w="5021" w:type="dxa"/>
           </w:tcPr>
           <w:p>
             <w:pPr>
@@ -1049,7 +1129,10 @@
         </w:tc>
         <w:tc>
           <w:tcPr>
-            <w:tcW w:w="3973" w:type="dxa"/>
+            <w:tcW w:w="1280" w:type="dxa"/>
+            <w:tcBorders>
+              <w:top w:val="single" w:sz="4" w:space="0" w:color="000000"/>
+            </w:tcBorders>
           </w:tcPr>
           <w:p>
             <w:pPr>
@@ -1061,9 +1144,12 @@
             </w:pPr>
             <w:r>
               <w:rPr>
-                <w:rFonts w:ascii="Times New Roman" w:hAnsi="Times New Roman"/>
-              </w:rPr>
-              <w:t>P5,550.00</w:t>
+                <w:rFonts w:ascii="Calibri" w:hAnsi="Calibri"/>
+                <w:b/>
+                <w:bCs/>
+                <w:sz w:val="22"/>
+              </w:rPr>
+              <w:t>P18,580.00</w:t>
             </w:r>
           </w:p>
         </w:tc>
@@ -1088,7 +1174,7 @@
         </w:tc>
         <w:tc>
           <w:tcPr>
-            <w:tcW w:w="2328" w:type="dxa"/>
+            <w:tcW w:w="5021" w:type="dxa"/>
           </w:tcPr>
           <w:p>
             <w:pPr>
@@ -1102,7 +1188,7 @@
         </w:tc>
         <w:tc>
           <w:tcPr>
-            <w:tcW w:w="3973" w:type="dxa"/>
+            <w:tcW w:w="1280" w:type="dxa"/>
           </w:tcPr>
           <w:p>
             <w:pPr>
@@ -1131,25 +1217,34 @@
                 <w:bCs/>
               </w:rPr>
             </w:pPr>
-          </w:p>
-        </w:tc>
-        <w:tc>
-          <w:tcPr>
-            <w:tcW w:w="2328" w:type="dxa"/>
-          </w:tcPr>
-          <w:p>
-            <w:pPr>
-              <w:jc w:val="center"/>
-              <w:rPr>
+            <w:r>
+              <w:rPr>
+                <w:rFonts w:ascii="Calibri" w:hAnsi="Calibri"/>
                 <w:b/>
                 <w:bCs/>
-              </w:rPr>
-            </w:pPr>
-          </w:p>
-        </w:tc>
-        <w:tc>
-          <w:tcPr>
-            <w:tcW w:w="3973" w:type="dxa"/>
+                <w:sz w:val="22"/>
+              </w:rPr>
+              <w:t>E-sports: Day 1 – 2</w:t>
+            </w:r>
+          </w:p>
+        </w:tc>
+        <w:tc>
+          <w:tcPr>
+            <w:tcW w:w="5021" w:type="dxa"/>
+          </w:tcPr>
+          <w:p>
+            <w:pPr>
+              <w:jc w:val="center"/>
+              <w:rPr>
+                <w:b/>
+                <w:bCs/>
+              </w:rPr>
+            </w:pPr>
+          </w:p>
+        </w:tc>
+        <w:tc>
+          <w:tcPr>
+            <w:tcW w:w="1280" w:type="dxa"/>
           </w:tcPr>
           <w:p>
             <w:pPr>
@@ -1178,11 +1273,18 @@
                 <w:bCs/>
               </w:rPr>
             </w:pPr>
-          </w:p>
-        </w:tc>
-        <w:tc>
-          <w:tcPr>
-            <w:tcW w:w="2328" w:type="dxa"/>
+            <w:r>
+              <w:rPr>
+                <w:rFonts w:ascii="Calibri" w:hAnsi="Calibri"/>
+                <w:sz w:val="22"/>
+              </w:rPr>
+              <w:t>Honor Of Kings</w:t>
+            </w:r>
+          </w:p>
+        </w:tc>
+        <w:tc>
+          <w:tcPr>
+            <w:tcW w:w="5021" w:type="dxa"/>
           </w:tcPr>
           <w:p>
             <w:pPr>
@@ -1196,7 +1298,7 @@
         </w:tc>
         <w:tc>
           <w:tcPr>
-            <w:tcW w:w="3973" w:type="dxa"/>
+            <w:tcW w:w="1280" w:type="dxa"/>
           </w:tcPr>
           <w:p>
             <w:pPr>
@@ -1206,6 +1308,13 @@
                 <w:bCs/>
               </w:rPr>
             </w:pPr>
+            <w:r>
+              <w:rPr>
+                <w:rFonts w:ascii="Calibri" w:hAnsi="Calibri"/>
+                <w:sz w:val="22"/>
+              </w:rPr>
+              <w:t>P1,000.00</w:t>
+            </w:r>
           </w:p>
         </w:tc>
       </w:tr>
@@ -1225,11 +1334,18 @@
                 <w:bCs/>
               </w:rPr>
             </w:pPr>
-          </w:p>
-        </w:tc>
-        <w:tc>
-          <w:tcPr>
-            <w:tcW w:w="2328" w:type="dxa"/>
+            <w:r>
+              <w:rPr>
+                <w:rFonts w:ascii="Calibri" w:hAnsi="Calibri"/>
+                <w:sz w:val="22"/>
+              </w:rPr>
+              <w:t>Crossfire: Legends</w:t>
+            </w:r>
+          </w:p>
+        </w:tc>
+        <w:tc>
+          <w:tcPr>
+            <w:tcW w:w="5021" w:type="dxa"/>
           </w:tcPr>
           <w:p>
             <w:pPr>
@@ -1243,7 +1359,10 @@
         </w:tc>
         <w:tc>
           <w:tcPr>
-            <w:tcW w:w="3973" w:type="dxa"/>
+            <w:tcW w:w="1280" w:type="dxa"/>
+            <w:tcBorders>
+              <w:bottom w:val="single" w:sz="4" w:space="0" w:color="000000"/>
+            </w:tcBorders>
           </w:tcPr>
           <w:p>
             <w:pPr>
@@ -1253,6 +1372,13 @@
                 <w:bCs/>
               </w:rPr>
             </w:pPr>
+            <w:r>
+              <w:rPr>
+                <w:rFonts w:ascii="Calibri" w:hAnsi="Calibri"/>
+                <w:sz w:val="22"/>
+              </w:rPr>
+              <w:t>P1,000.00</w:t>
+            </w:r>
           </w:p>
         </w:tc>
       </w:tr>
@@ -1276,7 +1402,7 @@
         </w:tc>
         <w:tc>
           <w:tcPr>
-            <w:tcW w:w="2328" w:type="dxa"/>
+            <w:tcW w:w="5021" w:type="dxa"/>
           </w:tcPr>
           <w:p>
             <w:pPr>
@@ -1290,7 +1416,10 @@
         </w:tc>
         <w:tc>
           <w:tcPr>
-            <w:tcW w:w="3973" w:type="dxa"/>
+            <w:tcW w:w="1280" w:type="dxa"/>
+            <w:tcBorders>
+              <w:top w:val="single" w:sz="4" w:space="0" w:color="000000"/>
+            </w:tcBorders>
           </w:tcPr>
           <w:p>
             <w:pPr>
@@ -1300,6 +1429,15 @@
                 <w:bCs/>
               </w:rPr>
             </w:pPr>
+            <w:r>
+              <w:rPr>
+                <w:rFonts w:ascii="Calibri" w:hAnsi="Calibri"/>
+                <w:b/>
+                <w:bCs/>
+                <w:sz w:val="22"/>
+              </w:rPr>
+              <w:t>P2,000.00</w:t>
+            </w:r>
           </w:p>
         </w:tc>
       </w:tr>
@@ -1322,12 +1460,12 @@
         <w:tblW w:w="9350" w:type="dxa"/>
         <w:tblInd w:w="0" w:type="dxa"/>
         <w:tblBorders>
-          <w:top w:val="single" w:sz="4" w:space="0" w:color="auto"/>
-          <w:left w:val="single" w:sz="4" w:space="0" w:color="auto"/>
-          <w:bottom w:val="single" w:sz="4" w:space="0" w:color="auto"/>
-          <w:right w:val="single" w:sz="4" w:space="0" w:color="auto"/>
-          <w:insideH w:val="single" w:sz="4" w:space="0" w:color="auto"/>
-          <w:insideV w:val="single" w:sz="4" w:space="0" w:color="auto"/>
+          <w:top w:val="nil"/>
+          <w:left w:val="nil"/>
+          <w:bottom w:val="nil"/>
+          <w:right w:val="nil"/>
+          <w:insideH w:val="nil"/>
+          <w:insideV w:val="nil"/>
         </w:tblBorders>
         <w:tblLayout w:type="fixed"/>
         <w:tblLook w:val="0400" w:firstRow="0" w:lastRow="0" w:firstColumn="0" w:lastColumn="0" w:noHBand="0" w:noVBand="1"/>
@@ -1354,6 +1492,31 @@
                 <w:bCs/>
               </w:rPr>
             </w:pPr>
+            <w:r>
+              <w:rPr>
+                <w:rFonts w:ascii="Calibri" w:hAnsi="Calibri"/>
+                <w:b/>
+                <w:bCs/>
+                <w:sz w:val="22"/>
+              </w:rPr>
+              <w:t xml:space="preserve">Game Exhibit: </w:t>
+            </w:r>
+            <w:r>
+              <w:rPr>
+                <w:rFonts w:ascii="Calibri" w:hAnsi="Calibri"/>
+                <w:sz w:val="22"/>
+              </w:rPr>
+              <w:t>Day</w:t>
+            </w:r>
+            <w:r>
+              <w:rPr>
+                <w:rFonts w:ascii="Calibri" w:hAnsi="Calibri"/>
+                <w:b/>
+                <w:bCs/>
+                <w:sz w:val="22"/>
+              </w:rPr>
+              <w:t xml:space="preserve"> 1 – 2</w:t>
+            </w:r>
           </w:p>
         </w:tc>
         <w:tc>
@@ -1390,6 +1553,13 @@
             <w:pPr>
               <w:jc w:val="both"/>
             </w:pPr>
+            <w:r>
+              <w:rPr>
+                <w:rFonts w:ascii="Calibri" w:hAnsi="Calibri"/>
+                <w:sz w:val="22"/>
+              </w:rPr>
+              <w:t>February 26, 2026</w:t>
+            </w:r>
           </w:p>
         </w:tc>
         <w:tc>
@@ -1411,6 +1581,13 @@
             <w:pPr>
               <w:jc w:val="right"/>
             </w:pPr>
+            <w:r>
+              <w:rPr>
+                <w:rFonts w:ascii="Calibri" w:hAnsi="Calibri"/>
+                <w:sz w:val="22"/>
+              </w:rPr>
+              <w:t>P5,230.00</w:t>
+            </w:r>
           </w:p>
         </w:tc>
       </w:tr>
@@ -1426,6 +1603,13 @@
             <w:pPr>
               <w:jc w:val="both"/>
             </w:pPr>
+            <w:r>
+              <w:rPr>
+                <w:rFonts w:ascii="Calibri" w:hAnsi="Calibri"/>
+                <w:sz w:val="22"/>
+              </w:rPr>
+              <w:t>February 27, 2026</w:t>
+            </w:r>
           </w:p>
         </w:tc>
         <w:tc>
@@ -1442,6 +1626,9 @@
         <w:tc>
           <w:tcPr>
             <w:tcW w:w="1270" w:type="dxa"/>
+            <w:tcBorders>
+              <w:bottom w:val="single" w:sz="4" w:space="0" w:color="000000"/>
+            </w:tcBorders>
           </w:tcPr>
           <w:p>
             <w:pPr>
@@ -1450,6 +1637,20 @@
               </w:tabs>
               <w:jc w:val="right"/>
             </w:pPr>
+            <w:r>
+              <w:rPr>
+                <w:rFonts w:ascii="Calibri" w:hAnsi="Calibri"/>
+                <w:sz w:val="22"/>
+              </w:rPr>
+              <w:t>P320.00</w:t>
+            </w:r>
+            <w:r>
+              <w:rPr>
+                <w:rFonts w:ascii="Calibri" w:hAnsi="Calibri"/>
+                <w:sz w:val="22"/>
+              </w:rPr>
+              <w:tab/>
+            </w:r>
           </w:p>
         </w:tc>
       </w:tr>
@@ -1489,6 +1690,9 @@
         <w:tc>
           <w:tcPr>
             <w:tcW w:w="1270" w:type="dxa"/>
+            <w:tcBorders>
+              <w:top w:val="single" w:sz="4" w:space="0" w:color="000000"/>
+            </w:tcBorders>
           </w:tcPr>
           <w:p>
             <w:pPr>
@@ -1498,6 +1702,15 @@
                 <w:bCs/>
               </w:rPr>
             </w:pPr>
+            <w:r>
+              <w:rPr>
+                <w:rFonts w:ascii="Calibri" w:hAnsi="Calibri"/>
+                <w:b/>
+                <w:bCs/>
+                <w:sz w:val="22"/>
+              </w:rPr>
+              <w:t>P5,550.00</w:t>
+            </w:r>
           </w:p>
         </w:tc>
       </w:tr>
@@ -1519,10 +1732,12 @@
             </w:pPr>
             <w:r>
               <w:rPr>
-                <w:rFonts w:ascii="Times New Roman" w:hAnsi="Times New Roman"/>
+                <w:rFonts w:ascii="Calibri" w:hAnsi="Calibri"/>
                 <w:b/>
-              </w:rPr>
-              <w:t>Total Income (Funds Available):</w:t>
+                <w:bCs/>
+                <w:sz w:val="22"/>
+              </w:rPr>
+              <w:t>Total Income:</w:t>
             </w:r>
           </w:p>
         </w:tc>
@@ -1546,18 +1761,12 @@
             <w:tcW w:w="1270" w:type="dxa"/>
           </w:tcPr>
           <w:p>
-            <w:pPr>
-              <w:jc w:val="right"/>
-              <w:rPr>
-                <w:b/>
-                <w:bCs/>
-              </w:rPr>
-            </w:pPr>
-            <w:r>
-              <w:rPr>
-                <w:rFonts w:ascii="Times New Roman" w:hAnsi="Times New Roman"/>
-              </w:rPr>
-              <w:t>P31,438.00</w:t>
+            <w:r>
+              <w:rPr>
+                <w:rFonts w:ascii="Calibri" w:hAnsi="Calibri"/>
+                <w:sz w:val="22"/>
+              </w:rPr>
+              <w:t>P21,778.00</w:t>
             </w:r>
           </w:p>
         </w:tc>
@@ -1794,8 +2003,10 @@
             </w:pPr>
             <w:r>
               <w:rPr>
-                <w:rFonts w:ascii="Times New Roman" w:hAnsi="Times New Roman"/>
+                <w:rFonts w:ascii="Calibri" w:hAnsi="Calibri"/>
                 <w:b/>
+                <w:bCs/>
+                <w:sz w:val="22"/>
               </w:rPr>
               <w:t>Expenses:</w:t>
             </w:r>
@@ -1814,7 +2025,6 @@
                 <w:tab w:val="left" w:pos="192"/>
                 <w:tab w:val="center" w:pos="4567"/>
               </w:tabs>
-              <w:jc w:val="right"/>
               <w:rPr>
                 <w:b/>
                 <w:bCs/>
@@ -1822,10 +2032,12 @@
             </w:pPr>
             <w:r>
               <w:rPr>
-                <w:rFonts w:ascii="Times New Roman" w:hAnsi="Times New Roman"/>
+                <w:rFonts w:ascii="Calibri" w:hAnsi="Calibri"/>
                 <w:b/>
-              </w:rPr>
-              <w:t>Itemized Disbursements / Miscellaneous Expenses</w:t>
+                <w:bCs/>
+                <w:sz w:val="22"/>
+              </w:rPr>
+              <w:t>Miscellaneous Expenses</w:t>
             </w:r>
           </w:p>
         </w:tc>
@@ -1841,7 +2053,8 @@
             </w:pPr>
             <w:r>
               <w:rPr>
-                <w:rFonts w:ascii="Times New Roman" w:hAnsi="Times New Roman"/>
+                <w:rFonts w:ascii="Calibri" w:hAnsi="Calibri"/>
+                <w:sz w:val="22"/>
               </w:rPr>
               <w:t>Candle</w:t>
             </w:r>
@@ -1867,7 +2080,8 @@
             </w:pPr>
             <w:r>
               <w:rPr>
-                <w:rFonts w:ascii="Times New Roman" w:hAnsi="Times New Roman"/>
+                <w:rFonts w:ascii="Calibri" w:hAnsi="Calibri"/>
+                <w:sz w:val="22"/>
               </w:rPr>
               <w:t>P7.00</w:t>
             </w:r>
@@ -1885,7 +2099,8 @@
             </w:pPr>
             <w:r>
               <w:rPr>
-                <w:rFonts w:ascii="Times New Roman" w:hAnsi="Times New Roman"/>
+                <w:rFonts w:ascii="Calibri" w:hAnsi="Calibri"/>
+                <w:sz w:val="22"/>
               </w:rPr>
               <w:t>Glue Stick</w:t>
             </w:r>
@@ -1911,7 +2126,8 @@
             </w:pPr>
             <w:r>
               <w:rPr>
-                <w:rFonts w:ascii="Times New Roman" w:hAnsi="Times New Roman"/>
+                <w:rFonts w:ascii="Calibri" w:hAnsi="Calibri"/>
+                <w:sz w:val="22"/>
               </w:rPr>
               <w:t>P10.00</w:t>
             </w:r>
@@ -1929,7 +2145,8 @@
             </w:pPr>
             <w:r>
               <w:rPr>
-                <w:rFonts w:ascii="Times New Roman" w:hAnsi="Times New Roman"/>
+                <w:rFonts w:ascii="Calibri" w:hAnsi="Calibri"/>
+                <w:sz w:val="22"/>
               </w:rPr>
               <w:t>Envelope</w:t>
             </w:r>
@@ -1955,7 +2172,8 @@
             </w:pPr>
             <w:r>
               <w:rPr>
-                <w:rFonts w:ascii="Times New Roman" w:hAnsi="Times New Roman"/>
+                <w:rFonts w:ascii="Calibri" w:hAnsi="Calibri"/>
+                <w:sz w:val="22"/>
               </w:rPr>
               <w:t>P20.00</w:t>
             </w:r>
@@ -1973,7 +2191,8 @@
             </w:pPr>
             <w:r>
               <w:rPr>
-                <w:rFonts w:ascii="Times New Roman" w:hAnsi="Times New Roman"/>
+                <w:rFonts w:ascii="Calibri" w:hAnsi="Calibri"/>
+                <w:sz w:val="22"/>
               </w:rPr>
               <w:t>Green Folder</w:t>
             </w:r>
@@ -2002,7 +2221,8 @@
             </w:pPr>
             <w:r>
               <w:rPr>
-                <w:rFonts w:ascii="Times New Roman" w:hAnsi="Times New Roman"/>
+                <w:rFonts w:ascii="Calibri" w:hAnsi="Calibri"/>
+                <w:sz w:val="22"/>
               </w:rPr>
               <w:t>P48.00</w:t>
             </w:r>
@@ -2020,7 +2240,8 @@
             </w:pPr>
             <w:r>
               <w:rPr>
-                <w:rFonts w:ascii="Times New Roman" w:hAnsi="Times New Roman"/>
+                <w:rFonts w:ascii="Calibri" w:hAnsi="Calibri"/>
+                <w:sz w:val="22"/>
               </w:rPr>
               <w:t>BestBuy Certificate Holder</w:t>
             </w:r>
@@ -2046,7 +2267,8 @@
             </w:pPr>
             <w:r>
               <w:rPr>
-                <w:rFonts w:ascii="Times New Roman" w:hAnsi="Times New Roman"/>
+                <w:rFonts w:ascii="Calibri" w:hAnsi="Calibri"/>
+                <w:sz w:val="22"/>
               </w:rPr>
               <w:t>P135.00</w:t>
             </w:r>
@@ -2064,7 +2286,8 @@
             </w:pPr>
             <w:r>
               <w:rPr>
-                <w:rFonts w:ascii="Times New Roman" w:hAnsi="Times New Roman"/>
+                <w:rFonts w:ascii="Calibri" w:hAnsi="Calibri"/>
+                <w:sz w:val="22"/>
               </w:rPr>
               <w:t>Ribbon</w:t>
             </w:r>
@@ -2090,7 +2313,8 @@
             </w:pPr>
             <w:r>
               <w:rPr>
-                <w:rFonts w:ascii="Times New Roman" w:hAnsi="Times New Roman"/>
+                <w:rFonts w:ascii="Calibri" w:hAnsi="Calibri"/>
+                <w:sz w:val="22"/>
               </w:rPr>
               <w:t>P150.00</w:t>
             </w:r>
@@ -2108,7 +2332,8 @@
             </w:pPr>
             <w:r>
               <w:rPr>
-                <w:rFonts w:ascii="Times New Roman" w:hAnsi="Times New Roman"/>
+                <w:rFonts w:ascii="Calibri" w:hAnsi="Calibri"/>
+                <w:sz w:val="22"/>
               </w:rPr>
               <w:t>Vellum Board A4</w:t>
             </w:r>
@@ -2134,7 +2359,8 @@
             </w:pPr>
             <w:r>
               <w:rPr>
-                <w:rFonts w:ascii="Times New Roman" w:hAnsi="Times New Roman"/>
+                <w:rFonts w:ascii="Calibri" w:hAnsi="Calibri"/>
+                <w:sz w:val="22"/>
               </w:rPr>
               <w:t>P152.00</w:t>
             </w:r>
@@ -2155,7 +2381,8 @@
             </w:pPr>
             <w:r>
               <w:rPr>
-                <w:rFonts w:ascii="Times New Roman" w:hAnsi="Times New Roman"/>
+                <w:rFonts w:ascii="Calibri" w:hAnsi="Calibri"/>
+                <w:sz w:val="22"/>
               </w:rPr>
               <w:t>Students' Travel Fare</w:t>
             </w:r>
@@ -2181,7 +2408,8 @@
             </w:pPr>
             <w:r>
               <w:rPr>
-                <w:rFonts w:ascii="Times New Roman" w:hAnsi="Times New Roman"/>
+                <w:rFonts w:ascii="Calibri" w:hAnsi="Calibri"/>
+                <w:sz w:val="22"/>
               </w:rPr>
               <w:t>P200.00</w:t>
             </w:r>
@@ -2199,7 +2427,8 @@
             </w:pPr>
             <w:r>
               <w:rPr>
-                <w:rFonts w:ascii="Times New Roman" w:hAnsi="Times New Roman"/>
+                <w:rFonts w:ascii="Calibri" w:hAnsi="Calibri"/>
+                <w:sz w:val="22"/>
               </w:rPr>
               <w:t>Sash</w:t>
             </w:r>
@@ -2225,7 +2454,8 @@
             </w:pPr>
             <w:r>
               <w:rPr>
-                <w:rFonts w:ascii="Times New Roman" w:hAnsi="Times New Roman"/>
+                <w:rFonts w:ascii="Calibri" w:hAnsi="Calibri"/>
+                <w:sz w:val="22"/>
               </w:rPr>
               <w:t>P380.00</w:t>
             </w:r>
@@ -2243,7 +2473,8 @@
             </w:pPr>
             <w:r>
               <w:rPr>
-                <w:rFonts w:ascii="Times New Roman" w:hAnsi="Times New Roman"/>
+                <w:rFonts w:ascii="Calibri" w:hAnsi="Calibri"/>
+                <w:sz w:val="22"/>
               </w:rPr>
               <w:t>Cosplay Tarpaulin</w:t>
             </w:r>
@@ -2269,7 +2500,8 @@
             </w:pPr>
             <w:r>
               <w:rPr>
-                <w:rFonts w:ascii="Times New Roman" w:hAnsi="Times New Roman"/>
+                <w:rFonts w:ascii="Calibri" w:hAnsi="Calibri"/>
+                <w:sz w:val="22"/>
               </w:rPr>
               <w:t>P670.00</w:t>
             </w:r>
@@ -2287,7 +2519,8 @@
             </w:pPr>
             <w:r>
               <w:rPr>
-                <w:rFonts w:ascii="Times New Roman" w:hAnsi="Times New Roman"/>
+                <w:rFonts w:ascii="Calibri" w:hAnsi="Calibri"/>
+                <w:sz w:val="22"/>
               </w:rPr>
               <w:t>Career Day</w:t>
             </w:r>
@@ -2313,7 +2546,8 @@
             </w:pPr>
             <w:r>
               <w:rPr>
-                <w:rFonts w:ascii="Times New Roman" w:hAnsi="Times New Roman"/>
+                <w:rFonts w:ascii="Calibri" w:hAnsi="Calibri"/>
+                <w:sz w:val="22"/>
               </w:rPr>
               <w:t>P1,840.00</w:t>
             </w:r>
@@ -2331,7 +2565,8 @@
             </w:pPr>
             <w:r>
               <w:rPr>
-                <w:rFonts w:ascii="Times New Roman" w:hAnsi="Times New Roman"/>
+                <w:rFonts w:ascii="Calibri" w:hAnsi="Calibri"/>
+                <w:sz w:val="22"/>
               </w:rPr>
               <w:t>Judge Token</w:t>
             </w:r>
@@ -2357,7 +2592,8 @@
             </w:pPr>
             <w:r>
               <w:rPr>
-                <w:rFonts w:ascii="Times New Roman" w:hAnsi="Times New Roman"/>
+                <w:rFonts w:ascii="Calibri" w:hAnsi="Calibri"/>
+                <w:sz w:val="22"/>
               </w:rPr>
               <w:t>P2,510.00</w:t>
             </w:r>
@@ -2375,7 +2611,8 @@
             </w:pPr>
             <w:r>
               <w:rPr>
-                <w:rFonts w:ascii="Times New Roman" w:hAnsi="Times New Roman"/>
+                <w:rFonts w:ascii="Calibri" w:hAnsi="Calibri"/>
+                <w:sz w:val="22"/>
               </w:rPr>
               <w:t>Outreach Donation</w:t>
             </w:r>
@@ -2401,7 +2638,8 @@
             </w:pPr>
             <w:r>
               <w:rPr>
-                <w:rFonts w:ascii="Times New Roman" w:hAnsi="Times New Roman"/>
+                <w:rFonts w:ascii="Calibri" w:hAnsi="Calibri"/>
+                <w:sz w:val="22"/>
               </w:rPr>
               <w:t>P1,000.00</w:t>
             </w:r>
@@ -2419,7 +2657,8 @@
             </w:pPr>
             <w:r>
               <w:rPr>
-                <w:rFonts w:ascii="Times New Roman" w:hAnsi="Times New Roman"/>
+                <w:rFonts w:ascii="Calibri" w:hAnsi="Calibri"/>
+                <w:sz w:val="22"/>
               </w:rPr>
               <w:t>Leadership Seminar</w:t>
             </w:r>
@@ -2445,7 +2684,8 @@
             </w:pPr>
             <w:r>
               <w:rPr>
-                <w:rFonts w:ascii="Times New Roman" w:hAnsi="Times New Roman"/>
+                <w:rFonts w:ascii="Calibri" w:hAnsi="Calibri"/>
+                <w:sz w:val="22"/>
               </w:rPr>
               <w:t>P500.00</w:t>
             </w:r>
@@ -2463,7 +2703,8 @@
             </w:pPr>
             <w:r>
               <w:rPr>
-                <w:rFonts w:ascii="Times New Roman" w:hAnsi="Times New Roman"/>
+                <w:rFonts w:ascii="Calibri" w:hAnsi="Calibri"/>
+                <w:sz w:val="22"/>
               </w:rPr>
               <w:t>Day 1 &amp; 2 Lunch</w:t>
             </w:r>
@@ -2489,7 +2730,8 @@
             </w:pPr>
             <w:r>
               <w:rPr>
-                <w:rFonts w:ascii="Times New Roman" w:hAnsi="Times New Roman"/>
+                <w:rFonts w:ascii="Calibri" w:hAnsi="Calibri"/>
+                <w:sz w:val="22"/>
               </w:rPr>
               <w:t>P3,655.00</w:t>
             </w:r>
@@ -2507,7 +2749,8 @@
             </w:pPr>
             <w:r>
               <w:rPr>
-                <w:rFonts w:ascii="Times New Roman" w:hAnsi="Times New Roman"/>
+                <w:rFonts w:ascii="Calibri" w:hAnsi="Calibri"/>
+                <w:sz w:val="22"/>
               </w:rPr>
               <w:t>Big Brew Drinks</w:t>
             </w:r>
@@ -2533,7 +2776,8 @@
             </w:pPr>
             <w:r>
               <w:rPr>
-                <w:rFonts w:ascii="Times New Roman" w:hAnsi="Times New Roman"/>
+                <w:rFonts w:ascii="Calibri" w:hAnsi="Calibri"/>
+                <w:sz w:val="22"/>
               </w:rPr>
               <w:t>P800.00</w:t>
             </w:r>
@@ -2551,7 +2795,8 @@
             </w:pPr>
             <w:r>
               <w:rPr>
-                <w:rFonts w:ascii="Times New Roman" w:hAnsi="Times New Roman"/>
+                <w:rFonts w:ascii="Calibri" w:hAnsi="Calibri"/>
+                <w:sz w:val="22"/>
               </w:rPr>
               <w:t>Cash Prize</w:t>
             </w:r>
@@ -2577,7 +2822,8 @@
             </w:pPr>
             <w:r>
               <w:rPr>
-                <w:rFonts w:ascii="Times New Roman" w:hAnsi="Times New Roman"/>
+                <w:rFonts w:ascii="Calibri" w:hAnsi="Calibri"/>
+                <w:sz w:val="22"/>
               </w:rPr>
               <w:t>P4,000.00</w:t>
             </w:r>
@@ -2595,7 +2841,8 @@
             </w:pPr>
             <w:r>
               <w:rPr>
-                <w:rFonts w:ascii="Times New Roman" w:hAnsi="Times New Roman"/>
+                <w:rFonts w:ascii="Calibri" w:hAnsi="Calibri"/>
+                <w:sz w:val="22"/>
               </w:rPr>
               <w:t>Dinner</w:t>
             </w:r>
@@ -2621,7 +2868,8 @@
             </w:pPr>
             <w:r>
               <w:rPr>
-                <w:rFonts w:ascii="Times New Roman" w:hAnsi="Times New Roman"/>
+                <w:rFonts w:ascii="Calibri" w:hAnsi="Calibri"/>
+                <w:sz w:val="22"/>
               </w:rPr>
               <w:t>P5,000.00</w:t>
             </w:r>
@@ -2639,7 +2887,8 @@
           <w:p>
             <w:r>
               <w:rPr>
-                <w:rFonts w:ascii="Times New Roman" w:hAnsi="Times New Roman"/>
+                <w:rFonts w:ascii="Calibri" w:hAnsi="Calibri"/>
+                <w:sz w:val="22"/>
               </w:rPr>
               <w:t>Public Forum (Net)</w:t>
             </w:r>
@@ -2661,7 +2910,8 @@
             </w:pPr>
             <w:r>
               <w:rPr>
-                <w:rFonts w:ascii="Times New Roman" w:hAnsi="Times New Roman"/>
+                <w:rFonts w:ascii="Calibri" w:hAnsi="Calibri"/>
+                <w:sz w:val="22"/>
               </w:rPr>
               <w:t>P1,750.00</w:t>
             </w:r>
@@ -2679,7 +2929,8 @@
           <w:p>
             <w:r>
               <w:rPr>
-                <w:rFonts w:ascii="Times New Roman" w:hAnsi="Times New Roman"/>
+                <w:rFonts w:ascii="Calibri" w:hAnsi="Calibri"/>
+                <w:sz w:val="22"/>
               </w:rPr>
               <w:t>Cash Shortage</w:t>
             </w:r>
@@ -2704,7 +2955,10 @@
             </w:pPr>
             <w:r>
               <w:rPr>
-                <w:rFonts w:ascii="Times New Roman" w:hAnsi="Times New Roman"/>
+                <w:rFonts w:ascii="Calibri" w:hAnsi="Calibri"/>
+                <w:b/>
+                <w:bCs/>
+                <w:sz w:val="22"/>
               </w:rPr>
               <w:t>P161.00</w:t>
             </w:r>
@@ -2725,8 +2979,10 @@
             </w:pPr>
             <w:r>
               <w:rPr>
-                <w:rFonts w:ascii="Times New Roman" w:hAnsi="Times New Roman"/>
+                <w:rFonts w:ascii="Calibri" w:hAnsi="Calibri"/>
                 <w:b/>
+                <w:bCs/>
+                <w:sz w:val="22"/>
               </w:rPr>
               <w:t>Total Expenses:</w:t>
             </w:r>
@@ -2746,14 +3002,12 @@
             </w:tcBorders>
           </w:tcPr>
           <w:p>
-            <w:pPr>
-              <w:jc w:val="right"/>
-            </w:pPr>
-            <w:r>
-              <w:rPr>
-                <w:rFonts w:ascii="Times New Roman" w:hAnsi="Times New Roman"/>
-              </w:rPr>
-              <w:t>P22,988.00</w:t>
+            <w:r>
+              <w:rPr>
+                <w:rFonts w:ascii="Calibri" w:hAnsi="Calibri"/>
+                <w:sz w:val="22"/>
+              </w:rPr>
+              <w:t>P7,961.00</w:t>
             </w:r>
           </w:p>
         </w:tc>
@@ -2998,7 +3252,8 @@
       </w:pPr>
       <w:r>
         <w:rPr>
-          <w:rFonts w:ascii="Times New Roman" w:hAnsi="Times New Roman"/>
+          <w:rFonts w:ascii="Calibri" w:hAnsi="Calibri"/>
+          <w:sz w:val="22"/>
         </w:rPr>
         <w:t>As of April 2026</w:t>
       </w:r>
@@ -3039,10 +3294,12 @@
             </w:pPr>
             <w:r>
               <w:rPr>
-                <w:rFonts w:ascii="Times New Roman" w:hAnsi="Times New Roman"/>
+                <w:rFonts w:ascii="Calibri" w:hAnsi="Calibri"/>
                 <w:b/>
-              </w:rPr>
-              <w:t>Financial Summary Reconciliation</w:t>
+                <w:bCs/>
+                <w:sz w:val="22"/>
+              </w:rPr>
+              <w:t>Total Funds</w:t>
             </w:r>
           </w:p>
         </w:tc>
@@ -3058,9 +3315,10 @@
             </w:pPr>
             <w:r>
               <w:rPr>
-                <w:rFonts w:ascii="Times New Roman" w:hAnsi="Times New Roman"/>
-              </w:rPr>
-              <w:t>Total Funds Available</w:t>
+                <w:rFonts w:ascii="Calibri" w:hAnsi="Calibri"/>
+                <w:sz w:val="22"/>
+              </w:rPr>
+              <w:t>Total Expenses</w:t>
             </w:r>
           </w:p>
         </w:tc>
@@ -3079,14 +3337,12 @@
             <w:tcW w:w="1412" w:type="dxa"/>
           </w:tcPr>
           <w:p>
-            <w:pPr>
-              <w:jc w:val="right"/>
-            </w:pPr>
-            <w:r>
-              <w:rPr>
-                <w:rFonts w:ascii="Times New Roman" w:hAnsi="Times New Roman"/>
-              </w:rPr>
-              <w:t>P31,438.00</w:t>
+            <w:r>
+              <w:rPr>
+                <w:rFonts w:ascii="Calibri" w:hAnsi="Calibri"/>
+                <w:sz w:val="22"/>
+              </w:rPr>
+              <w:t>P21,778.00</w:t>
             </w:r>
           </w:p>
         </w:tc>
@@ -3103,12 +3359,6 @@
             <w:pPr>
               <w:jc w:val="both"/>
             </w:pPr>
-            <w:r>
-              <w:rPr>
-                <w:rFonts w:ascii="Times New Roman" w:hAnsi="Times New Roman"/>
-              </w:rPr>
-              <w:t>Total Disbursements</w:t>
-            </w:r>
           </w:p>
         </w:tc>
         <w:tc>
@@ -3129,14 +3379,12 @@
             </w:tcBorders>
           </w:tcPr>
           <w:p>
-            <w:pPr>
-              <w:jc w:val="right"/>
-            </w:pPr>
-            <w:r>
-              <w:rPr>
-                <w:rFonts w:ascii="Times New Roman" w:hAnsi="Times New Roman"/>
-              </w:rPr>
-              <w:t>P22,988.00</w:t>
+            <w:r>
+              <w:rPr>
+                <w:rFonts w:ascii="Calibri" w:hAnsi="Calibri"/>
+                <w:sz w:val="22"/>
+              </w:rPr>
+              <w:t>P7,961.00</w:t>
             </w:r>
           </w:p>
         </w:tc>
@@ -3156,10 +3404,12 @@
             </w:pPr>
             <w:r>
               <w:rPr>
-                <w:rFonts w:ascii="Times New Roman" w:hAnsi="Times New Roman"/>
+                <w:rFonts w:ascii="Calibri" w:hAnsi="Calibri"/>
                 <w:b/>
-              </w:rPr>
-              <w:t>Cash on Hand (Remaining Vault Cash)</w:t>
+                <w:bCs/>
+                <w:sz w:val="22"/>
+              </w:rPr>
+              <w:t>Cash on Hand</w:t>
             </w:r>
           </w:p>
         </w:tc>
@@ -3184,18 +3434,12 @@
             </w:tcBorders>
           </w:tcPr>
           <w:p>
-            <w:pPr>
-              <w:jc w:val="right"/>
-              <w:rPr>
-                <w:b/>
-                <w:bCs/>
-              </w:rPr>
-            </w:pPr>
-            <w:r>
-              <w:rPr>
-                <w:rFonts w:ascii="Times New Roman" w:hAnsi="Times New Roman"/>
-              </w:rPr>
-              <w:t>P8,450.00</w:t>
+            <w:r>
+              <w:rPr>
+                <w:rFonts w:ascii="Calibri" w:hAnsi="Calibri"/>
+                <w:sz w:val="22"/>
+              </w:rPr>
+              <w:t>P13,817.00</w:t>
             </w:r>
           </w:p>
         </w:tc>
@@ -3260,13 +3504,17 @@
       </w:pPr>
       <w:r>
         <w:rPr>
+          <w:rFonts w:ascii="Calibri" w:hAnsi="Calibri"/>
           <w:color w:val="000000"/>
+          <w:sz w:val="22"/>
         </w:rPr>
         <w:t>Prepared by:</w:t>
       </w:r>
       <w:r>
         <w:rPr>
+          <w:rFonts w:ascii="Calibri" w:hAnsi="Calibri"/>
           <w:noProof/>
+          <w:sz w:val="22"/>
         </w:rPr>
         <mc:AlternateContent>
           <mc:Choice Requires="wps">
@@ -3314,7 +3562,7 @@
               </wp:anchor>
             </w:drawing>
           </mc:Choice>
-          <mc:Fallback xmlns:sl="http://schemas.openxmlformats.org/schemaLibrary/2006/main" xmlns:a="http://schemas.openxmlformats.org/drawingml/2006/main" xmlns:pic="http://schemas.openxmlformats.org/drawingml/2006/picture" xmlns:c="http://schemas.openxmlformats.org/drawingml/2006/chart" xmlns:lc="http://schemas.openxmlformats.org/drawingml/2006/lockedCanvas" xmlns:dgm="http://schemas.openxmlformats.org/drawingml/2006/diagram" xmlns="http://schemas.microsoft.com/office/tasks/2019/documenttasks" xmlns:cr="http://schemas.microsoft.com/office/comments/2020/reactions">
+          <mc:Fallback xmlns:cr="http://schemas.microsoft.com/office/comments/2020/reactions" xmlns="http://schemas.microsoft.com/office/tasks/2019/documenttasks" xmlns:dgm="http://schemas.openxmlformats.org/drawingml/2006/diagram" xmlns:lc="http://schemas.openxmlformats.org/drawingml/2006/lockedCanvas" xmlns:c="http://schemas.openxmlformats.org/drawingml/2006/chart" xmlns:pic="http://schemas.openxmlformats.org/drawingml/2006/picture" xmlns:a="http://schemas.openxmlformats.org/drawingml/2006/main" xmlns:sl="http://schemas.openxmlformats.org/schemaLibrary/2006/main">
             <w:drawing>
               <wp:anchor allowOverlap="1" behindDoc="0" distB="0" distT="0" distL="114300" distR="114300" hidden="0" layoutInCell="1" locked="0" relativeHeight="0" simplePos="0">
                 <wp:simplePos x="0" y="0"/>
@@ -3392,9 +3640,10 @@
       </w:pPr>
       <w:r>
         <w:rPr>
-          <w:rFonts w:ascii="Times New Roman" w:hAnsi="Times New Roman"/>
-        </w:rPr>
-        <w:t>EULYSIES DOMANTAY</w:t>
+          <w:rFonts w:ascii="Calibri" w:hAnsi="Calibri"/>
+          <w:sz w:val="22"/>
+        </w:rPr>
+        <w:t xml:space="preserve">EULYSIES DOMANTAY </w:t>
         <w:tab/>
         <w:tab/>
         <w:t>ANDREI GERONIMO</w:t>
@@ -3420,7 +3669,8 @@
       </w:pPr>
       <w:r>
         <w:rPr>
-          <w:rFonts w:ascii="Times New Roman" w:hAnsi="Times New Roman"/>
+          <w:rFonts w:ascii="Calibri" w:hAnsi="Calibri"/>
+          <w:sz w:val="22"/>
         </w:rPr>
         <w:t>LITE PRESIDENT</w:t>
         <w:tab/>
@@ -3430,6 +3680,8 @@
         <w:tab/>
         <w:tab/>
         <w:t>LITE AUDITOR</w:t>
+        <w:tab/>
+        <w:tab/>
       </w:r>
     </w:p>
     <w:p>
@@ -3451,7 +3703,8 @@
       </w:pPr>
       <w:r>
         <w:rPr>
-          <w:sz w:val="24"/>
+          <w:rFonts w:ascii="Calibri" w:hAnsi="Calibri"/>
+          <w:sz w:val="22"/>
           <w:szCs w:val="24"/>
         </w:rPr>
         <w:t>Approved by:</w:t>
@@ -3478,9 +3731,14 @@
       </w:pPr>
       <w:r>
         <w:rPr>
-          <w:rFonts w:ascii="Times New Roman" w:hAnsi="Times New Roman"/>
+          <w:rFonts w:ascii="Calibri" w:hAnsi="Calibri"/>
+          <w:sz w:val="22"/>
         </w:rPr>
         <w:t>KIMBERLY DAWN JATULAN</w:t>
+        <w:tab/>
+        <w:tab/>
+        <w:tab/>
+        <w:tab/>
       </w:r>
     </w:p>
     <w:p>
@@ -3493,9 +3751,16 @@
       </w:pPr>
       <w:r>
         <w:rPr>
-          <w:rFonts w:ascii="Times New Roman" w:hAnsi="Times New Roman"/>
+          <w:rFonts w:ascii="Calibri" w:hAnsi="Calibri"/>
+          <w:sz w:val="22"/>
         </w:rPr>
         <w:t>LITE ADVISER</w:t>
+        <w:tab/>
+        <w:tab/>
+        <w:tab/>
+        <w:tab/>
+        <w:tab/>
+        <w:tab/>
       </w:r>
     </w:p>
     <w:p>
@@ -3517,7 +3782,8 @@
       </w:pPr>
       <w:r>
         <w:rPr>
-          <w:sz w:val="24"/>
+          <w:rFonts w:ascii="Calibri" w:hAnsi="Calibri"/>
+          <w:sz w:val="22"/>
           <w:szCs w:val="24"/>
         </w:rPr>
         <w:t>Noted by:</w:t>
@@ -3544,9 +3810,10 @@
       </w:pPr>
       <w:r>
         <w:rPr>
-          <w:rFonts w:ascii="Times New Roman" w:hAnsi="Times New Roman"/>
-        </w:rPr>
-        <w:t>JOVYLYN ORTIZ-CESAR, MBA, MSIT</w:t>
+          <w:rFonts w:ascii="Calibri" w:hAnsi="Calibri"/>
+          <w:sz w:val="22"/>
+        </w:rPr>
+        <w:t xml:space="preserve">JOVYLYN ORTIZ-CESAR, MBA, MSIT </w:t>
         <w:tab/>
         <w:tab/>
         <w:tab/>
@@ -3563,7 +3830,8 @@
       </w:pPr>
       <w:r>
         <w:rPr>
-          <w:rFonts w:ascii="Times New Roman" w:hAnsi="Times New Roman"/>
+          <w:rFonts w:ascii="Calibri" w:hAnsi="Calibri"/>
+          <w:sz w:val="22"/>
         </w:rPr>
         <w:t>PROGRAM DIRECTOR</w:t>
         <w:tab/>
@@ -3588,12 +3856,24 @@
         <w:spacing w:after="0"/>
       </w:pPr>
       <w:r>
+        <w:rPr>
+          <w:rFonts w:ascii="Calibri" w:hAnsi="Calibri"/>
+          <w:sz w:val="22"/>
+        </w:rPr>
         <w:tab/>
       </w:r>
       <w:r>
+        <w:rPr>
+          <w:rFonts w:ascii="Calibri" w:hAnsi="Calibri"/>
+          <w:sz w:val="22"/>
+        </w:rPr>
         <w:tab/>
       </w:r>
       <w:r>
+        <w:rPr>
+          <w:rFonts w:ascii="Calibri" w:hAnsi="Calibri"/>
+          <w:sz w:val="22"/>
+        </w:rPr>
         <w:tab/>
       </w:r>
     </w:p>
@@ -3659,6 +3939,7 @@
     </w:pPr>
     <w:r>
       <w:rPr>
+        <w:rFonts w:ascii="Calibri" w:hAnsi="Calibri"/>
         <w:noProof/>
       </w:rPr>
       <mc:AlternateContent>
@@ -3707,7 +3988,7 @@
             </wp:anchor>
           </w:drawing>
         </mc:Choice>
-        <mc:Fallback xmlns:sl="http://schemas.openxmlformats.org/schemaLibrary/2006/main" xmlns:a="http://schemas.openxmlformats.org/drawingml/2006/main" xmlns:pic="http://schemas.openxmlformats.org/drawingml/2006/picture" xmlns:c="http://schemas.openxmlformats.org/drawingml/2006/chart" xmlns:lc="http://schemas.openxmlformats.org/drawingml/2006/lockedCanvas" xmlns:dgm="http://schemas.openxmlformats.org/drawingml/2006/diagram" xmlns="http://schemas.microsoft.com/office/tasks/2019/documenttasks" xmlns:cr="http://schemas.microsoft.com/office/comments/2020/reactions">
+        <mc:Fallback xmlns:cr="http://schemas.microsoft.com/office/comments/2020/reactions" xmlns="http://schemas.microsoft.com/office/tasks/2019/documenttasks" xmlns:dgm="http://schemas.openxmlformats.org/drawingml/2006/diagram" xmlns:lc="http://schemas.openxmlformats.org/drawingml/2006/lockedCanvas" xmlns:c="http://schemas.openxmlformats.org/drawingml/2006/chart" xmlns:pic="http://schemas.openxmlformats.org/drawingml/2006/picture" xmlns:a="http://schemas.openxmlformats.org/drawingml/2006/main" xmlns:sl="http://schemas.openxmlformats.org/schemaLibrary/2006/main">
           <w:drawing>
             <wp:anchor allowOverlap="1" behindDoc="0" distB="0" distT="0" distL="114300" distR="114300" hidden="0" layoutInCell="1" locked="0" relativeHeight="0" simplePos="0">
               <wp:simplePos x="0" y="0"/>
@@ -3802,12 +4083,14 @@
     </w:pPr>
     <w:r>
       <w:rPr>
+        <w:rFonts w:ascii="Calibri" w:hAnsi="Calibri"/>
         <w:color w:val="000000"/>
       </w:rPr>
       <w:t>`</w:t>
     </w:r>
     <w:r>
       <w:rPr>
+        <w:rFonts w:ascii="Calibri" w:hAnsi="Calibri"/>
         <w:noProof/>
       </w:rPr>
       <mc:AlternateContent>
@@ -4167,7 +4450,7 @@
             </wp:anchor>
           </w:drawing>
         </mc:Choice>
-        <mc:Fallback xmlns:sl="http://schemas.openxmlformats.org/schemaLibrary/2006/main" xmlns:a="http://schemas.openxmlformats.org/drawingml/2006/main" xmlns:pic="http://schemas.openxmlformats.org/drawingml/2006/picture" xmlns:c="http://schemas.openxmlformats.org/drawingml/2006/chart" xmlns:lc="http://schemas.openxmlformats.org/drawingml/2006/lockedCanvas" xmlns:dgm="http://schemas.openxmlformats.org/drawingml/2006/diagram" xmlns="http://schemas.microsoft.com/office/tasks/2019/documenttasks" xmlns:cr="http://schemas.microsoft.com/office/comments/2020/reactions">
+        <mc:Fallback xmlns:cr="http://schemas.microsoft.com/office/comments/2020/reactions" xmlns="http://schemas.microsoft.com/office/tasks/2019/documenttasks" xmlns:dgm="http://schemas.openxmlformats.org/drawingml/2006/diagram" xmlns:lc="http://schemas.openxmlformats.org/drawingml/2006/lockedCanvas" xmlns:c="http://schemas.openxmlformats.org/drawingml/2006/chart" xmlns:pic="http://schemas.openxmlformats.org/drawingml/2006/picture" xmlns:a="http://schemas.openxmlformats.org/drawingml/2006/main" xmlns:sl="http://schemas.openxmlformats.org/schemaLibrary/2006/main">
           <w:drawing>
             <wp:anchor allowOverlap="1" behindDoc="0" distB="0" distT="0" distL="114300" distR="114300" hidden="0" layoutInCell="1" locked="0" relativeHeight="0" simplePos="0">
               <wp:simplePos x="0" y="0"/>
@@ -4613,6 +4896,10 @@
   <w:style w:type="paragraph" w:default="1" w:styleId="Normal">
     <w:name w:val="Normal"/>
     <w:qFormat/>
+    <w:rPr>
+      <w:rFonts w:ascii="Calibri" w:hAnsi="Calibri"/>
+      <w:sz w:val="22"/>
+    </w:rPr>
   </w:style>
   <w:style w:type="paragraph" w:styleId="Heading1">
     <w:name w:val="heading 1"/>
@@ -4627,9 +4914,10 @@
       <w:outlineLvl w:val="0"/>
     </w:pPr>
     <w:rPr>
+      <w:rFonts w:ascii="Calibri" w:hAnsi="Calibri"/>
       <w:b/>
       <w:bCs/>
-      <w:sz w:val="48"/>
+      <w:sz w:val="22"/>
       <w:szCs w:val="48"/>
     </w:rPr>
   </w:style>
@@ -4648,9 +4936,10 @@
       <w:outlineLvl w:val="1"/>
     </w:pPr>
     <w:rPr>
+      <w:rFonts w:ascii="Calibri" w:hAnsi="Calibri"/>
       <w:b/>
       <w:bCs/>
-      <w:sz w:val="36"/>
+      <w:sz w:val="22"/>
       <w:szCs w:val="36"/>
     </w:rPr>
   </w:style>
@@ -4669,9 +4958,10 @@
       <w:outlineLvl w:val="2"/>
     </w:pPr>
     <w:rPr>
+      <w:rFonts w:ascii="Calibri" w:hAnsi="Calibri"/>
       <w:b/>
       <w:bCs/>
-      <w:sz w:val="28"/>
+      <w:sz w:val="22"/>
       <w:szCs w:val="28"/>
     </w:rPr>
   </w:style>
@@ -4690,9 +4980,10 @@
       <w:outlineLvl w:val="3"/>
     </w:pPr>
     <w:rPr>
+      <w:rFonts w:ascii="Calibri" w:hAnsi="Calibri"/>
       <w:b/>
       <w:bCs/>
-      <w:sz w:val="24"/>
+      <w:sz w:val="22"/>
       <w:szCs w:val="24"/>
     </w:rPr>
   </w:style>
@@ -4711,8 +5002,10 @@
       <w:outlineLvl w:val="4"/>
     </w:pPr>
     <w:rPr>
+      <w:rFonts w:ascii="Calibri" w:hAnsi="Calibri"/>
       <w:b/>
       <w:bCs/>
+      <w:sz w:val="22"/>
     </w:rPr>
   </w:style>
   <w:style w:type="paragraph" w:styleId="Heading6">
@@ -4730,9 +5023,10 @@
       <w:outlineLvl w:val="5"/>
     </w:pPr>
     <w:rPr>
+      <w:rFonts w:ascii="Calibri" w:hAnsi="Calibri"/>
       <w:b/>
       <w:bCs/>
-      <w:sz w:val="20"/>
+      <w:sz w:val="22"/>
       <w:szCs w:val="20"/>
     </w:rPr>
   </w:style>
@@ -4741,12 +5035,20 @@
     <w:uiPriority w:val="1"/>
     <w:semiHidden/>
     <w:unhideWhenUsed/>
+    <w:rPr>
+      <w:rFonts w:ascii="Calibri" w:hAnsi="Calibri"/>
+      <w:sz w:val="22"/>
+    </w:rPr>
   </w:style>
   <w:style w:type="table" w:default="1" w:styleId="TableNormal">
     <w:name w:val="Normal Table"/>
     <w:uiPriority w:val="99"/>
     <w:semiHidden/>
     <w:unhideWhenUsed/>
+    <w:rPr>
+      <w:rFonts w:ascii="Calibri" w:hAnsi="Calibri"/>
+      <w:sz w:val="22"/>
+    </w:rPr>
     <w:tblPr>
       <w:tblInd w:w="0" w:type="dxa"/>
       <w:tblCellMar>
@@ -4765,6 +5067,10 @@
   </w:style>
   <w:style w:type="table" w:customStyle="1" w:styleId="TableNormal0">
     <w:name w:val="TableNormal"/>
+    <w:rPr>
+      <w:rFonts w:ascii="Calibri" w:hAnsi="Calibri"/>
+      <w:sz w:val="22"/>
+    </w:rPr>
     <w:tblPr>
       <w:tblCellMar>
         <w:top w:w="100" w:type="dxa"/>
@@ -4786,9 +5092,10 @@
       <w:spacing w:before="480" w:after="120"/>
     </w:pPr>
     <w:rPr>
+      <w:rFonts w:ascii="Calibri" w:hAnsi="Calibri"/>
       <w:b/>
       <w:bCs/>
-      <w:sz w:val="72"/>
+      <w:sz w:val="22"/>
       <w:szCs w:val="72"/>
     </w:rPr>
   </w:style>
@@ -4804,11 +5111,11 @@
       <w:spacing w:before="360" w:after="80"/>
     </w:pPr>
     <w:rPr>
-      <w:rFonts w:ascii="Georgia" w:eastAsia="Georgia" w:hAnsi="Georgia" w:cs="Georgia"/>
+      <w:rFonts w:ascii="Calibri" w:eastAsia="Georgia" w:hAnsi="Calibri" w:cs="Georgia"/>
       <w:i/>
       <w:iCs/>
       <w:color w:val="666666"/>
-      <w:sz w:val="48"/>
+      <w:sz w:val="22"/>
       <w:szCs w:val="48"/>
     </w:rPr>
   </w:style>
@@ -4817,6 +5124,10 @@
     <w:pPr>
       <w:spacing w:after="0" w:line="240" w:lineRule="auto"/>
     </w:pPr>
+    <w:rPr>
+      <w:rFonts w:ascii="Calibri" w:hAnsi="Calibri"/>
+      <w:sz w:val="22"/>
+    </w:rPr>
     <w:tblPr>
       <w:tblStyleRowBandSize w:val="1"/>
       <w:tblStyleColBandSize w:val="1"/>
@@ -4833,6 +5144,10 @@
     <w:pPr>
       <w:spacing w:after="0" w:line="240" w:lineRule="auto"/>
     </w:pPr>
+    <w:rPr>
+      <w:rFonts w:ascii="Calibri" w:hAnsi="Calibri"/>
+      <w:sz w:val="22"/>
+    </w:rPr>
     <w:tblPr>
       <w:tblStyleRowBandSize w:val="1"/>
       <w:tblStyleColBandSize w:val="1"/>
@@ -4849,6 +5164,10 @@
     <w:pPr>
       <w:spacing w:after="0" w:line="240" w:lineRule="auto"/>
     </w:pPr>
+    <w:rPr>
+      <w:rFonts w:ascii="Calibri" w:hAnsi="Calibri"/>
+      <w:sz w:val="22"/>
+    </w:rPr>
     <w:tblPr>
       <w:tblStyleRowBandSize w:val="1"/>
       <w:tblStyleColBandSize w:val="1"/>
@@ -4865,6 +5184,10 @@
     <w:pPr>
       <w:spacing w:after="0" w:line="240" w:lineRule="auto"/>
     </w:pPr>
+    <w:rPr>
+      <w:rFonts w:ascii="Calibri" w:hAnsi="Calibri"/>
+      <w:sz w:val="22"/>
+    </w:rPr>
     <w:tblPr>
       <w:tblStyleRowBandSize w:val="1"/>
       <w:tblStyleColBandSize w:val="1"/>
@@ -4881,6 +5204,10 @@
     <w:pPr>
       <w:spacing w:after="0" w:line="240" w:lineRule="auto"/>
     </w:pPr>
+    <w:rPr>
+      <w:rFonts w:ascii="Calibri" w:hAnsi="Calibri"/>
+      <w:sz w:val="22"/>
+    </w:rPr>
     <w:tblPr>
       <w:tblStyleRowBandSize w:val="1"/>
       <w:tblStyleColBandSize w:val="1"/>

</xml_diff>

<commit_message>
feat: report export overhaul with Calibri 11pt default, calibrated margins, signatory tables, CC toggle, and page numbering
</commit_message>
<xml_diff>
--- a/exports/FinLITE-Exported-Report.docx
+++ b/exports/FinLITE-Exported-Report.docx
@@ -13,17 +13,13 @@
           <w:between w:val="nil"/>
         </w:pBdr>
         <w:spacing w:after="0" w:line="312" w:lineRule="auto"/>
+        <w:jc w:val="center"/>
         <w:rPr>
           <w:color w:val="000000"/>
         </w:rPr>
       </w:pPr>
-      <w:r>
-        <w:rPr>
-          <w:rFonts w:ascii="Calibri" w:hAnsi="Calibri"/>
-          <w:sz w:val="22"/>
-        </w:rPr>
-        <w:t>September 29, 2026</w:t>
-      </w:r>
+      <w:bookmarkStart w:id="0" w:name="_heading=h.ydff1mdgv58k" w:colFirst="0" w:colLast="0"/>
+      <w:bookmarkEnd w:id="0"/>
     </w:p>
     <w:p>
       <w:pPr>
@@ -36,17 +32,11 @@
           <w:between w:val="nil"/>
         </w:pBdr>
         <w:spacing w:after="0" w:line="312" w:lineRule="auto"/>
+        <w:jc w:val="center"/>
         <w:rPr>
           <w:color w:val="000000"/>
         </w:rPr>
       </w:pPr>
-      <w:r>
-        <w:rPr>
-          <w:rFonts w:ascii="Calibri" w:hAnsi="Calibri"/>
-          <w:sz w:val="22"/>
-        </w:rPr>
-        <w:t>Ms. Ligaya H. Estrella</w:t>
-      </w:r>
     </w:p>
     <w:p>
       <w:pPr>
@@ -68,7 +58,7 @@
           <w:rFonts w:ascii="Calibri" w:hAnsi="Calibri"/>
           <w:sz w:val="22"/>
         </w:rPr>
-        <w:t>Co-curricular Affairs Coordinator</w:t>
+        <w:t>September 29, 2026</w:t>
       </w:r>
     </w:p>
     <w:p>
@@ -86,14 +76,6 @@
           <w:color w:val="000000"/>
         </w:rPr>
       </w:pPr>
-      <w:r>
-        <w:rPr>
-          <w:rFonts w:ascii="Calibri" w:hAnsi="Calibri"/>
-          <w:color w:val="000000"/>
-          <w:sz w:val="22"/>
-        </w:rPr>
-        <w:t>This School</w:t>
-      </w:r>
     </w:p>
     <w:p>
       <w:pPr>
@@ -115,8 +97,127 @@
           <w:rFonts w:ascii="Calibri" w:hAnsi="Calibri"/>
           <w:sz w:val="22"/>
         </w:rPr>
+        <w:t>Ms. Ligaya H. Estrella</w:t>
+      </w:r>
+    </w:p>
+    <w:p>
+      <w:pPr>
+        <w:widowControl w:val="0"/>
+        <w:pBdr>
+          <w:top w:val="nil"/>
+          <w:left w:val="nil"/>
+          <w:bottom w:val="nil"/>
+          <w:right w:val="nil"/>
+          <w:between w:val="nil"/>
+        </w:pBdr>
+        <w:spacing w:after="0" w:line="312" w:lineRule="auto"/>
+        <w:rPr>
+          <w:color w:val="000000"/>
+        </w:rPr>
+      </w:pPr>
+      <w:r>
+        <w:rPr>
+          <w:rFonts w:ascii="Calibri" w:hAnsi="Calibri"/>
+          <w:sz w:val="22"/>
+        </w:rPr>
+        <w:t>Co-curricular Affairs Coordinator</w:t>
+      </w:r>
+    </w:p>
+    <w:p>
+      <w:pPr>
+        <w:widowControl w:val="0"/>
+        <w:pBdr>
+          <w:top w:val="nil"/>
+          <w:left w:val="nil"/>
+          <w:bottom w:val="nil"/>
+          <w:right w:val="nil"/>
+          <w:between w:val="nil"/>
+        </w:pBdr>
+        <w:spacing w:after="0" w:line="312" w:lineRule="auto"/>
+        <w:rPr>
+          <w:color w:val="000000"/>
+        </w:rPr>
+      </w:pPr>
+      <w:r>
+        <w:rPr>
+          <w:rFonts w:ascii="Calibri" w:hAnsi="Calibri"/>
+          <w:color w:val="000000"/>
+          <w:sz w:val="22"/>
+        </w:rPr>
+        <w:t>This School</w:t>
+      </w:r>
+    </w:p>
+    <w:p>
+      <w:pPr>
+        <w:widowControl w:val="0"/>
+        <w:pBdr>
+          <w:top w:val="nil"/>
+          <w:left w:val="nil"/>
+          <w:bottom w:val="nil"/>
+          <w:right w:val="nil"/>
+          <w:between w:val="nil"/>
+        </w:pBdr>
+        <w:spacing w:after="0" w:line="312" w:lineRule="auto"/>
+        <w:jc w:val="center"/>
+        <w:rPr>
+          <w:color w:val="000000"/>
+        </w:rPr>
+      </w:pPr>
+    </w:p>
+    <w:p>
+      <w:pPr>
+        <w:widowControl w:val="0"/>
+        <w:pBdr>
+          <w:top w:val="nil"/>
+          <w:left w:val="nil"/>
+          <w:bottom w:val="nil"/>
+          <w:right w:val="nil"/>
+          <w:between w:val="nil"/>
+        </w:pBdr>
+        <w:spacing w:after="0" w:line="312" w:lineRule="auto"/>
+        <w:rPr>
+          <w:color w:val="000000"/>
+        </w:rPr>
+      </w:pPr>
+      <w:r>
+        <w:rPr>
+          <w:rFonts w:ascii="Calibri" w:hAnsi="Calibri"/>
+          <w:sz w:val="22"/>
+        </w:rPr>
         <w:t>Dear Mrs. Estrella,</w:t>
       </w:r>
+    </w:p>
+    <w:p>
+      <w:pPr>
+        <w:widowControl w:val="0"/>
+        <w:pBdr>
+          <w:top w:val="nil"/>
+          <w:left w:val="nil"/>
+          <w:bottom w:val="nil"/>
+          <w:right w:val="nil"/>
+          <w:between w:val="nil"/>
+        </w:pBdr>
+        <w:spacing w:after="0" w:line="312" w:lineRule="auto"/>
+        <w:rPr>
+          <w:color w:val="000000"/>
+        </w:rPr>
+      </w:pPr>
+    </w:p>
+    <w:p>
+      <w:pPr>
+        <w:widowControl w:val="0"/>
+        <w:pBdr>
+          <w:top w:val="nil"/>
+          <w:left w:val="nil"/>
+          <w:bottom w:val="nil"/>
+          <w:right w:val="nil"/>
+          <w:between w:val="nil"/>
+        </w:pBdr>
+        <w:spacing w:after="0" w:line="312" w:lineRule="auto"/>
+        <w:rPr>
+          <w:color w:val="000000"/>
+        </w:rPr>
+      </w:pPr>
     </w:p>
     <w:p>
       <w:pPr>
@@ -190,37 +291,6 @@
           <w:color w:val="000000"/>
         </w:rPr>
       </w:pPr>
-      <w:r>
-        <w:rPr>
-          <w:rFonts w:ascii="Calibri" w:hAnsi="Calibri"/>
-          <w:color w:val="000000"/>
-          <w:sz w:val="22"/>
-        </w:rPr>
-        <w:t>Respectfully,</w:t>
-      </w:r>
-    </w:p>
-    <w:p>
-      <w:pPr>
-        <w:pBdr>
-          <w:top w:val="nil"/>
-          <w:left w:val="nil"/>
-          <w:bottom w:val="nil"/>
-          <w:right w:val="nil"/>
-          <w:between w:val="nil"/>
-        </w:pBdr>
-        <w:spacing w:after="0" w:line="240" w:lineRule="auto"/>
-        <w:rPr>
-          <w:color w:val="000000"/>
-        </w:rPr>
-      </w:pPr>
-      <w:r>
-        <w:rPr>
-          <w:rFonts w:ascii="Calibri" w:hAnsi="Calibri"/>
-          <w:color w:val="000000"/>
-          <w:sz w:val="22"/>
-        </w:rPr>
-        <w:t>LITE Officers</w:t>
-      </w:r>
     </w:p>
     <w:p>
       <w:pPr>
@@ -237,14 +307,6 @@
           <w:color w:val="000000"/>
         </w:rPr>
       </w:pPr>
-      <w:r>
-        <w:rPr>
-          <w:rFonts w:ascii="Calibri" w:hAnsi="Calibri"/>
-          <w:color w:val="000000"/>
-          <w:sz w:val="22"/>
-        </w:rPr>
-        <w:t>Prepared by:</w:t>
-      </w:r>
     </w:p>
     <w:p>
       <w:pPr>
@@ -264,15 +326,48 @@
       <w:r>
         <w:rPr>
           <w:rFonts w:ascii="Calibri" w:hAnsi="Calibri"/>
+          <w:color w:val="000000"/>
           <w:sz w:val="22"/>
         </w:rPr>
-        <w:t xml:space="preserve">EMANUEL MALBAROSA </w:t>
-        <w:tab/>
-        <w:tab/>
-        <w:t>ANDREI JOHN P. GERONIMO</w:t>
-        <w:tab/>
-        <w:tab/>
-        <w:t>CHRISTIAN REY C. KASILAG</w:t>
+        <w:t>Respectfully,</w:t>
+      </w:r>
+    </w:p>
+    <w:p>
+      <w:pPr>
+        <w:pBdr>
+          <w:top w:val="nil"/>
+          <w:left w:val="nil"/>
+          <w:bottom w:val="nil"/>
+          <w:right w:val="nil"/>
+          <w:between w:val="nil"/>
+        </w:pBdr>
+        <w:spacing w:after="0" w:line="240" w:lineRule="auto"/>
+        <w:rPr>
+          <w:color w:val="000000"/>
+        </w:rPr>
+      </w:pPr>
+    </w:p>
+    <w:p>
+      <w:pPr>
+        <w:pBdr>
+          <w:top w:val="nil"/>
+          <w:left w:val="nil"/>
+          <w:bottom w:val="nil"/>
+          <w:right w:val="nil"/>
+          <w:between w:val="nil"/>
+        </w:pBdr>
+        <w:spacing w:after="0" w:line="240" w:lineRule="auto"/>
+        <w:rPr>
+          <w:color w:val="000000"/>
+        </w:rPr>
+      </w:pPr>
+      <w:r>
+        <w:rPr>
+          <w:rFonts w:ascii="Calibri" w:hAnsi="Calibri"/>
+          <w:color w:val="000000"/>
+          <w:sz w:val="22"/>
+        </w:rPr>
+        <w:t>LITE Officers</w:t>
       </w:r>
     </w:p>
     <w:p>
@@ -290,20 +385,232 @@
           <w:color w:val="000000"/>
         </w:rPr>
       </w:pPr>
+    </w:p>
+    <w:p>
+      <w:pPr>
+        <w:widowControl w:val="0"/>
+        <w:pBdr>
+          <w:top w:val="nil"/>
+          <w:left w:val="nil"/>
+          <w:bottom w:val="nil"/>
+          <w:right w:val="nil"/>
+          <w:between w:val="nil"/>
+        </w:pBdr>
+        <w:spacing w:after="0" w:line="312" w:lineRule="auto"/>
+        <w:rPr>
+          <w:color w:val="000000"/>
+        </w:rPr>
+      </w:pPr>
+    </w:p>
+    <w:p>
+      <w:pPr>
+        <w:widowControl w:val="0"/>
+        <w:pBdr>
+          <w:top w:val="nil"/>
+          <w:left w:val="nil"/>
+          <w:bottom w:val="nil"/>
+          <w:right w:val="nil"/>
+          <w:between w:val="nil"/>
+        </w:pBdr>
+        <w:spacing w:after="0" w:line="312" w:lineRule="auto"/>
+        <w:rPr>
+          <w:color w:val="000000"/>
+        </w:rPr>
+      </w:pPr>
       <w:r>
         <w:rPr>
           <w:rFonts w:ascii="Calibri" w:hAnsi="Calibri"/>
+          <w:color w:val="000000"/>
           <w:sz w:val="22"/>
         </w:rPr>
-        <w:t>LITE PRESIDENT</w:t>
-        <w:tab/>
-        <w:tab/>
-        <w:tab/>
-        <w:t>LITE TREASURER</w:t>
-        <w:tab/>
-        <w:tab/>
-        <w:t>LITE AUDITOR</w:t>
+        <w:t>Prepared by:</w:t>
       </w:r>
+    </w:p>
+    <w:tbl>
+      <w:tblPr>
+        <w:tblW w:type="auto" w:w="0"/>
+        <w:tblLook w:firstColumn="1" w:firstRow="1" w:lastColumn="0" w:lastRow="0" w:noHBand="0" w:noVBand="1" w:val="04A0"/>
+        <w:tblBorders>
+          <w:top w:val="nil"/>
+          <w:left w:val="nil"/>
+          <w:bottom w:val="nil"/>
+          <w:right w:val="nil"/>
+          <w:insideH w:val="nil"/>
+          <w:insideV w:val="nil"/>
+        </w:tblBorders>
+      </w:tblPr>
+      <w:tblGrid>
+        <w:gridCol w:w="3120"/>
+        <w:gridCol w:w="3120"/>
+        <w:gridCol w:w="3120"/>
+      </w:tblGrid>
+      <w:tr>
+        <w:tc>
+          <w:tcPr>
+            <w:tcW w:type="dxa" w:w="3120"/>
+            <w:tcMar>
+              <w:top w:w="0" w:type="dxa"/>
+              <w:bottom w:w="0" w:type="dxa"/>
+              <w:left w:w="0" w:type="dxa"/>
+              <w:right w:w="120" w:type="dxa"/>
+            </w:tcMar>
+          </w:tcPr>
+          <w:p>
+            <w:pPr>
+              <w:spacing w:before="320" w:after="20" w:line="240" w:lineRule="auto"/>
+            </w:pPr>
+            <w:r>
+              <w:rPr>
+                <w:rFonts w:ascii="Calibri" w:hAnsi="Calibri"/>
+                <w:b/>
+                <w:sz w:val="22"/>
+              </w:rPr>
+              <w:t>EMANUEL MALBAROSA</w:t>
+            </w:r>
+          </w:p>
+          <w:p>
+            <w:pPr>
+              <w:spacing w:before="0" w:after="80" w:line="240" w:lineRule="auto"/>
+            </w:pPr>
+            <w:r>
+              <w:rPr>
+                <w:rFonts w:ascii="Calibri" w:hAnsi="Calibri"/>
+                <w:sz w:val="22"/>
+              </w:rPr>
+              <w:t>LITE PRESIDENT</w:t>
+            </w:r>
+          </w:p>
+        </w:tc>
+        <w:tc>
+          <w:tcPr>
+            <w:tcW w:type="dxa" w:w="3120"/>
+            <w:tcMar>
+              <w:top w:w="0" w:type="dxa"/>
+              <w:bottom w:w="0" w:type="dxa"/>
+              <w:left w:w="0" w:type="dxa"/>
+              <w:right w:w="120" w:type="dxa"/>
+            </w:tcMar>
+          </w:tcPr>
+          <w:p>
+            <w:pPr>
+              <w:spacing w:before="320" w:after="20" w:line="240" w:lineRule="auto"/>
+            </w:pPr>
+            <w:r>
+              <w:rPr>
+                <w:rFonts w:ascii="Calibri" w:hAnsi="Calibri"/>
+                <w:b/>
+                <w:sz w:val="22"/>
+              </w:rPr>
+              <w:t>ANDREI JOHN P. GERONIMO</w:t>
+            </w:r>
+          </w:p>
+          <w:p>
+            <w:pPr>
+              <w:spacing w:before="0" w:after="80" w:line="240" w:lineRule="auto"/>
+            </w:pPr>
+            <w:r>
+              <w:rPr>
+                <w:rFonts w:ascii="Calibri" w:hAnsi="Calibri"/>
+                <w:sz w:val="22"/>
+              </w:rPr>
+              <w:t>LITE TREASURER</w:t>
+            </w:r>
+          </w:p>
+        </w:tc>
+        <w:tc>
+          <w:tcPr>
+            <w:tcW w:type="dxa" w:w="3120"/>
+            <w:tcMar>
+              <w:top w:w="0" w:type="dxa"/>
+              <w:bottom w:w="0" w:type="dxa"/>
+              <w:left w:w="0" w:type="dxa"/>
+              <w:right w:w="120" w:type="dxa"/>
+            </w:tcMar>
+          </w:tcPr>
+          <w:p>
+            <w:pPr>
+              <w:spacing w:before="320" w:after="20" w:line="240" w:lineRule="auto"/>
+            </w:pPr>
+            <w:r>
+              <w:rPr>
+                <w:rFonts w:ascii="Calibri" w:hAnsi="Calibri"/>
+                <w:b/>
+                <w:sz w:val="22"/>
+              </w:rPr>
+              <w:t>CHRISTIAN REY C. KASILAG</w:t>
+            </w:r>
+          </w:p>
+          <w:p>
+            <w:pPr>
+              <w:spacing w:before="0" w:after="80" w:line="240" w:lineRule="auto"/>
+            </w:pPr>
+            <w:r>
+              <w:rPr>
+                <w:rFonts w:ascii="Calibri" w:hAnsi="Calibri"/>
+                <w:sz w:val="22"/>
+              </w:rPr>
+              <w:t>LITE AUDITOR</w:t>
+            </w:r>
+          </w:p>
+        </w:tc>
+      </w:tr>
+    </w:tbl>
+    <w:p>
+      <w:pPr>
+        <w:widowControl w:val="0"/>
+        <w:pBdr>
+          <w:top w:val="nil"/>
+          <w:left w:val="nil"/>
+          <w:bottom w:val="nil"/>
+          <w:right w:val="nil"/>
+          <w:between w:val="nil"/>
+        </w:pBdr>
+        <w:spacing w:after="0" w:line="312" w:lineRule="auto"/>
+        <w:rPr>
+          <w:color w:val="000000"/>
+        </w:rPr>
+      </w:pPr>
+    </w:p>
+    <w:p>
+      <w:pPr>
+        <w:widowControl w:val="0"/>
+        <w:pBdr>
+          <w:top w:val="nil"/>
+          <w:left w:val="nil"/>
+          <w:bottom w:val="nil"/>
+          <w:right w:val="nil"/>
+          <w:between w:val="nil"/>
+        </w:pBdr>
+        <w:spacing w:after="0" w:line="312" w:lineRule="auto"/>
+        <w:rPr>
+          <w:color w:val="000000"/>
+        </w:rPr>
+      </w:pPr>
+    </w:p>
+    <w:p>
+      <w:pPr>
+        <w:widowControl w:val="0"/>
+        <w:pBdr>
+          <w:top w:val="nil"/>
+          <w:left w:val="nil"/>
+          <w:bottom w:val="nil"/>
+          <w:right w:val="nil"/>
+          <w:between w:val="nil"/>
+        </w:pBdr>
+        <w:spacing w:after="0" w:line="312" w:lineRule="auto"/>
+        <w:rPr>
+          <w:color w:val="000000"/>
+        </w:rPr>
+      </w:pPr>
+    </w:p>
+    <w:p>
+      <w:pPr>
+        <w:spacing w:after="0"/>
+        <w:rPr>
+          <w:sz w:val="24"/>
+          <w:szCs w:val="24"/>
+        </w:rPr>
+      </w:pPr>
     </w:p>
     <w:p>
       <w:pPr>
@@ -322,6 +629,83 @@
         <w:t>Approved by:</w:t>
       </w:r>
     </w:p>
+    <w:tbl>
+      <w:tblPr>
+        <w:tblW w:type="auto" w:w="0"/>
+        <w:tblLook w:firstColumn="1" w:firstRow="1" w:lastColumn="0" w:lastRow="0" w:noHBand="0" w:noVBand="1" w:val="04A0"/>
+        <w:tblBorders>
+          <w:top w:val="nil"/>
+          <w:left w:val="nil"/>
+          <w:bottom w:val="nil"/>
+          <w:right w:val="nil"/>
+          <w:insideH w:val="nil"/>
+          <w:insideV w:val="nil"/>
+        </w:tblBorders>
+      </w:tblPr>
+      <w:tblGrid>
+        <w:gridCol w:w="4680"/>
+        <w:gridCol w:w="4680"/>
+      </w:tblGrid>
+      <w:tr>
+        <w:tc>
+          <w:tcPr>
+            <w:tcW w:type="dxa" w:w="4680"/>
+            <w:tcMar>
+              <w:top w:w="0" w:type="dxa"/>
+              <w:bottom w:w="0" w:type="dxa"/>
+              <w:left w:w="0" w:type="dxa"/>
+              <w:right w:w="120" w:type="dxa"/>
+            </w:tcMar>
+          </w:tcPr>
+          <w:p>
+            <w:pPr>
+              <w:spacing w:before="320" w:after="20" w:line="240" w:lineRule="auto"/>
+            </w:pPr>
+            <w:r>
+              <w:rPr>
+                <w:rFonts w:ascii="Calibri" w:hAnsi="Calibri"/>
+                <w:b/>
+                <w:sz w:val="22"/>
+              </w:rPr>
+              <w:t>MS. KIMBERLY DAWN JATULAN</w:t>
+            </w:r>
+          </w:p>
+          <w:p>
+            <w:pPr>
+              <w:spacing w:before="0" w:after="80" w:line="240" w:lineRule="auto"/>
+            </w:pPr>
+            <w:r>
+              <w:rPr>
+                <w:rFonts w:ascii="Calibri" w:hAnsi="Calibri"/>
+                <w:sz w:val="22"/>
+              </w:rPr>
+              <w:t>LITE CLUB ADVISER</w:t>
+            </w:r>
+          </w:p>
+        </w:tc>
+        <w:tc>
+          <w:tcPr>
+            <w:tcW w:type="dxa" w:w="4680"/>
+            <w:tcMar>
+              <w:top w:w="0" w:type="dxa"/>
+              <w:bottom w:w="0" w:type="dxa"/>
+              <w:left w:w="0" w:type="dxa"/>
+              <w:right w:w="120" w:type="dxa"/>
+            </w:tcMar>
+          </w:tcPr>
+          <w:p>
+            <w:pPr>
+              <w:spacing w:before="320" w:after="20" w:line="240" w:lineRule="auto"/>
+            </w:pPr>
+          </w:p>
+          <w:p>
+            <w:pPr>
+              <w:spacing w:before="0" w:after="80" w:line="240" w:lineRule="auto"/>
+            </w:pPr>
+          </w:p>
+        </w:tc>
+      </w:tr>
+    </w:tbl>
     <w:p>
       <w:pPr>
         <w:spacing w:after="0"/>
@@ -331,17 +715,6 @@
           <w:u w:val="single"/>
         </w:rPr>
       </w:pPr>
-      <w:r>
-        <w:rPr>
-          <w:rFonts w:ascii="Calibri" w:hAnsi="Calibri"/>
-          <w:sz w:val="22"/>
-        </w:rPr>
-        <w:t>MS. KIMBERLY DAWN JATULAN</w:t>
-        <w:tab/>
-        <w:tab/>
-        <w:tab/>
-        <w:tab/>
-      </w:r>
     </w:p>
     <w:p>
       <w:pPr>
@@ -351,19 +724,6 @@
           <w:szCs w:val="24"/>
         </w:rPr>
       </w:pPr>
-      <w:r>
-        <w:rPr>
-          <w:rFonts w:ascii="Calibri" w:hAnsi="Calibri"/>
-          <w:sz w:val="22"/>
-        </w:rPr>
-        <w:t>LITE CLUB ADVISER</w:t>
-        <w:tab/>
-        <w:tab/>
-        <w:tab/>
-        <w:tab/>
-        <w:tab/>
-        <w:tab/>
-      </w:r>
     </w:p>
     <w:p>
       <w:pPr>
@@ -382,6 +742,107 @@
         <w:t>Noted by:</w:t>
       </w:r>
     </w:p>
+    <w:tbl>
+      <w:tblPr>
+        <w:tblW w:type="auto" w:w="0"/>
+        <w:tblLook w:firstColumn="1" w:firstRow="1" w:lastColumn="0" w:lastRow="0" w:noHBand="0" w:noVBand="1" w:val="04A0"/>
+        <w:tblBorders>
+          <w:top w:val="nil"/>
+          <w:left w:val="nil"/>
+          <w:bottom w:val="nil"/>
+          <w:right w:val="nil"/>
+          <w:insideH w:val="nil"/>
+          <w:insideV w:val="nil"/>
+        </w:tblBorders>
+      </w:tblPr>
+      <w:tblGrid>
+        <w:gridCol w:w="4680"/>
+        <w:gridCol w:w="4680"/>
+      </w:tblGrid>
+      <w:tr>
+        <w:tc>
+          <w:tcPr>
+            <w:tcW w:type="dxa" w:w="4680"/>
+            <w:tcMar>
+              <w:top w:w="0" w:type="dxa"/>
+              <w:bottom w:w="0" w:type="dxa"/>
+              <w:left w:w="0" w:type="dxa"/>
+              <w:right w:w="120" w:type="dxa"/>
+            </w:tcMar>
+          </w:tcPr>
+          <w:p>
+            <w:pPr>
+              <w:spacing w:before="320" w:after="20" w:line="240" w:lineRule="auto"/>
+            </w:pPr>
+            <w:r>
+              <w:rPr>
+                <w:rFonts w:ascii="Calibri" w:hAnsi="Calibri"/>
+                <w:b/>
+                <w:sz w:val="22"/>
+              </w:rPr>
+              <w:t>JOVYLYN ORTIZ-CESAR, MBA, MSIT</w:t>
+            </w:r>
+          </w:p>
+          <w:p>
+            <w:pPr>
+              <w:spacing w:before="0" w:after="80" w:line="240" w:lineRule="auto"/>
+            </w:pPr>
+            <w:r>
+              <w:rPr>
+                <w:rFonts w:ascii="Calibri" w:hAnsi="Calibri"/>
+                <w:sz w:val="22"/>
+              </w:rPr>
+              <w:t>PROGRAM DIRECTOR, BSIT</w:t>
+            </w:r>
+          </w:p>
+        </w:tc>
+        <w:tc>
+          <w:tcPr>
+            <w:tcW w:type="dxa" w:w="4680"/>
+            <w:tcMar>
+              <w:top w:w="0" w:type="dxa"/>
+              <w:bottom w:w="0" w:type="dxa"/>
+              <w:left w:w="0" w:type="dxa"/>
+              <w:right w:w="120" w:type="dxa"/>
+            </w:tcMar>
+          </w:tcPr>
+          <w:p>
+            <w:pPr>
+              <w:spacing w:before="320" w:after="20" w:line="240" w:lineRule="auto"/>
+            </w:pPr>
+            <w:r>
+              <w:rPr>
+                <w:rFonts w:ascii="Calibri" w:hAnsi="Calibri"/>
+                <w:b/>
+                <w:sz w:val="22"/>
+              </w:rPr>
+              <w:t>DR. EMRAIDA MARIE M. MANUCOM</w:t>
+            </w:r>
+          </w:p>
+          <w:p>
+            <w:pPr>
+              <w:spacing w:before="0" w:after="80" w:line="240" w:lineRule="auto"/>
+            </w:pPr>
+            <w:r>
+              <w:rPr>
+                <w:rFonts w:ascii="Calibri" w:hAnsi="Calibri"/>
+                <w:sz w:val="22"/>
+              </w:rPr>
+              <w:t>DEAN, COLLEGE OF COMPUTER STUDIES</w:t>
+            </w:r>
+          </w:p>
+        </w:tc>
+      </w:tr>
+    </w:tbl>
+    <w:p>
+      <w:r>
+        <w:rPr>
+          <w:rFonts w:ascii="Calibri" w:hAnsi="Calibri"/>
+          <w:sz w:val="22"/>
+        </w:rPr>
+        <w:br w:type="page"/>
+      </w:r>
+    </w:p>
     <w:p>
       <w:pPr>
         <w:spacing w:after="0"/>
@@ -391,24 +852,73 @@
           <w:u w:val="single"/>
         </w:rPr>
       </w:pPr>
+    </w:p>
+    <w:p>
+      <w:pPr>
+        <w:spacing w:after="0"/>
+        <w:rPr>
+          <w:sz w:val="24"/>
+          <w:szCs w:val="24"/>
+        </w:rPr>
+      </w:pPr>
+    </w:p>
+    <w:p>
+      <w:pPr>
+        <w:spacing w:after="0"/>
+      </w:pPr>
+    </w:p>
+    <w:p>
+      <w:pPr>
+        <w:spacing w:after="0"/>
+        <w:rPr>
+          <w:b/>
+          <w:bCs/>
+        </w:rPr>
+      </w:pPr>
+    </w:p>
+    <w:p>
+      <w:pPr>
+        <w:spacing w:after="0"/>
+        <w:jc w:val="center"/>
+        <w:rPr>
+          <w:b/>
+          <w:bCs/>
+        </w:rPr>
+      </w:pPr>
+      <w:r>
+        <w:rPr>
+          <w:rFonts w:ascii="Calibri" w:hAnsi="Calibri"/>
+          <w:b/>
+          <w:bCs/>
+          <w:sz w:val="22"/>
+        </w:rPr>
+        <w:t>LITE FINANCIAL REPORT</w:t>
+      </w:r>
+    </w:p>
+    <w:p>
+      <w:pPr>
+        <w:spacing w:after="0"/>
+        <w:jc w:val="center"/>
+        <w:rPr>
+          <w:b/>
+          <w:bCs/>
+        </w:rPr>
+      </w:pPr>
       <w:r>
         <w:rPr>
           <w:rFonts w:ascii="Calibri" w:hAnsi="Calibri"/>
           <w:sz w:val="22"/>
         </w:rPr>
-        <w:t xml:space="preserve">JOVYLYN ORTIZ-CESAR, MBA, MSIT </w:t>
-        <w:tab/>
-        <w:tab/>
-        <w:tab/>
-        <w:t>DR. EMRAIDA MARIE M. MANUCOM</w:t>
+        <w:t xml:space="preserve">2nd SEMESTER </w:t>
       </w:r>
     </w:p>
     <w:p>
       <w:pPr>
         <w:spacing w:after="0"/>
-        <w:rPr>
-          <w:sz w:val="24"/>
-          <w:szCs w:val="24"/>
+        <w:jc w:val="center"/>
+        <w:rPr>
+          <w:b/>
+          <w:bCs/>
         </w:rPr>
       </w:pPr>
       <w:r>
@@ -416,117 +926,45 @@
           <w:rFonts w:ascii="Calibri" w:hAnsi="Calibri"/>
           <w:sz w:val="22"/>
         </w:rPr>
-        <w:t>PROGRAM DIRECTOR, BSIT</w:t>
-        <w:tab/>
-        <w:tab/>
-        <w:tab/>
-        <w:tab/>
-        <w:tab/>
-        <w:t>DEAN, COLLEGE OF COMPUTER STUDIES</w:t>
+        <w:t>ACADEMIC YEAR 2025–2026</w:t>
       </w:r>
     </w:p>
     <w:p>
       <w:pPr>
         <w:spacing w:after="0"/>
+        <w:jc w:val="center"/>
+        <w:rPr>
+          <w:b/>
+          <w:bCs/>
+        </w:rPr>
+      </w:pPr>
+    </w:p>
+    <w:p>
+      <w:pPr>
+        <w:spacing w:after="0"/>
+        <w:jc w:val="center"/>
+        <w:rPr>
+          <w:b/>
+          <w:bCs/>
+        </w:rPr>
       </w:pPr>
       <w:r>
         <w:rPr>
           <w:rFonts w:ascii="Calibri" w:hAnsi="Calibri"/>
           <w:sz w:val="22"/>
         </w:rPr>
-        <w:t>cc: Co-Curricular</w:t>
-      </w:r>
-    </w:p>
-    <w:p>
-      <w:pPr>
-        <w:spacing w:after="0"/>
-      </w:pPr>
-      <w:r>
-        <w:rPr>
-          <w:rFonts w:ascii="Calibri" w:hAnsi="Calibri"/>
-          <w:sz w:val="22"/>
-        </w:rPr>
-        <w:t>cc: Dean’s Office</w:t>
-      </w:r>
-    </w:p>
-    <w:p>
-      <w:r>
-        <w:rPr>
-          <w:rFonts w:ascii="Calibri" w:hAnsi="Calibri"/>
-          <w:sz w:val="22"/>
-        </w:rPr>
-        <w:br w:type="page"/>
-      </w:r>
-    </w:p>
-    <w:p>
-      <w:pPr>
-        <w:spacing w:after="0"/>
-        <w:jc w:val="center"/>
-        <w:rPr>
-          <w:b/>
-          <w:bCs/>
-        </w:rPr>
-      </w:pPr>
-      <w:r>
-        <w:rPr>
-          <w:rFonts w:ascii="Calibri" w:hAnsi="Calibri"/>
-          <w:b/>
-          <w:bCs/>
-          <w:sz w:val="22"/>
-        </w:rPr>
-        <w:t>LITE FINANCIAL REPORT</w:t>
-      </w:r>
-    </w:p>
-    <w:p>
-      <w:pPr>
-        <w:spacing w:after="0"/>
-        <w:jc w:val="center"/>
-        <w:rPr>
-          <w:b/>
-          <w:bCs/>
-        </w:rPr>
-      </w:pPr>
-      <w:r>
-        <w:rPr>
-          <w:rFonts w:ascii="Calibri" w:hAnsi="Calibri"/>
-          <w:sz w:val="22"/>
-        </w:rPr>
-        <w:t xml:space="preserve">2nd SEMESTER </w:t>
-      </w:r>
-    </w:p>
-    <w:p>
-      <w:pPr>
-        <w:spacing w:after="0"/>
-        <w:jc w:val="center"/>
-        <w:rPr>
-          <w:b/>
-          <w:bCs/>
-        </w:rPr>
-      </w:pPr>
-      <w:r>
-        <w:rPr>
-          <w:rFonts w:ascii="Calibri" w:hAnsi="Calibri"/>
-          <w:sz w:val="22"/>
-        </w:rPr>
-        <w:t>ACADEMIC YEAR 2025–2026</w:t>
-      </w:r>
-    </w:p>
-    <w:p>
-      <w:pPr>
-        <w:spacing w:after="0"/>
-        <w:jc w:val="center"/>
-        <w:rPr>
-          <w:b/>
-          <w:bCs/>
-        </w:rPr>
-      </w:pPr>
-      <w:r>
-        <w:rPr>
-          <w:rFonts w:ascii="Calibri" w:hAnsi="Calibri"/>
-          <w:sz w:val="22"/>
-        </w:rPr>
         <w:t>Club week</w:t>
       </w:r>
+    </w:p>
+    <w:p>
+      <w:pPr>
+        <w:spacing w:after="0"/>
+        <w:jc w:val="center"/>
+        <w:rPr>
+          <w:b/>
+          <w:bCs/>
+        </w:rPr>
+      </w:pPr>
     </w:p>
     <w:tbl>
       <w:tblPr>
@@ -638,6 +1076,15 @@
         </w:tc>
       </w:tr>
     </w:tbl>
+    <w:p>
+      <w:pPr>
+        <w:spacing w:after="0"/>
+        <w:rPr>
+          <w:b/>
+          <w:bCs/>
+        </w:rPr>
+      </w:pPr>
+    </w:p>
     <w:tbl>
       <w:tblPr>
         <w:tblStyle w:val="a0"/>
@@ -778,6 +1225,208 @@
       </w:tr>
     </w:tbl>
     <w:p>
+      <w:pPr>
+        <w:tabs>
+          <w:tab w:val="left" w:pos="2850"/>
+        </w:tabs>
+        <w:spacing w:after="0"/>
+        <w:rPr>
+          <w:b/>
+          <w:bCs/>
+        </w:rPr>
+      </w:pPr>
+    </w:p>
+    <w:p>
+      <w:pPr>
+        <w:spacing w:after="0"/>
+        <w:jc w:val="center"/>
+        <w:rPr>
+          <w:b/>
+          <w:bCs/>
+        </w:rPr>
+      </w:pPr>
+    </w:p>
+    <w:p>
+      <w:pPr>
+        <w:spacing w:after="0"/>
+        <w:jc w:val="center"/>
+        <w:rPr>
+          <w:b/>
+          <w:bCs/>
+        </w:rPr>
+      </w:pPr>
+    </w:p>
+    <w:p>
+      <w:pPr>
+        <w:spacing w:after="0"/>
+        <w:jc w:val="center"/>
+        <w:rPr>
+          <w:b/>
+          <w:bCs/>
+        </w:rPr>
+      </w:pPr>
+    </w:p>
+    <w:p>
+      <w:pPr>
+        <w:spacing w:after="0"/>
+        <w:jc w:val="center"/>
+        <w:rPr>
+          <w:b/>
+          <w:bCs/>
+        </w:rPr>
+      </w:pPr>
+    </w:p>
+    <w:p>
+      <w:pPr>
+        <w:spacing w:after="0"/>
+        <w:jc w:val="center"/>
+        <w:rPr>
+          <w:b/>
+          <w:bCs/>
+        </w:rPr>
+      </w:pPr>
+    </w:p>
+    <w:p>
+      <w:pPr>
+        <w:spacing w:after="0"/>
+        <w:jc w:val="center"/>
+        <w:rPr>
+          <w:b/>
+          <w:bCs/>
+        </w:rPr>
+      </w:pPr>
+    </w:p>
+    <w:p>
+      <w:pPr>
+        <w:spacing w:after="0"/>
+        <w:jc w:val="center"/>
+        <w:rPr>
+          <w:b/>
+          <w:bCs/>
+        </w:rPr>
+      </w:pPr>
+    </w:p>
+    <w:p>
+      <w:pPr>
+        <w:spacing w:after="0"/>
+        <w:jc w:val="center"/>
+        <w:rPr>
+          <w:b/>
+          <w:bCs/>
+        </w:rPr>
+      </w:pPr>
+    </w:p>
+    <w:p>
+      <w:pPr>
+        <w:spacing w:after="0"/>
+        <w:jc w:val="center"/>
+        <w:rPr>
+          <w:b/>
+          <w:bCs/>
+        </w:rPr>
+      </w:pPr>
+    </w:p>
+    <w:p>
+      <w:pPr>
+        <w:spacing w:after="0"/>
+        <w:jc w:val="center"/>
+        <w:rPr>
+          <w:b/>
+          <w:bCs/>
+        </w:rPr>
+      </w:pPr>
+    </w:p>
+    <w:p>
+      <w:pPr>
+        <w:spacing w:after="0"/>
+        <w:jc w:val="center"/>
+        <w:rPr>
+          <w:b/>
+          <w:bCs/>
+        </w:rPr>
+      </w:pPr>
+    </w:p>
+    <w:p>
+      <w:pPr>
+        <w:spacing w:after="0"/>
+        <w:jc w:val="center"/>
+        <w:rPr>
+          <w:b/>
+          <w:bCs/>
+        </w:rPr>
+      </w:pPr>
+    </w:p>
+    <w:p>
+      <w:pPr>
+        <w:spacing w:after="0"/>
+        <w:jc w:val="center"/>
+        <w:rPr>
+          <w:b/>
+          <w:bCs/>
+        </w:rPr>
+      </w:pPr>
+    </w:p>
+    <w:p>
+      <w:pPr>
+        <w:spacing w:after="0"/>
+        <w:jc w:val="center"/>
+        <w:rPr>
+          <w:b/>
+          <w:bCs/>
+        </w:rPr>
+      </w:pPr>
+    </w:p>
+    <w:p>
+      <w:pPr>
+        <w:spacing w:after="0"/>
+        <w:jc w:val="center"/>
+        <w:rPr>
+          <w:b/>
+          <w:bCs/>
+        </w:rPr>
+      </w:pPr>
+    </w:p>
+    <w:p>
+      <w:pPr>
+        <w:spacing w:after="0"/>
+        <w:jc w:val="center"/>
+        <w:rPr>
+          <w:b/>
+          <w:bCs/>
+        </w:rPr>
+      </w:pPr>
+    </w:p>
+    <w:p>
+      <w:pPr>
+        <w:spacing w:after="0"/>
+        <w:jc w:val="center"/>
+        <w:rPr>
+          <w:b/>
+          <w:bCs/>
+        </w:rPr>
+      </w:pPr>
+    </w:p>
+    <w:p>
+      <w:pPr>
+        <w:spacing w:after="0"/>
+        <w:jc w:val="center"/>
+        <w:rPr>
+          <w:b/>
+          <w:bCs/>
+        </w:rPr>
+      </w:pPr>
+    </w:p>
+    <w:p>
+      <w:pPr>
+        <w:spacing w:after="0"/>
+        <w:jc w:val="center"/>
+        <w:rPr>
+          <w:b/>
+          <w:bCs/>
+        </w:rPr>
+      </w:pPr>
+    </w:p>
+    <w:p>
       <w:r>
         <w:rPr>
           <w:rFonts w:ascii="Calibri" w:hAnsi="Calibri"/>
@@ -959,6 +1608,234 @@
       </w:tr>
     </w:tbl>
     <w:p>
+      <w:pPr>
+        <w:spacing w:after="0"/>
+        <w:rPr>
+          <w:b/>
+          <w:bCs/>
+        </w:rPr>
+      </w:pPr>
+    </w:p>
+    <w:p>
+      <w:pPr>
+        <w:spacing w:after="0"/>
+        <w:jc w:val="center"/>
+        <w:rPr>
+          <w:b/>
+          <w:bCs/>
+        </w:rPr>
+      </w:pPr>
+    </w:p>
+    <w:p>
+      <w:pPr>
+        <w:spacing w:after="0"/>
+        <w:jc w:val="center"/>
+        <w:rPr>
+          <w:b/>
+          <w:bCs/>
+        </w:rPr>
+      </w:pPr>
+    </w:p>
+    <w:p>
+      <w:pPr>
+        <w:spacing w:after="0"/>
+        <w:jc w:val="center"/>
+        <w:rPr>
+          <w:b/>
+          <w:bCs/>
+        </w:rPr>
+      </w:pPr>
+    </w:p>
+    <w:p>
+      <w:pPr>
+        <w:spacing w:after="0"/>
+        <w:jc w:val="center"/>
+        <w:rPr>
+          <w:b/>
+          <w:bCs/>
+        </w:rPr>
+      </w:pPr>
+    </w:p>
+    <w:p>
+      <w:pPr>
+        <w:spacing w:after="0"/>
+        <w:jc w:val="center"/>
+        <w:rPr>
+          <w:b/>
+          <w:bCs/>
+        </w:rPr>
+      </w:pPr>
+    </w:p>
+    <w:p>
+      <w:pPr>
+        <w:spacing w:after="0"/>
+        <w:jc w:val="center"/>
+        <w:rPr>
+          <w:b/>
+          <w:bCs/>
+        </w:rPr>
+      </w:pPr>
+    </w:p>
+    <w:p>
+      <w:pPr>
+        <w:spacing w:after="0"/>
+        <w:jc w:val="center"/>
+        <w:rPr>
+          <w:b/>
+          <w:bCs/>
+        </w:rPr>
+      </w:pPr>
+    </w:p>
+    <w:p>
+      <w:pPr>
+        <w:spacing w:after="0"/>
+        <w:jc w:val="center"/>
+        <w:rPr>
+          <w:b/>
+          <w:bCs/>
+        </w:rPr>
+      </w:pPr>
+    </w:p>
+    <w:p>
+      <w:pPr>
+        <w:spacing w:after="0"/>
+        <w:jc w:val="center"/>
+        <w:rPr>
+          <w:b/>
+          <w:bCs/>
+        </w:rPr>
+      </w:pPr>
+    </w:p>
+    <w:p>
+      <w:pPr>
+        <w:spacing w:after="0"/>
+        <w:jc w:val="center"/>
+        <w:rPr>
+          <w:b/>
+          <w:bCs/>
+        </w:rPr>
+      </w:pPr>
+    </w:p>
+    <w:p>
+      <w:pPr>
+        <w:spacing w:after="0"/>
+        <w:jc w:val="center"/>
+        <w:rPr>
+          <w:b/>
+          <w:bCs/>
+        </w:rPr>
+      </w:pPr>
+    </w:p>
+    <w:p>
+      <w:pPr>
+        <w:spacing w:after="0"/>
+        <w:jc w:val="center"/>
+        <w:rPr>
+          <w:b/>
+          <w:bCs/>
+        </w:rPr>
+      </w:pPr>
+    </w:p>
+    <w:p>
+      <w:pPr>
+        <w:spacing w:after="0"/>
+        <w:jc w:val="center"/>
+        <w:rPr>
+          <w:b/>
+          <w:bCs/>
+        </w:rPr>
+      </w:pPr>
+    </w:p>
+    <w:p>
+      <w:pPr>
+        <w:spacing w:after="0"/>
+        <w:jc w:val="center"/>
+        <w:rPr>
+          <w:b/>
+          <w:bCs/>
+        </w:rPr>
+      </w:pPr>
+    </w:p>
+    <w:p>
+      <w:pPr>
+        <w:spacing w:after="0"/>
+        <w:jc w:val="center"/>
+        <w:rPr>
+          <w:b/>
+          <w:bCs/>
+        </w:rPr>
+      </w:pPr>
+    </w:p>
+    <w:p>
+      <w:pPr>
+        <w:spacing w:after="0"/>
+        <w:jc w:val="center"/>
+        <w:rPr>
+          <w:b/>
+          <w:bCs/>
+        </w:rPr>
+      </w:pPr>
+    </w:p>
+    <w:p>
+      <w:pPr>
+        <w:spacing w:after="0"/>
+        <w:jc w:val="center"/>
+        <w:rPr>
+          <w:b/>
+          <w:bCs/>
+        </w:rPr>
+      </w:pPr>
+    </w:p>
+    <w:p>
+      <w:pPr>
+        <w:spacing w:after="0"/>
+        <w:jc w:val="center"/>
+        <w:rPr>
+          <w:b/>
+          <w:bCs/>
+        </w:rPr>
+      </w:pPr>
+    </w:p>
+    <w:p>
+      <w:pPr>
+        <w:spacing w:after="0"/>
+        <w:jc w:val="center"/>
+        <w:rPr>
+          <w:b/>
+          <w:bCs/>
+        </w:rPr>
+      </w:pPr>
+    </w:p>
+    <w:p>
+      <w:pPr>
+        <w:spacing w:after="0"/>
+        <w:jc w:val="center"/>
+        <w:rPr>
+          <w:b/>
+          <w:bCs/>
+        </w:rPr>
+      </w:pPr>
+    </w:p>
+    <w:p>
+      <w:pPr>
+        <w:spacing w:after="0"/>
+        <w:jc w:val="center"/>
+        <w:rPr>
+          <w:b/>
+          <w:bCs/>
+        </w:rPr>
+      </w:pPr>
+    </w:p>
+    <w:p>
+      <w:pPr>
+        <w:spacing w:after="0"/>
+        <w:rPr>
+          <w:b/>
+          <w:bCs/>
+        </w:rPr>
+      </w:pPr>
+    </w:p>
+    <w:p>
       <w:r>
         <w:rPr>
           <w:rFonts w:ascii="Calibri" w:hAnsi="Calibri"/>
@@ -1173,6 +2050,48 @@
         </w:tc>
       </w:tr>
     </w:tbl>
+    <w:p>
+      <w:pPr>
+        <w:spacing w:after="0"/>
+      </w:pPr>
+    </w:p>
+    <w:p>
+      <w:pPr>
+        <w:spacing w:after="0"/>
+      </w:pPr>
+    </w:p>
+    <w:p>
+      <w:pPr>
+        <w:widowControl w:val="0"/>
+        <w:pBdr>
+          <w:top w:val="nil"/>
+          <w:left w:val="nil"/>
+          <w:bottom w:val="nil"/>
+          <w:right w:val="nil"/>
+          <w:between w:val="nil"/>
+        </w:pBdr>
+        <w:spacing w:after="0" w:line="312" w:lineRule="auto"/>
+        <w:rPr>
+          <w:color w:val="000000"/>
+        </w:rPr>
+      </w:pPr>
+    </w:p>
+    <w:p>
+      <w:pPr>
+        <w:widowControl w:val="0"/>
+        <w:pBdr>
+          <w:top w:val="nil"/>
+          <w:left w:val="nil"/>
+          <w:bottom w:val="nil"/>
+          <w:right w:val="nil"/>
+          <w:between w:val="nil"/>
+        </w:pBdr>
+        <w:spacing w:after="0" w:line="312" w:lineRule="auto"/>
+        <w:rPr>
+          <w:color w:val="000000"/>
+        </w:rPr>
+      </w:pPr>
+    </w:p>
     <w:p>
       <w:pPr>
         <w:widowControl w:val="0"/>
@@ -1293,6 +2212,135 @@
         </mc:AlternateContent>
       </w:r>
     </w:p>
+    <w:tbl>
+      <w:tblPr>
+        <w:tblW w:type="auto" w:w="0"/>
+        <w:tblLook w:firstColumn="1" w:firstRow="1" w:lastColumn="0" w:lastRow="0" w:noHBand="0" w:noVBand="1" w:val="04A0"/>
+        <w:tblBorders>
+          <w:top w:val="nil"/>
+          <w:left w:val="nil"/>
+          <w:bottom w:val="nil"/>
+          <w:right w:val="nil"/>
+          <w:insideH w:val="nil"/>
+          <w:insideV w:val="nil"/>
+        </w:tblBorders>
+      </w:tblPr>
+      <w:tblGrid>
+        <w:gridCol w:w="3120"/>
+        <w:gridCol w:w="3120"/>
+        <w:gridCol w:w="3120"/>
+      </w:tblGrid>
+      <w:tr>
+        <w:tc>
+          <w:tcPr>
+            <w:tcW w:type="dxa" w:w="3120"/>
+            <w:tcMar>
+              <w:top w:w="0" w:type="dxa"/>
+              <w:bottom w:w="0" w:type="dxa"/>
+              <w:left w:w="0" w:type="dxa"/>
+              <w:right w:w="120" w:type="dxa"/>
+            </w:tcMar>
+          </w:tcPr>
+          <w:p>
+            <w:pPr>
+              <w:spacing w:before="320" w:after="20" w:line="240" w:lineRule="auto"/>
+            </w:pPr>
+            <w:r>
+              <w:rPr>
+                <w:rFonts w:ascii="Calibri" w:hAnsi="Calibri"/>
+                <w:b/>
+                <w:sz w:val="22"/>
+              </w:rPr>
+              <w:t>EMANUEL MALBAROSA</w:t>
+            </w:r>
+          </w:p>
+          <w:p>
+            <w:pPr>
+              <w:spacing w:before="0" w:after="80" w:line="240" w:lineRule="auto"/>
+            </w:pPr>
+            <w:r>
+              <w:rPr>
+                <w:rFonts w:ascii="Calibri" w:hAnsi="Calibri"/>
+                <w:sz w:val="22"/>
+              </w:rPr>
+              <w:t>LITE PRESIDENT</w:t>
+            </w:r>
+          </w:p>
+        </w:tc>
+        <w:tc>
+          <w:tcPr>
+            <w:tcW w:type="dxa" w:w="3120"/>
+            <w:tcMar>
+              <w:top w:w="0" w:type="dxa"/>
+              <w:bottom w:w="0" w:type="dxa"/>
+              <w:left w:w="0" w:type="dxa"/>
+              <w:right w:w="120" w:type="dxa"/>
+            </w:tcMar>
+          </w:tcPr>
+          <w:p>
+            <w:pPr>
+              <w:spacing w:before="320" w:after="20" w:line="240" w:lineRule="auto"/>
+            </w:pPr>
+            <w:r>
+              <w:rPr>
+                <w:rFonts w:ascii="Calibri" w:hAnsi="Calibri"/>
+                <w:b/>
+                <w:sz w:val="22"/>
+              </w:rPr>
+              <w:t>ANDREI JOHN P. GERONIMO</w:t>
+            </w:r>
+          </w:p>
+          <w:p>
+            <w:pPr>
+              <w:spacing w:before="0" w:after="80" w:line="240" w:lineRule="auto"/>
+            </w:pPr>
+            <w:r>
+              <w:rPr>
+                <w:rFonts w:ascii="Calibri" w:hAnsi="Calibri"/>
+                <w:sz w:val="22"/>
+              </w:rPr>
+              <w:t>LITE TREASURER</w:t>
+            </w:r>
+          </w:p>
+        </w:tc>
+        <w:tc>
+          <w:tcPr>
+            <w:tcW w:type="dxa" w:w="3120"/>
+            <w:tcMar>
+              <w:top w:w="0" w:type="dxa"/>
+              <w:bottom w:w="0" w:type="dxa"/>
+              <w:left w:w="0" w:type="dxa"/>
+              <w:right w:w="120" w:type="dxa"/>
+            </w:tcMar>
+          </w:tcPr>
+          <w:p>
+            <w:pPr>
+              <w:spacing w:before="320" w:after="20" w:line="240" w:lineRule="auto"/>
+            </w:pPr>
+            <w:r>
+              <w:rPr>
+                <w:rFonts w:ascii="Calibri" w:hAnsi="Calibri"/>
+                <w:b/>
+                <w:sz w:val="22"/>
+              </w:rPr>
+              <w:t>CHRISTIAN REY C. KASILAG</w:t>
+            </w:r>
+          </w:p>
+          <w:p>
+            <w:pPr>
+              <w:spacing w:before="0" w:after="80" w:line="240" w:lineRule="auto"/>
+            </w:pPr>
+            <w:r>
+              <w:rPr>
+                <w:rFonts w:ascii="Calibri" w:hAnsi="Calibri"/>
+                <w:sz w:val="22"/>
+              </w:rPr>
+              <w:t>LITE AUDITOR</w:t>
+            </w:r>
+          </w:p>
+        </w:tc>
+      </w:tr>
+    </w:tbl>
     <w:p>
       <w:pPr>
         <w:widowControl w:val="0"/>
@@ -1308,51 +2356,128 @@
           <w:color w:val="000000"/>
         </w:rPr>
       </w:pPr>
+    </w:p>
+    <w:p>
+      <w:pPr>
+        <w:spacing w:after="0"/>
+        <w:rPr>
+          <w:sz w:val="24"/>
+          <w:szCs w:val="24"/>
+        </w:rPr>
+      </w:pPr>
+    </w:p>
+    <w:p>
+      <w:pPr>
+        <w:spacing w:after="0"/>
+        <w:rPr>
+          <w:sz w:val="24"/>
+          <w:szCs w:val="24"/>
+        </w:rPr>
+      </w:pPr>
       <w:r>
         <w:rPr>
           <w:rFonts w:ascii="Calibri" w:hAnsi="Calibri"/>
           <w:sz w:val="22"/>
-        </w:rPr>
-        <w:t xml:space="preserve">EMANUEL MALBAROSA </w:t>
-        <w:tab/>
-        <w:tab/>
-        <w:t>ANDREI JOHN P. GERONIMO</w:t>
-        <w:tab/>
-        <w:tab/>
-        <w:t>CHRISTIAN REY C. KASILAG</w:t>
+          <w:szCs w:val="24"/>
+        </w:rPr>
+        <w:t>Approved by:</w:t>
       </w:r>
     </w:p>
-    <w:p>
-      <w:pPr>
-        <w:widowControl w:val="0"/>
-        <w:pBdr>
+    <w:tbl>
+      <w:tblPr>
+        <w:tblW w:type="auto" w:w="0"/>
+        <w:tblLook w:firstColumn="1" w:firstRow="1" w:lastColumn="0" w:lastRow="0" w:noHBand="0" w:noVBand="1" w:val="04A0"/>
+        <w:tblBorders>
           <w:top w:val="nil"/>
           <w:left w:val="nil"/>
           <w:bottom w:val="nil"/>
           <w:right w:val="nil"/>
-          <w:between w:val="nil"/>
-        </w:pBdr>
-        <w:spacing w:after="0" w:line="312" w:lineRule="auto"/>
-        <w:rPr>
-          <w:color w:val="000000"/>
-        </w:rPr>
-      </w:pPr>
-      <w:r>
-        <w:rPr>
-          <w:rFonts w:ascii="Calibri" w:hAnsi="Calibri"/>
-          <w:sz w:val="22"/>
-        </w:rPr>
-        <w:t>LITE PRESIDENT</w:t>
-        <w:tab/>
-        <w:tab/>
-        <w:tab/>
-        <w:t>LITE TREASURER</w:t>
-        <w:tab/>
-        <w:tab/>
-        <w:t>LITE AUDITOR</w:t>
-        <w:tab/>
-        <w:tab/>
-      </w:r>
+          <w:insideH w:val="nil"/>
+          <w:insideV w:val="nil"/>
+        </w:tblBorders>
+      </w:tblPr>
+      <w:tblGrid>
+        <w:gridCol w:w="4680"/>
+        <w:gridCol w:w="4680"/>
+      </w:tblGrid>
+      <w:tr>
+        <w:tc>
+          <w:tcPr>
+            <w:tcW w:type="dxa" w:w="4680"/>
+            <w:tcMar>
+              <w:top w:w="0" w:type="dxa"/>
+              <w:bottom w:w="0" w:type="dxa"/>
+              <w:left w:w="0" w:type="dxa"/>
+              <w:right w:w="120" w:type="dxa"/>
+            </w:tcMar>
+          </w:tcPr>
+          <w:p>
+            <w:pPr>
+              <w:spacing w:before="320" w:after="20" w:line="240" w:lineRule="auto"/>
+            </w:pPr>
+            <w:r>
+              <w:rPr>
+                <w:rFonts w:ascii="Calibri" w:hAnsi="Calibri"/>
+                <w:b/>
+                <w:sz w:val="22"/>
+              </w:rPr>
+              <w:t>MS. KIMBERLY DAWN JATULAN</w:t>
+            </w:r>
+          </w:p>
+          <w:p>
+            <w:pPr>
+              <w:spacing w:before="0" w:after="80" w:line="240" w:lineRule="auto"/>
+            </w:pPr>
+            <w:r>
+              <w:rPr>
+                <w:rFonts w:ascii="Calibri" w:hAnsi="Calibri"/>
+                <w:sz w:val="22"/>
+              </w:rPr>
+              <w:t>LITE CLUB ADVISER</w:t>
+            </w:r>
+          </w:p>
+        </w:tc>
+        <w:tc>
+          <w:tcPr>
+            <w:tcW w:type="dxa" w:w="4680"/>
+            <w:tcMar>
+              <w:top w:w="0" w:type="dxa"/>
+              <w:bottom w:w="0" w:type="dxa"/>
+              <w:left w:w="0" w:type="dxa"/>
+              <w:right w:w="120" w:type="dxa"/>
+            </w:tcMar>
+          </w:tcPr>
+          <w:p>
+            <w:pPr>
+              <w:spacing w:before="320" w:after="20" w:line="240" w:lineRule="auto"/>
+            </w:pPr>
+          </w:p>
+          <w:p>
+            <w:pPr>
+              <w:spacing w:before="0" w:after="80" w:line="240" w:lineRule="auto"/>
+            </w:pPr>
+          </w:p>
+        </w:tc>
+      </w:tr>
+    </w:tbl>
+    <w:p>
+      <w:pPr>
+        <w:spacing w:after="0"/>
+        <w:rPr>
+          <w:sz w:val="24"/>
+          <w:szCs w:val="24"/>
+          <w:u w:val="single"/>
+        </w:rPr>
+      </w:pPr>
+    </w:p>
+    <w:p>
+      <w:pPr>
+        <w:spacing w:after="0"/>
+        <w:rPr>
+          <w:sz w:val="24"/>
+          <w:szCs w:val="24"/>
+        </w:rPr>
+      </w:pPr>
     </w:p>
     <w:p>
       <w:pPr>
@@ -1368,9 +2493,101 @@
           <w:sz w:val="22"/>
           <w:szCs w:val="24"/>
         </w:rPr>
-        <w:t>Approved by:</w:t>
+        <w:t>Noted by:</w:t>
       </w:r>
     </w:p>
+    <w:tbl>
+      <w:tblPr>
+        <w:tblW w:type="auto" w:w="0"/>
+        <w:tblLook w:firstColumn="1" w:firstRow="1" w:lastColumn="0" w:lastRow="0" w:noHBand="0" w:noVBand="1" w:val="04A0"/>
+        <w:tblBorders>
+          <w:top w:val="nil"/>
+          <w:left w:val="nil"/>
+          <w:bottom w:val="nil"/>
+          <w:right w:val="nil"/>
+          <w:insideH w:val="nil"/>
+          <w:insideV w:val="nil"/>
+        </w:tblBorders>
+      </w:tblPr>
+      <w:tblGrid>
+        <w:gridCol w:w="4680"/>
+        <w:gridCol w:w="4680"/>
+      </w:tblGrid>
+      <w:tr>
+        <w:tc>
+          <w:tcPr>
+            <w:tcW w:type="dxa" w:w="4680"/>
+            <w:tcMar>
+              <w:top w:w="0" w:type="dxa"/>
+              <w:bottom w:w="0" w:type="dxa"/>
+              <w:left w:w="0" w:type="dxa"/>
+              <w:right w:w="120" w:type="dxa"/>
+            </w:tcMar>
+          </w:tcPr>
+          <w:p>
+            <w:pPr>
+              <w:spacing w:before="320" w:after="20" w:line="240" w:lineRule="auto"/>
+            </w:pPr>
+            <w:r>
+              <w:rPr>
+                <w:rFonts w:ascii="Calibri" w:hAnsi="Calibri"/>
+                <w:b/>
+                <w:sz w:val="22"/>
+              </w:rPr>
+              <w:t>JOVYLYN ORTIZ-CESAR, MBA, MSIT</w:t>
+            </w:r>
+          </w:p>
+          <w:p>
+            <w:pPr>
+              <w:spacing w:before="0" w:after="80" w:line="240" w:lineRule="auto"/>
+            </w:pPr>
+            <w:r>
+              <w:rPr>
+                <w:rFonts w:ascii="Calibri" w:hAnsi="Calibri"/>
+                <w:sz w:val="22"/>
+              </w:rPr>
+              <w:t>PROGRAM DIRECTOR, BSIT</w:t>
+            </w:r>
+          </w:p>
+        </w:tc>
+        <w:tc>
+          <w:tcPr>
+            <w:tcW w:type="dxa" w:w="4680"/>
+            <w:tcMar>
+              <w:top w:w="0" w:type="dxa"/>
+              <w:bottom w:w="0" w:type="dxa"/>
+              <w:left w:w="0" w:type="dxa"/>
+              <w:right w:w="120" w:type="dxa"/>
+            </w:tcMar>
+          </w:tcPr>
+          <w:p>
+            <w:pPr>
+              <w:spacing w:before="320" w:after="20" w:line="240" w:lineRule="auto"/>
+            </w:pPr>
+            <w:r>
+              <w:rPr>
+                <w:rFonts w:ascii="Calibri" w:hAnsi="Calibri"/>
+                <w:b/>
+                <w:sz w:val="22"/>
+              </w:rPr>
+              <w:t>DR. EMRAIDA MARIE M. MANUCOM</w:t>
+            </w:r>
+          </w:p>
+          <w:p>
+            <w:pPr>
+              <w:spacing w:before="0" w:after="80" w:line="240" w:lineRule="auto"/>
+            </w:pPr>
+            <w:r>
+              <w:rPr>
+                <w:rFonts w:ascii="Calibri" w:hAnsi="Calibri"/>
+                <w:sz w:val="22"/>
+              </w:rPr>
+              <w:t>DEAN, COLLEGE OF COMPUTER STUDIES</w:t>
+            </w:r>
+          </w:p>
+        </w:tc>
+      </w:tr>
+    </w:tbl>
     <w:p>
       <w:pPr>
         <w:spacing w:after="0"/>
@@ -1380,105 +2597,47 @@
           <w:u w:val="single"/>
         </w:rPr>
       </w:pPr>
+    </w:p>
+    <w:p>
+      <w:pPr>
+        <w:spacing w:after="0"/>
+        <w:rPr>
+          <w:sz w:val="24"/>
+          <w:szCs w:val="24"/>
+        </w:rPr>
+      </w:pPr>
+    </w:p>
+    <w:p>
+      <w:pPr>
+        <w:spacing w:after="0"/>
+      </w:pPr>
       <w:r>
         <w:rPr>
           <w:rFonts w:ascii="Calibri" w:hAnsi="Calibri"/>
           <w:sz w:val="22"/>
         </w:rPr>
-        <w:t>MS. KIMBERLY DAWN JATULAN</w:t>
-        <w:tab/>
-        <w:tab/>
-        <w:tab/>
         <w:tab/>
       </w:r>
-    </w:p>
-    <w:p>
-      <w:pPr>
-        <w:spacing w:after="0"/>
-        <w:rPr>
-          <w:sz w:val="24"/>
-          <w:szCs w:val="24"/>
-        </w:rPr>
-      </w:pPr>
       <w:r>
         <w:rPr>
           <w:rFonts w:ascii="Calibri" w:hAnsi="Calibri"/>
           <w:sz w:val="22"/>
         </w:rPr>
-        <w:t>LITE CLUB ADVISER</w:t>
-        <w:tab/>
-        <w:tab/>
-        <w:tab/>
-        <w:tab/>
-        <w:tab/>
         <w:tab/>
       </w:r>
-    </w:p>
-    <w:p>
-      <w:pPr>
-        <w:spacing w:after="0"/>
-        <w:rPr>
-          <w:sz w:val="24"/>
-          <w:szCs w:val="24"/>
-        </w:rPr>
-      </w:pPr>
       <w:r>
         <w:rPr>
           <w:rFonts w:ascii="Calibri" w:hAnsi="Calibri"/>
           <w:sz w:val="22"/>
-          <w:szCs w:val="24"/>
-        </w:rPr>
-        <w:t>Noted by:</w:t>
-      </w:r>
-    </w:p>
-    <w:p>
-      <w:pPr>
-        <w:spacing w:after="0"/>
-        <w:rPr>
-          <w:sz w:val="24"/>
-          <w:szCs w:val="24"/>
-          <w:u w:val="single"/>
-        </w:rPr>
-      </w:pPr>
-      <w:r>
-        <w:rPr>
-          <w:rFonts w:ascii="Calibri" w:hAnsi="Calibri"/>
-          <w:sz w:val="22"/>
-        </w:rPr>
-        <w:t xml:space="preserve">JOVYLYN ORTIZ-CESAR, MBA, MSIT </w:t>
+        </w:rPr>
         <w:tab/>
-        <w:tab/>
-        <w:tab/>
-        <w:t>DR. EMRAIDA MARIE M. MANUCOM</w:t>
-      </w:r>
-    </w:p>
-    <w:p>
-      <w:pPr>
-        <w:spacing w:after="0"/>
-        <w:rPr>
-          <w:sz w:val="24"/>
-          <w:szCs w:val="24"/>
-        </w:rPr>
-      </w:pPr>
-      <w:r>
-        <w:rPr>
-          <w:rFonts w:ascii="Calibri" w:hAnsi="Calibri"/>
-          <w:sz w:val="22"/>
-        </w:rPr>
-        <w:t>PROGRAM DIRECTOR, BSIT</w:t>
-        <w:tab/>
-        <w:tab/>
-        <w:tab/>
-        <w:tab/>
-        <w:tab/>
-        <w:t>DEAN, COLLEGE OF COMPUTER STUDIES</w:t>
       </w:r>
     </w:p>
     <w:sectPr>
       <w:headerReference w:type="default" r:id="rId8"/>
       <w:footerReference w:type="default" r:id="rId9"/>
       <w:pgSz w:w="12240" w:h="15840"/>
-      <w:pgMar w:top="1440" w:right="1440" w:bottom="1080" w:left="1440" w:header="720" w:footer="432" w:gutter="0"/>
+      <w:pgMar w:top="2448" w:right="1440" w:bottom="1080" w:left="1440" w:header="720" w:footer="576" w:gutter="0"/>
       <w:pgNumType w:start="1"/>
       <w:cols w:space="720"/>
     </w:sectPr>
@@ -1527,6 +2686,7 @@
         <w:tab w:val="right" w:pos="9360"/>
       </w:tabs>
       <w:spacing w:after="0" w:line="240" w:lineRule="auto"/>
+      <w:jc w:val="right"/>
       <w:rPr>
         <w:rFonts w:ascii="Lily Script One" w:eastAsia="Lily Script One" w:hAnsi="Lily Script One" w:cs="Lily Script One"/>
         <w:i/>
@@ -1534,100 +2694,43 @@
         <w:color w:val="000000"/>
       </w:rPr>
     </w:pPr>
+    <w:r/>
     <w:r>
       <w:rPr>
-        <w:noProof/>
+        <w:rFonts w:ascii="Calibri" w:hAnsi="Calibri"/>
+        <w:sz w:val="22"/>
+        <w:color w:val="555555"/>
       </w:rPr>
-      <mc:AlternateContent>
-        <mc:Choice Requires="wps">
-          <w:drawing>
-            <wp:anchor distT="0" distB="0" distL="114300" distR="114300" simplePos="0" relativeHeight="251659264" behindDoc="0" locked="0" layoutInCell="1" hidden="0" allowOverlap="1" wp14:anchorId="5995C425" wp14:editId="6192A0FF">
-              <wp:simplePos x="0" y="0"/>
-              <wp:positionH relativeFrom="column">
-                <wp:posOffset>-438148</wp:posOffset>
-              </wp:positionH>
-              <wp:positionV relativeFrom="paragraph">
-                <wp:posOffset>-210182</wp:posOffset>
-              </wp:positionV>
-              <wp:extent cx="38100" cy="38100"/>
-              <wp:effectExtent l="0" t="0" r="0" b="0"/>
-              <wp:wrapNone/>
-              <wp:docPr id="2" name="Straight Arrow Connector 2"/>
-              <wp:cNvGraphicFramePr/>
-              <a:graphic xmlns:a="http://schemas.openxmlformats.org/drawingml/2006/main">
-                <a:graphicData uri="http://schemas.microsoft.com/office/word/2010/wordprocessingShape">
-                  <wps:wsp>
-                    <wps:cNvCnPr/>
-                    <wps:spPr>
-                      <a:xfrm>
-                        <a:off x="1978913" y="3780000"/>
-                        <a:ext cx="6734175" cy="0"/>
-                      </a:xfrm>
-                      <a:prstGeom prst="straightConnector1">
-                        <a:avLst/>
-                      </a:prstGeom>
-                      <a:noFill/>
-                      <a:ln w="38100" cap="flat" cmpd="sng">
-                        <a:solidFill>
-                          <a:srgbClr val="008000"/>
-                        </a:solidFill>
-                        <a:prstDash val="solid"/>
-                        <a:round/>
-                        <a:headEnd type="none" w="sm" len="sm"/>
-                        <a:tailEnd type="none" w="sm" len="sm"/>
-                      </a:ln>
-                    </wps:spPr>
-                    <wps:bodyPr/>
-                  </wps:wsp>
-                </a:graphicData>
-              </a:graphic>
-            </wp:anchor>
-          </w:drawing>
-        </mc:Choice>
-        <mc:Fallback xmlns:cr="http://schemas.microsoft.com/office/comments/2020/reactions" xmlns="http://schemas.microsoft.com/office/tasks/2019/documenttasks" xmlns:dgm="http://schemas.openxmlformats.org/drawingml/2006/diagram" xmlns:lc="http://schemas.openxmlformats.org/drawingml/2006/lockedCanvas" xmlns:c="http://schemas.openxmlformats.org/drawingml/2006/chart" xmlns:pic="http://schemas.openxmlformats.org/drawingml/2006/picture" xmlns:a="http://schemas.openxmlformats.org/drawingml/2006/main" xmlns:sl="http://schemas.openxmlformats.org/schemaLibrary/2006/main">
-          <w:drawing>
-            <wp:anchor allowOverlap="1" behindDoc="0" distB="0" distT="0" distL="114300" distR="114300" hidden="0" layoutInCell="1" locked="0" relativeHeight="0" simplePos="0">
-              <wp:simplePos x="0" y="0"/>
-              <wp:positionH relativeFrom="column">
-                <wp:posOffset>-438148</wp:posOffset>
-              </wp:positionH>
-              <wp:positionV relativeFrom="paragraph">
-                <wp:posOffset>-210182</wp:posOffset>
-              </wp:positionV>
-              <wp:extent cx="38100" cy="38100"/>
-              <wp:effectExtent b="0" l="0" r="0" t="0"/>
-              <wp:wrapNone/>
-              <wp:docPr id="2" name="image4.png"/>
-              <a:graphic>
-                <a:graphicData uri="http://schemas.openxmlformats.org/drawingml/2006/picture">
-                  <pic:pic>
-                    <pic:nvPicPr>
-                      <pic:cNvPr id="0" name="image4.png"/>
-                      <pic:cNvPicPr preferRelativeResize="0"/>
-                    </pic:nvPicPr>
-                    <pic:blipFill>
-                      <a:blip r:embed="rId1"/>
-                      <a:srcRect/>
-                      <a:stretch>
-                        <a:fillRect/>
-                      </a:stretch>
-                    </pic:blipFill>
-                    <pic:spPr>
-                      <a:xfrm>
-                        <a:off x="0" y="0"/>
-                        <a:ext cx="38100" cy="38100"/>
-                      </a:xfrm>
-                      <a:prstGeom prst="rect"/>
-                      <a:ln/>
-                    </pic:spPr>
-                  </pic:pic>
-                </a:graphicData>
-              </a:graphic>
-            </wp:anchor>
-          </w:drawing>
-        </mc:Fallback>
-      </mc:AlternateContent>
+      <w:t xml:space="preserve">Page </w:t>
     </w:r>
+    <w:fldSimple w:instr="PAGE">
+      <w:r>
+        <w:rPr>
+          <w:rFonts w:ascii="Calibri" w:hAnsi="Calibri"/>
+          <w:sz w:val="22"/>
+          <w:color w:val="555555"/>
+        </w:rPr>
+        <w:t>1</w:t>
+      </w:r>
+    </w:fldSimple>
+    <w:r>
+      <w:rPr>
+        <w:rFonts w:ascii="Calibri" w:hAnsi="Calibri"/>
+        <w:sz w:val="22"/>
+        <w:color w:val="555555"/>
+      </w:rPr>
+      <w:t xml:space="preserve"> of </w:t>
+    </w:r>
+    <w:fldSimple w:instr="NUMPAGES">
+      <w:r>
+        <w:rPr>
+          <w:rFonts w:ascii="Calibri" w:hAnsi="Calibri"/>
+          <w:sz w:val="22"/>
+          <w:color w:val="555555"/>
+        </w:rPr>
+        <w:t>4</w:t>
+      </w:r>
+    </w:fldSimple>
   </w:p>
 </w:ftr>
 </file>
@@ -1681,6 +2784,7 @@
       <w:rPr>
         <w:rFonts w:ascii="Calibri" w:hAnsi="Calibri"/>
         <w:color w:val="000000"/>
+        <w:sz w:val="22"/>
       </w:rPr>
       <w:t>`</w:t>
     </w:r>
@@ -1688,6 +2792,7 @@
       <w:rPr>
         <w:rFonts w:ascii="Calibri" w:hAnsi="Calibri"/>
         <w:noProof/>
+        <w:sz w:val="22"/>
       </w:rPr>
       <mc:AlternateContent>
         <mc:Choice Requires="wpg">

</xml_diff>

<commit_message>
feat(reports, auth, docs): docx template overhaul, dynamic signatories hierarchy, and auth hardening
</commit_message>
<xml_diff>
--- a/exports/FinLITE-Exported-Report.docx
+++ b/exports/FinLITE-Exported-Report.docx
@@ -2,6 +2,115 @@
 <file path=word/document.xml><?xml version="1.0" encoding="utf-8"?>
 <w:document xmlns:wpc="http://schemas.microsoft.com/office/word/2010/wordprocessingCanvas" xmlns:cx="http://schemas.microsoft.com/office/drawing/2014/chartex" xmlns:cx1="http://schemas.microsoft.com/office/drawing/2015/9/8/chartex" xmlns:cx2="http://schemas.microsoft.com/office/drawing/2015/10/21/chartex" xmlns:cx3="http://schemas.microsoft.com/office/drawing/2016/5/9/chartex" xmlns:cx4="http://schemas.microsoft.com/office/drawing/2016/5/10/chartex" xmlns:cx5="http://schemas.microsoft.com/office/drawing/2016/5/11/chartex" xmlns:cx6="http://schemas.microsoft.com/office/drawing/2016/5/12/chartex" xmlns:cx7="http://schemas.microsoft.com/office/drawing/2016/5/13/chartex" xmlns:cx8="http://schemas.microsoft.com/office/drawing/2016/5/14/chartex" xmlns:mc="http://schemas.openxmlformats.org/markup-compatibility/2006" xmlns:aink="http://schemas.microsoft.com/office/drawing/2016/ink" xmlns:am3d="http://schemas.microsoft.com/office/drawing/2017/model3d" xmlns:o="urn:schemas-microsoft-com:office:office" xmlns:oel="http://schemas.microsoft.com/office/2019/extlst" xmlns:r="http://schemas.openxmlformats.org/officeDocument/2006/relationships" xmlns:m="http://schemas.openxmlformats.org/officeDocument/2006/math" xmlns:v="urn:schemas-microsoft-com:vml" xmlns:wp14="http://schemas.microsoft.com/office/word/2010/wordprocessingDrawing" xmlns:wp="http://schemas.openxmlformats.org/drawingml/2006/wordprocessingDrawing" xmlns:w10="urn:schemas-microsoft-com:office:word" xmlns:w="http://schemas.openxmlformats.org/wordprocessingml/2006/main" xmlns:w14="http://schemas.microsoft.com/office/word/2010/wordml" xmlns:w15="http://schemas.microsoft.com/office/word/2012/wordml" xmlns:w16cex="http://schemas.microsoft.com/office/word/2018/wordml/cex" xmlns:w16cid="http://schemas.microsoft.com/office/word/2016/wordml/cid" xmlns:w16="http://schemas.microsoft.com/office/word/2018/wordml" xmlns:w16du="http://schemas.microsoft.com/office/word/2023/wordml/word16du" xmlns:w16sdtdh="http://schemas.microsoft.com/office/word/2020/wordml/sdtdatahash" xmlns:w16sdtfl="http://schemas.microsoft.com/office/word/2024/wordml/sdtformatlock" xmlns:w16se="http://schemas.microsoft.com/office/word/2015/wordml/symex" xmlns:wpg="http://schemas.microsoft.com/office/word/2010/wordprocessingGroup" xmlns:wpi="http://schemas.microsoft.com/office/word/2010/wordprocessingInk" xmlns:wne="http://schemas.microsoft.com/office/word/2006/wordml" xmlns:wps="http://schemas.microsoft.com/office/word/2010/wordprocessingShape" mc:Ignorable="w14 w15 w16se w16cid w16 w16cex w16sdtdh w16sdtfl w16du wp14">
   <w:body>
+    <w:p>
+      <w:pPr>
+        <w:widowControl w:val="0"/>
+        <w:pBdr>
+          <w:top w:val="nil"/>
+          <w:left w:val="nil"/>
+          <w:bottom w:val="nil"/>
+          <w:right w:val="nil"/>
+          <w:between w:val="nil"/>
+        </w:pBdr>
+        <w:spacing w:after="0" w:line="312" w:lineRule="auto"/>
+        <w:rPr>
+          <w:color w:val="000000"/>
+        </w:rPr>
+      </w:pPr>
+      <w:r>
+        <w:rPr>
+          <w:rFonts w:ascii="Calibri" w:hAnsi="Calibri"/>
+          <w:sz w:val="22"/>
+        </w:rPr>
+        <w:t>September 29, 2026</w:t>
+      </w:r>
+    </w:p>
+    <w:p>
+      <w:pPr>
+        <w:widowControl w:val="0"/>
+        <w:pBdr>
+          <w:top w:val="nil"/>
+          <w:left w:val="nil"/>
+          <w:bottom w:val="nil"/>
+          <w:right w:val="nil"/>
+          <w:between w:val="nil"/>
+        </w:pBdr>
+        <w:spacing w:after="0" w:line="312" w:lineRule="auto"/>
+        <w:rPr>
+          <w:color w:val="000000"/>
+        </w:rPr>
+      </w:pPr>
+    </w:p>
+    <w:p>
+      <w:pPr>
+        <w:widowControl w:val="0"/>
+        <w:pBdr>
+          <w:top w:val="nil"/>
+          <w:left w:val="nil"/>
+          <w:bottom w:val="nil"/>
+          <w:right w:val="nil"/>
+          <w:between w:val="nil"/>
+        </w:pBdr>
+        <w:spacing w:after="0" w:line="312" w:lineRule="auto"/>
+        <w:rPr>
+          <w:color w:val="000000"/>
+        </w:rPr>
+      </w:pPr>
+      <w:r>
+        <w:rPr>
+          <w:rFonts w:ascii="Calibri" w:hAnsi="Calibri"/>
+          <w:sz w:val="22"/>
+        </w:rPr>
+        <w:t>Ms. Ligaya H. Estrella</w:t>
+      </w:r>
+    </w:p>
+    <w:p>
+      <w:pPr>
+        <w:widowControl w:val="0"/>
+        <w:pBdr>
+          <w:top w:val="nil"/>
+          <w:left w:val="nil"/>
+          <w:bottom w:val="nil"/>
+          <w:right w:val="nil"/>
+          <w:between w:val="nil"/>
+        </w:pBdr>
+        <w:spacing w:after="0" w:line="312" w:lineRule="auto"/>
+        <w:rPr>
+          <w:color w:val="000000"/>
+        </w:rPr>
+      </w:pPr>
+      <w:r>
+        <w:rPr>
+          <w:rFonts w:ascii="Calibri" w:hAnsi="Calibri"/>
+          <w:sz w:val="22"/>
+        </w:rPr>
+        <w:t>Co-curricular Affairs Coordinator</w:t>
+      </w:r>
+    </w:p>
+    <w:p>
+      <w:pPr>
+        <w:widowControl w:val="0"/>
+        <w:pBdr>
+          <w:top w:val="nil"/>
+          <w:left w:val="nil"/>
+          <w:bottom w:val="nil"/>
+          <w:right w:val="nil"/>
+          <w:between w:val="nil"/>
+        </w:pBdr>
+        <w:spacing w:after="0" w:line="312" w:lineRule="auto"/>
+        <w:rPr>
+          <w:color w:val="000000"/>
+        </w:rPr>
+      </w:pPr>
+      <w:r>
+        <w:rPr>
+          <w:rFonts w:ascii="Calibri" w:hAnsi="Calibri"/>
+          <w:color w:val="000000"/>
+          <w:sz w:val="22"/>
+        </w:rPr>
+        <w:t>This School</w:t>
+      </w:r>
+    </w:p>
     <w:p>
       <w:pPr>
         <w:widowControl w:val="0"/>
@@ -18,8 +127,6 @@
           <w:color w:val="000000"/>
         </w:rPr>
       </w:pPr>
-      <w:bookmarkStart w:id="0" w:name="_heading=h.ydff1mdgv58k" w:colFirst="0" w:colLast="0"/>
-      <w:bookmarkEnd w:id="0"/>
     </w:p>
     <w:p>
       <w:pPr>
@@ -32,23 +139,6 @@
           <w:between w:val="nil"/>
         </w:pBdr>
         <w:spacing w:after="0" w:line="312" w:lineRule="auto"/>
-        <w:jc w:val="center"/>
-        <w:rPr>
-          <w:color w:val="000000"/>
-        </w:rPr>
-      </w:pPr>
-    </w:p>
-    <w:p>
-      <w:pPr>
-        <w:widowControl w:val="0"/>
-        <w:pBdr>
-          <w:top w:val="nil"/>
-          <w:left w:val="nil"/>
-          <w:bottom w:val="nil"/>
-          <w:right w:val="nil"/>
-          <w:between w:val="nil"/>
-        </w:pBdr>
-        <w:spacing w:after="0" w:line="312" w:lineRule="auto"/>
         <w:rPr>
           <w:color w:val="000000"/>
         </w:rPr>
@@ -58,150 +148,8 @@
           <w:rFonts w:ascii="Calibri" w:hAnsi="Calibri"/>
           <w:sz w:val="22"/>
         </w:rPr>
-        <w:t>September 29, 2026</w:t>
-      </w:r>
-    </w:p>
-    <w:p>
-      <w:pPr>
-        <w:widowControl w:val="0"/>
-        <w:pBdr>
-          <w:top w:val="nil"/>
-          <w:left w:val="nil"/>
-          <w:bottom w:val="nil"/>
-          <w:right w:val="nil"/>
-          <w:between w:val="nil"/>
-        </w:pBdr>
-        <w:spacing w:after="0" w:line="312" w:lineRule="auto"/>
-        <w:rPr>
-          <w:color w:val="000000"/>
-        </w:rPr>
-      </w:pPr>
-    </w:p>
-    <w:p>
-      <w:pPr>
-        <w:widowControl w:val="0"/>
-        <w:pBdr>
-          <w:top w:val="nil"/>
-          <w:left w:val="nil"/>
-          <w:bottom w:val="nil"/>
-          <w:right w:val="nil"/>
-          <w:between w:val="nil"/>
-        </w:pBdr>
-        <w:spacing w:after="0" w:line="312" w:lineRule="auto"/>
-        <w:rPr>
-          <w:color w:val="000000"/>
-        </w:rPr>
-      </w:pPr>
-      <w:r>
-        <w:rPr>
-          <w:rFonts w:ascii="Calibri" w:hAnsi="Calibri"/>
-          <w:sz w:val="22"/>
-        </w:rPr>
-        <w:t>Ms. Ligaya H. Estrella</w:t>
-      </w:r>
-    </w:p>
-    <w:p>
-      <w:pPr>
-        <w:widowControl w:val="0"/>
-        <w:pBdr>
-          <w:top w:val="nil"/>
-          <w:left w:val="nil"/>
-          <w:bottom w:val="nil"/>
-          <w:right w:val="nil"/>
-          <w:between w:val="nil"/>
-        </w:pBdr>
-        <w:spacing w:after="0" w:line="312" w:lineRule="auto"/>
-        <w:rPr>
-          <w:color w:val="000000"/>
-        </w:rPr>
-      </w:pPr>
-      <w:r>
-        <w:rPr>
-          <w:rFonts w:ascii="Calibri" w:hAnsi="Calibri"/>
-          <w:sz w:val="22"/>
-        </w:rPr>
-        <w:t>Co-curricular Affairs Coordinator</w:t>
-      </w:r>
-    </w:p>
-    <w:p>
-      <w:pPr>
-        <w:widowControl w:val="0"/>
-        <w:pBdr>
-          <w:top w:val="nil"/>
-          <w:left w:val="nil"/>
-          <w:bottom w:val="nil"/>
-          <w:right w:val="nil"/>
-          <w:between w:val="nil"/>
-        </w:pBdr>
-        <w:spacing w:after="0" w:line="312" w:lineRule="auto"/>
-        <w:rPr>
-          <w:color w:val="000000"/>
-        </w:rPr>
-      </w:pPr>
-      <w:r>
-        <w:rPr>
-          <w:rFonts w:ascii="Calibri" w:hAnsi="Calibri"/>
-          <w:color w:val="000000"/>
-          <w:sz w:val="22"/>
-        </w:rPr>
-        <w:t>This School</w:t>
-      </w:r>
-    </w:p>
-    <w:p>
-      <w:pPr>
-        <w:widowControl w:val="0"/>
-        <w:pBdr>
-          <w:top w:val="nil"/>
-          <w:left w:val="nil"/>
-          <w:bottom w:val="nil"/>
-          <w:right w:val="nil"/>
-          <w:between w:val="nil"/>
-        </w:pBdr>
-        <w:spacing w:after="0" w:line="312" w:lineRule="auto"/>
-        <w:jc w:val="center"/>
-        <w:rPr>
-          <w:color w:val="000000"/>
-        </w:rPr>
-      </w:pPr>
-    </w:p>
-    <w:p>
-      <w:pPr>
-        <w:widowControl w:val="0"/>
-        <w:pBdr>
-          <w:top w:val="nil"/>
-          <w:left w:val="nil"/>
-          <w:bottom w:val="nil"/>
-          <w:right w:val="nil"/>
-          <w:between w:val="nil"/>
-        </w:pBdr>
-        <w:spacing w:after="0" w:line="312" w:lineRule="auto"/>
-        <w:rPr>
-          <w:color w:val="000000"/>
-        </w:rPr>
-      </w:pPr>
-      <w:r>
-        <w:rPr>
-          <w:rFonts w:ascii="Calibri" w:hAnsi="Calibri"/>
-          <w:sz w:val="22"/>
-        </w:rPr>
         <w:t>Dear Mrs. Estrella,</w:t>
       </w:r>
-    </w:p>
-    <w:p>
-      <w:pPr>
-        <w:widowControl w:val="0"/>
-        <w:pBdr>
-          <w:top w:val="nil"/>
-          <w:left w:val="nil"/>
-          <w:bottom w:val="nil"/>
-          <w:right w:val="nil"/>
-          <w:between w:val="nil"/>
-        </w:pBdr>
-        <w:spacing w:after="0" w:line="312" w:lineRule="auto"/>
-        <w:rPr>
-          <w:color w:val="000000"/>
-        </w:rPr>
-      </w:pPr>
     </w:p>
     <w:p>
       <w:pPr>
@@ -236,44 +184,9 @@
       <w:r>
         <w:rPr>
           <w:rFonts w:ascii="Calibri" w:hAnsi="Calibri"/>
-          <w:color w:val="000000"/>
           <w:sz w:val="22"/>
         </w:rPr>
-        <w:t>This is to respectfully submit the attached “LITE Financial Report” for the 2</w:t>
-      </w:r>
-      <w:r>
-        <w:rPr>
-          <w:rFonts w:ascii="Calibri" w:hAnsi="Calibri"/>
-          <w:color w:val="000000"/>
-          <w:sz w:val="22"/>
-          <w:vertAlign w:val="superscript"/>
-        </w:rPr>
-        <w:t>nd</w:t>
-      </w:r>
-      <w:r>
-        <w:rPr>
-          <w:rFonts w:ascii="Calibri" w:hAnsi="Calibri"/>
-          <w:color w:val="000000"/>
-          <w:sz w:val="22"/>
-        </w:rPr>
-        <w:t xml:space="preserve"> Semester Academic</w:t>
-      </w:r>
-      <w:r>
-        <w:rPr>
-          <w:rFonts w:ascii="Calibri" w:hAnsi="Calibri"/>
-          <w:color w:val="000000"/>
-          <w:sz w:val="22"/>
-          <w:szCs w:val="24"/>
-        </w:rPr>
-        <w:t xml:space="preserve"> </w:t>
-      </w:r>
-      <w:r>
-        <w:rPr>
-          <w:rFonts w:ascii="Calibri" w:hAnsi="Calibri"/>
-          <w:color w:val="000000"/>
-          <w:sz w:val="22"/>
-        </w:rPr>
-        <w:t>Year 2025 – 2026.</w:t>
+        <w:t>This is to respectfully submit the attached “LITE Financial Report” for the 2nd SEMESTER Academic Year 2025–2026.</w:t>
       </w:r>
     </w:p>
     <w:p>
@@ -307,6 +220,52 @@
           <w:color w:val="000000"/>
         </w:rPr>
       </w:pPr>
+      <w:r>
+        <w:rPr>
+          <w:rFonts w:ascii="Calibri" w:hAnsi="Calibri"/>
+          <w:color w:val="000000"/>
+          <w:sz w:val="22"/>
+        </w:rPr>
+        <w:t>Respectfully,</w:t>
+      </w:r>
+    </w:p>
+    <w:p>
+      <w:pPr>
+        <w:pBdr>
+          <w:top w:val="nil"/>
+          <w:left w:val="nil"/>
+          <w:bottom w:val="nil"/>
+          <w:right w:val="nil"/>
+          <w:between w:val="nil"/>
+        </w:pBdr>
+        <w:spacing w:after="0" w:line="240" w:lineRule="auto"/>
+        <w:rPr>
+          <w:color w:val="000000"/>
+        </w:rPr>
+      </w:pPr>
+    </w:p>
+    <w:p>
+      <w:pPr>
+        <w:pBdr>
+          <w:top w:val="nil"/>
+          <w:left w:val="nil"/>
+          <w:bottom w:val="nil"/>
+          <w:right w:val="nil"/>
+          <w:between w:val="nil"/>
+        </w:pBdr>
+        <w:spacing w:after="0" w:line="240" w:lineRule="auto"/>
+        <w:rPr>
+          <w:color w:val="000000"/>
+        </w:rPr>
+      </w:pPr>
+      <w:r>
+        <w:rPr>
+          <w:rFonts w:ascii="Calibri" w:hAnsi="Calibri"/>
+          <w:color w:val="000000"/>
+          <w:sz w:val="22"/>
+        </w:rPr>
+        <w:t>LITE Officers</w:t>
+      </w:r>
     </w:p>
     <w:p>
       <w:pPr>
@@ -323,52 +282,6 @@
           <w:color w:val="000000"/>
         </w:rPr>
       </w:pPr>
-      <w:r>
-        <w:rPr>
-          <w:rFonts w:ascii="Calibri" w:hAnsi="Calibri"/>
-          <w:color w:val="000000"/>
-          <w:sz w:val="22"/>
-        </w:rPr>
-        <w:t>Respectfully,</w:t>
-      </w:r>
-    </w:p>
-    <w:p>
-      <w:pPr>
-        <w:pBdr>
-          <w:top w:val="nil"/>
-          <w:left w:val="nil"/>
-          <w:bottom w:val="nil"/>
-          <w:right w:val="nil"/>
-          <w:between w:val="nil"/>
-        </w:pBdr>
-        <w:spacing w:after="0" w:line="240" w:lineRule="auto"/>
-        <w:rPr>
-          <w:color w:val="000000"/>
-        </w:rPr>
-      </w:pPr>
-    </w:p>
-    <w:p>
-      <w:pPr>
-        <w:pBdr>
-          <w:top w:val="nil"/>
-          <w:left w:val="nil"/>
-          <w:bottom w:val="nil"/>
-          <w:right w:val="nil"/>
-          <w:between w:val="nil"/>
-        </w:pBdr>
-        <w:spacing w:after="0" w:line="240" w:lineRule="auto"/>
-        <w:rPr>
-          <w:color w:val="000000"/>
-        </w:rPr>
-      </w:pPr>
-      <w:r>
-        <w:rPr>
-          <w:rFonts w:ascii="Calibri" w:hAnsi="Calibri"/>
-          <w:color w:val="000000"/>
-          <w:sz w:val="22"/>
-        </w:rPr>
-        <w:t>LITE Officers</w:t>
-      </w:r>
     </w:p>
     <w:p>
       <w:pPr>
@@ -380,47 +293,15 @@
           <w:right w:val="nil"/>
           <w:between w:val="nil"/>
         </w:pBdr>
-        <w:spacing w:after="0" w:line="312" w:lineRule="auto"/>
+        <w:spacing w:after="40" w:line="240" w:lineRule="auto" w:before="280"/>
         <w:rPr>
           <w:color w:val="000000"/>
         </w:rPr>
       </w:pPr>
-    </w:p>
-    <w:p>
-      <w:pPr>
-        <w:widowControl w:val="0"/>
-        <w:pBdr>
-          <w:top w:val="nil"/>
-          <w:left w:val="nil"/>
-          <w:bottom w:val="nil"/>
-          <w:right w:val="nil"/>
-          <w:between w:val="nil"/>
-        </w:pBdr>
-        <w:spacing w:after="0" w:line="312" w:lineRule="auto"/>
-        <w:rPr>
-          <w:color w:val="000000"/>
-        </w:rPr>
-      </w:pPr>
-    </w:p>
-    <w:p>
-      <w:pPr>
-        <w:widowControl w:val="0"/>
-        <w:pBdr>
-          <w:top w:val="nil"/>
-          <w:left w:val="nil"/>
-          <w:bottom w:val="nil"/>
-          <w:right w:val="nil"/>
-          <w:between w:val="nil"/>
-        </w:pBdr>
-        <w:spacing w:after="0" w:line="312" w:lineRule="auto"/>
-        <w:rPr>
-          <w:color w:val="000000"/>
-        </w:rPr>
-      </w:pPr>
       <w:r>
         <w:rPr>
           <w:rFonts w:ascii="Calibri" w:hAnsi="Calibri"/>
-          <w:color w:val="000000"/>
+          <w:b/>
           <w:sz w:val="22"/>
         </w:rPr>
         <w:t>Prepared by:</w:t>
@@ -440,14 +321,15 @@
         </w:tblBorders>
       </w:tblPr>
       <w:tblGrid>
-        <w:gridCol w:w="3120"/>
-        <w:gridCol w:w="3120"/>
-        <w:gridCol w:w="3120"/>
+        <w:gridCol w:w="2340"/>
+        <w:gridCol w:w="2340"/>
+        <w:gridCol w:w="2340"/>
+        <w:gridCol w:w="2340"/>
       </w:tblGrid>
       <w:tr>
         <w:tc>
           <w:tcPr>
-            <w:tcW w:type="dxa" w:w="3120"/>
+            <w:tcW w:type="dxa" w:w="2340"/>
             <w:tcMar>
               <w:top w:w="0" w:type="dxa"/>
               <w:bottom w:w="0" w:type="dxa"/>
@@ -457,7 +339,7 @@
           </w:tcPr>
           <w:p>
             <w:pPr>
-              <w:spacing w:before="320" w:after="20" w:line="240" w:lineRule="auto"/>
+              <w:spacing w:before="480" w:after="20" w:line="240" w:lineRule="auto"/>
             </w:pPr>
             <w:r>
               <w:rPr>
@@ -465,7 +347,7 @@
                 <w:b/>
                 <w:sz w:val="22"/>
               </w:rPr>
-              <w:t>EMANUEL MALBAROSA</w:t>
+              <w:t>CABANAG, ROSE MARIELLE P.</w:t>
             </w:r>
           </w:p>
           <w:p>
@@ -477,13 +359,13 @@
                 <w:rFonts w:ascii="Calibri" w:hAnsi="Calibri"/>
                 <w:sz w:val="22"/>
               </w:rPr>
-              <w:t>LITE PRESIDENT</w:t>
-            </w:r>
-          </w:p>
-        </w:tc>
-        <w:tc>
-          <w:tcPr>
-            <w:tcW w:type="dxa" w:w="3120"/>
+              <w:t>LITE TREASURER</w:t>
+            </w:r>
+          </w:p>
+        </w:tc>
+        <w:tc>
+          <w:tcPr>
+            <w:tcW w:type="dxa" w:w="2340"/>
             <w:tcMar>
               <w:top w:w="0" w:type="dxa"/>
               <w:bottom w:w="0" w:type="dxa"/>
@@ -493,7 +375,7 @@
           </w:tcPr>
           <w:p>
             <w:pPr>
-              <w:spacing w:before="320" w:after="20" w:line="240" w:lineRule="auto"/>
+              <w:spacing w:before="480" w:after="20" w:line="240" w:lineRule="auto"/>
             </w:pPr>
             <w:r>
               <w:rPr>
@@ -501,7 +383,7 @@
                 <w:b/>
                 <w:sz w:val="22"/>
               </w:rPr>
-              <w:t>ANDREI JOHN P. GERONIMO</w:t>
+              <w:t>SARA, RISHAME P.</w:t>
             </w:r>
           </w:p>
           <w:p>
@@ -513,13 +395,13 @@
                 <w:rFonts w:ascii="Calibri" w:hAnsi="Calibri"/>
                 <w:sz w:val="22"/>
               </w:rPr>
-              <w:t>LITE TREASURER</w:t>
-            </w:r>
-          </w:p>
-        </w:tc>
-        <w:tc>
-          <w:tcPr>
-            <w:tcW w:type="dxa" w:w="3120"/>
+              <w:t>LITE AUDITOR</w:t>
+            </w:r>
+          </w:p>
+        </w:tc>
+        <w:tc>
+          <w:tcPr>
+            <w:tcW w:type="dxa" w:w="2340"/>
             <w:tcMar>
               <w:top w:w="0" w:type="dxa"/>
               <w:bottom w:w="0" w:type="dxa"/>
@@ -529,7 +411,7 @@
           </w:tcPr>
           <w:p>
             <w:pPr>
-              <w:spacing w:before="320" w:after="20" w:line="240" w:lineRule="auto"/>
+              <w:spacing w:before="480" w:after="20" w:line="240" w:lineRule="auto"/>
             </w:pPr>
             <w:r>
               <w:rPr>
@@ -537,7 +419,7 @@
                 <w:b/>
                 <w:sz w:val="22"/>
               </w:rPr>
-              <w:t>CHRISTIAN REY C. KASILAG</w:t>
+              <w:t>BAJAMUNDE, JHELLIAM T.</w:t>
             </w:r>
           </w:p>
           <w:p>
@@ -549,7 +431,43 @@
                 <w:rFonts w:ascii="Calibri" w:hAnsi="Calibri"/>
                 <w:sz w:val="22"/>
               </w:rPr>
-              <w:t>LITE AUDITOR</w:t>
+              <w:t>LITE VICE PRESIDENT</w:t>
+            </w:r>
+          </w:p>
+        </w:tc>
+        <w:tc>
+          <w:tcPr>
+            <w:tcW w:type="dxa" w:w="2340"/>
+            <w:tcMar>
+              <w:top w:w="0" w:type="dxa"/>
+              <w:bottom w:w="0" w:type="dxa"/>
+              <w:left w:w="0" w:type="dxa"/>
+              <w:right w:w="120" w:type="dxa"/>
+            </w:tcMar>
+          </w:tcPr>
+          <w:p>
+            <w:pPr>
+              <w:spacing w:before="480" w:after="20" w:line="240" w:lineRule="auto"/>
+            </w:pPr>
+            <w:r>
+              <w:rPr>
+                <w:rFonts w:ascii="Calibri" w:hAnsi="Calibri"/>
+                <w:b/>
+                <w:sz w:val="22"/>
+              </w:rPr>
+              <w:t>GERONIMO, ANDREI JOHN P.</w:t>
+            </w:r>
+          </w:p>
+          <w:p>
+            <w:pPr>
+              <w:spacing w:before="0" w:after="80" w:line="240" w:lineRule="auto"/>
+            </w:pPr>
+            <w:r>
+              <w:rPr>
+                <w:rFonts w:ascii="Calibri" w:hAnsi="Calibri"/>
+                <w:sz w:val="22"/>
+              </w:rPr>
+              <w:t>LITE PRESIDENT</w:t>
             </w:r>
           </w:p>
         </w:tc>
@@ -573,60 +491,19 @@
     </w:p>
     <w:p>
       <w:pPr>
-        <w:widowControl w:val="0"/>
-        <w:pBdr>
-          <w:top w:val="nil"/>
-          <w:left w:val="nil"/>
-          <w:bottom w:val="nil"/>
-          <w:right w:val="nil"/>
-          <w:between w:val="nil"/>
-        </w:pBdr>
-        <w:spacing w:after="0" w:line="312" w:lineRule="auto"/>
-        <w:rPr>
-          <w:color w:val="000000"/>
-        </w:rPr>
-      </w:pPr>
-    </w:p>
-    <w:p>
-      <w:pPr>
-        <w:widowControl w:val="0"/>
-        <w:pBdr>
-          <w:top w:val="nil"/>
-          <w:left w:val="nil"/>
-          <w:bottom w:val="nil"/>
-          <w:right w:val="nil"/>
-          <w:between w:val="nil"/>
-        </w:pBdr>
-        <w:spacing w:after="0" w:line="312" w:lineRule="auto"/>
-        <w:rPr>
-          <w:color w:val="000000"/>
-        </w:rPr>
-      </w:pPr>
-    </w:p>
-    <w:p>
-      <w:pPr>
-        <w:spacing w:after="0"/>
+        <w:spacing w:after="40" w:before="320" w:line="240" w:lineRule="auto"/>
         <w:rPr>
           <w:sz w:val="24"/>
           <w:szCs w:val="24"/>
         </w:rPr>
       </w:pPr>
-    </w:p>
-    <w:p>
-      <w:pPr>
-        <w:spacing w:after="0"/>
-        <w:rPr>
-          <w:sz w:val="24"/>
-          <w:szCs w:val="24"/>
-        </w:rPr>
-      </w:pPr>
       <w:r>
         <w:rPr>
           <w:rFonts w:ascii="Calibri" w:hAnsi="Calibri"/>
+          <w:b/>
           <w:sz w:val="22"/>
-          <w:szCs w:val="24"/>
-        </w:rPr>
-        <w:t>Approved by:</w:t>
+        </w:rPr>
+        <w:t>Noted by:</w:t>
       </w:r>
     </w:p>
     <w:tbl>
@@ -659,7 +536,7 @@
           </w:tcPr>
           <w:p>
             <w:pPr>
-              <w:spacing w:before="320" w:after="20" w:line="240" w:lineRule="auto"/>
+              <w:spacing w:before="480" w:after="20" w:line="240" w:lineRule="auto"/>
             </w:pPr>
             <w:r>
               <w:rPr>
@@ -695,17 +572,41 @@
           </w:tcPr>
           <w:p>
             <w:pPr>
-              <w:spacing w:before="320" w:after="20" w:line="240" w:lineRule="auto"/>
-            </w:pPr>
+              <w:spacing w:before="480" w:after="20" w:line="240" w:lineRule="auto"/>
+            </w:pPr>
+            <w:r>
+              <w:rPr>
+                <w:rFonts w:ascii="Calibri" w:hAnsi="Calibri"/>
+                <w:b/>
+                <w:sz w:val="22"/>
+              </w:rPr>
+              <w:t>MS. KRIZIA MAE GENOVIA</w:t>
+            </w:r>
           </w:p>
           <w:p>
             <w:pPr>
               <w:spacing w:before="0" w:after="80" w:line="240" w:lineRule="auto"/>
             </w:pPr>
+            <w:r>
+              <w:rPr>
+                <w:rFonts w:ascii="Calibri" w:hAnsi="Calibri"/>
+                <w:sz w:val="22"/>
+              </w:rPr>
+              <w:t>LITE CLUB ADVISER</w:t>
+            </w:r>
           </w:p>
         </w:tc>
       </w:tr>
     </w:tbl>
+    <w:p>
+      <w:r>
+        <w:rPr>
+          <w:rFonts w:ascii="Calibri" w:hAnsi="Calibri"/>
+          <w:sz w:val="22"/>
+        </w:rPr>
+        <w:br w:type="page"/>
+      </w:r>
+    </w:p>
     <w:p>
       <w:pPr>
         <w:spacing w:after="0"/>
@@ -713,166 +614,6 @@
           <w:sz w:val="24"/>
           <w:szCs w:val="24"/>
           <w:u w:val="single"/>
-        </w:rPr>
-      </w:pPr>
-    </w:p>
-    <w:p>
-      <w:pPr>
-        <w:spacing w:after="0"/>
-        <w:rPr>
-          <w:sz w:val="24"/>
-          <w:szCs w:val="24"/>
-        </w:rPr>
-      </w:pPr>
-    </w:p>
-    <w:p>
-      <w:pPr>
-        <w:spacing w:after="0"/>
-        <w:rPr>
-          <w:sz w:val="24"/>
-          <w:szCs w:val="24"/>
-        </w:rPr>
-      </w:pPr>
-      <w:r>
-        <w:rPr>
-          <w:rFonts w:ascii="Calibri" w:hAnsi="Calibri"/>
-          <w:sz w:val="22"/>
-          <w:szCs w:val="24"/>
-        </w:rPr>
-        <w:t>Noted by:</w:t>
-      </w:r>
-    </w:p>
-    <w:tbl>
-      <w:tblPr>
-        <w:tblW w:type="auto" w:w="0"/>
-        <w:tblLook w:firstColumn="1" w:firstRow="1" w:lastColumn="0" w:lastRow="0" w:noHBand="0" w:noVBand="1" w:val="04A0"/>
-        <w:tblBorders>
-          <w:top w:val="nil"/>
-          <w:left w:val="nil"/>
-          <w:bottom w:val="nil"/>
-          <w:right w:val="nil"/>
-          <w:insideH w:val="nil"/>
-          <w:insideV w:val="nil"/>
-        </w:tblBorders>
-      </w:tblPr>
-      <w:tblGrid>
-        <w:gridCol w:w="4680"/>
-        <w:gridCol w:w="4680"/>
-      </w:tblGrid>
-      <w:tr>
-        <w:tc>
-          <w:tcPr>
-            <w:tcW w:type="dxa" w:w="4680"/>
-            <w:tcMar>
-              <w:top w:w="0" w:type="dxa"/>
-              <w:bottom w:w="0" w:type="dxa"/>
-              <w:left w:w="0" w:type="dxa"/>
-              <w:right w:w="120" w:type="dxa"/>
-            </w:tcMar>
-          </w:tcPr>
-          <w:p>
-            <w:pPr>
-              <w:spacing w:before="320" w:after="20" w:line="240" w:lineRule="auto"/>
-            </w:pPr>
-            <w:r>
-              <w:rPr>
-                <w:rFonts w:ascii="Calibri" w:hAnsi="Calibri"/>
-                <w:b/>
-                <w:sz w:val="22"/>
-              </w:rPr>
-              <w:t>JOVYLYN ORTIZ-CESAR, MBA, MSIT</w:t>
-            </w:r>
-          </w:p>
-          <w:p>
-            <w:pPr>
-              <w:spacing w:before="0" w:after="80" w:line="240" w:lineRule="auto"/>
-            </w:pPr>
-            <w:r>
-              <w:rPr>
-                <w:rFonts w:ascii="Calibri" w:hAnsi="Calibri"/>
-                <w:sz w:val="22"/>
-              </w:rPr>
-              <w:t>PROGRAM DIRECTOR, BSIT</w:t>
-            </w:r>
-          </w:p>
-        </w:tc>
-        <w:tc>
-          <w:tcPr>
-            <w:tcW w:type="dxa" w:w="4680"/>
-            <w:tcMar>
-              <w:top w:w="0" w:type="dxa"/>
-              <w:bottom w:w="0" w:type="dxa"/>
-              <w:left w:w="0" w:type="dxa"/>
-              <w:right w:w="120" w:type="dxa"/>
-            </w:tcMar>
-          </w:tcPr>
-          <w:p>
-            <w:pPr>
-              <w:spacing w:before="320" w:after="20" w:line="240" w:lineRule="auto"/>
-            </w:pPr>
-            <w:r>
-              <w:rPr>
-                <w:rFonts w:ascii="Calibri" w:hAnsi="Calibri"/>
-                <w:b/>
-                <w:sz w:val="22"/>
-              </w:rPr>
-              <w:t>DR. EMRAIDA MARIE M. MANUCOM</w:t>
-            </w:r>
-          </w:p>
-          <w:p>
-            <w:pPr>
-              <w:spacing w:before="0" w:after="80" w:line="240" w:lineRule="auto"/>
-            </w:pPr>
-            <w:r>
-              <w:rPr>
-                <w:rFonts w:ascii="Calibri" w:hAnsi="Calibri"/>
-                <w:sz w:val="22"/>
-              </w:rPr>
-              <w:t>DEAN, COLLEGE OF COMPUTER STUDIES</w:t>
-            </w:r>
-          </w:p>
-        </w:tc>
-      </w:tr>
-    </w:tbl>
-    <w:p>
-      <w:r>
-        <w:rPr>
-          <w:rFonts w:ascii="Calibri" w:hAnsi="Calibri"/>
-          <w:sz w:val="22"/>
-        </w:rPr>
-        <w:br w:type="page"/>
-      </w:r>
-    </w:p>
-    <w:p>
-      <w:pPr>
-        <w:spacing w:after="0"/>
-        <w:rPr>
-          <w:sz w:val="24"/>
-          <w:szCs w:val="24"/>
-          <w:u w:val="single"/>
-        </w:rPr>
-      </w:pPr>
-    </w:p>
-    <w:p>
-      <w:pPr>
-        <w:spacing w:after="0"/>
-        <w:rPr>
-          <w:sz w:val="24"/>
-          <w:szCs w:val="24"/>
-        </w:rPr>
-      </w:pPr>
-    </w:p>
-    <w:p>
-      <w:pPr>
-        <w:spacing w:after="0"/>
-      </w:pPr>
-    </w:p>
-    <w:p>
-      <w:pPr>
-        <w:spacing w:after="0"/>
-        <w:rPr>
-          <w:b/>
-          <w:bCs/>
         </w:rPr>
       </w:pPr>
     </w:p>
@@ -996,19 +737,13 @@
             <w:gridSpan w:val="5"/>
           </w:tcPr>
           <w:p>
-            <w:pPr>
-              <w:spacing w:line="360" w:lineRule="auto"/>
-              <w:rPr>
+            <w:r>
+              <w:rPr>
+                <w:rFonts w:ascii="Calibri" w:hAnsi="Calibri"/>
                 <w:b/>
-                <w:bCs/>
-              </w:rPr>
-            </w:pPr>
-            <w:r>
-              <w:rPr>
-                <w:rFonts w:ascii="Calibri" w:hAnsi="Calibri"/>
-                <w:sz w:val="22"/>
-              </w:rPr>
-              <w:t>INITIAL BUDGET AS OF FEBRUARY (Carried over from 1st Sem)</w:t>
+                <w:sz w:val="22"/>
+              </w:rPr>
+              <w:t>INITIAL BUDGET / BEGINNING BALANCE (Carried over from prior semester)</w:t>
             </w:r>
           </w:p>
         </w:tc>
@@ -1225,208 +960,6 @@
       </w:tr>
     </w:tbl>
     <w:p>
-      <w:pPr>
-        <w:tabs>
-          <w:tab w:val="left" w:pos="2850"/>
-        </w:tabs>
-        <w:spacing w:after="0"/>
-        <w:rPr>
-          <w:b/>
-          <w:bCs/>
-        </w:rPr>
-      </w:pPr>
-    </w:p>
-    <w:p>
-      <w:pPr>
-        <w:spacing w:after="0"/>
-        <w:jc w:val="center"/>
-        <w:rPr>
-          <w:b/>
-          <w:bCs/>
-        </w:rPr>
-      </w:pPr>
-    </w:p>
-    <w:p>
-      <w:pPr>
-        <w:spacing w:after="0"/>
-        <w:jc w:val="center"/>
-        <w:rPr>
-          <w:b/>
-          <w:bCs/>
-        </w:rPr>
-      </w:pPr>
-    </w:p>
-    <w:p>
-      <w:pPr>
-        <w:spacing w:after="0"/>
-        <w:jc w:val="center"/>
-        <w:rPr>
-          <w:b/>
-          <w:bCs/>
-        </w:rPr>
-      </w:pPr>
-    </w:p>
-    <w:p>
-      <w:pPr>
-        <w:spacing w:after="0"/>
-        <w:jc w:val="center"/>
-        <w:rPr>
-          <w:b/>
-          <w:bCs/>
-        </w:rPr>
-      </w:pPr>
-    </w:p>
-    <w:p>
-      <w:pPr>
-        <w:spacing w:after="0"/>
-        <w:jc w:val="center"/>
-        <w:rPr>
-          <w:b/>
-          <w:bCs/>
-        </w:rPr>
-      </w:pPr>
-    </w:p>
-    <w:p>
-      <w:pPr>
-        <w:spacing w:after="0"/>
-        <w:jc w:val="center"/>
-        <w:rPr>
-          <w:b/>
-          <w:bCs/>
-        </w:rPr>
-      </w:pPr>
-    </w:p>
-    <w:p>
-      <w:pPr>
-        <w:spacing w:after="0"/>
-        <w:jc w:val="center"/>
-        <w:rPr>
-          <w:b/>
-          <w:bCs/>
-        </w:rPr>
-      </w:pPr>
-    </w:p>
-    <w:p>
-      <w:pPr>
-        <w:spacing w:after="0"/>
-        <w:jc w:val="center"/>
-        <w:rPr>
-          <w:b/>
-          <w:bCs/>
-        </w:rPr>
-      </w:pPr>
-    </w:p>
-    <w:p>
-      <w:pPr>
-        <w:spacing w:after="0"/>
-        <w:jc w:val="center"/>
-        <w:rPr>
-          <w:b/>
-          <w:bCs/>
-        </w:rPr>
-      </w:pPr>
-    </w:p>
-    <w:p>
-      <w:pPr>
-        <w:spacing w:after="0"/>
-        <w:jc w:val="center"/>
-        <w:rPr>
-          <w:b/>
-          <w:bCs/>
-        </w:rPr>
-      </w:pPr>
-    </w:p>
-    <w:p>
-      <w:pPr>
-        <w:spacing w:after="0"/>
-        <w:jc w:val="center"/>
-        <w:rPr>
-          <w:b/>
-          <w:bCs/>
-        </w:rPr>
-      </w:pPr>
-    </w:p>
-    <w:p>
-      <w:pPr>
-        <w:spacing w:after="0"/>
-        <w:jc w:val="center"/>
-        <w:rPr>
-          <w:b/>
-          <w:bCs/>
-        </w:rPr>
-      </w:pPr>
-    </w:p>
-    <w:p>
-      <w:pPr>
-        <w:spacing w:after="0"/>
-        <w:jc w:val="center"/>
-        <w:rPr>
-          <w:b/>
-          <w:bCs/>
-        </w:rPr>
-      </w:pPr>
-    </w:p>
-    <w:p>
-      <w:pPr>
-        <w:spacing w:after="0"/>
-        <w:jc w:val="center"/>
-        <w:rPr>
-          <w:b/>
-          <w:bCs/>
-        </w:rPr>
-      </w:pPr>
-    </w:p>
-    <w:p>
-      <w:pPr>
-        <w:spacing w:after="0"/>
-        <w:jc w:val="center"/>
-        <w:rPr>
-          <w:b/>
-          <w:bCs/>
-        </w:rPr>
-      </w:pPr>
-    </w:p>
-    <w:p>
-      <w:pPr>
-        <w:spacing w:after="0"/>
-        <w:jc w:val="center"/>
-        <w:rPr>
-          <w:b/>
-          <w:bCs/>
-        </w:rPr>
-      </w:pPr>
-    </w:p>
-    <w:p>
-      <w:pPr>
-        <w:spacing w:after="0"/>
-        <w:jc w:val="center"/>
-        <w:rPr>
-          <w:b/>
-          <w:bCs/>
-        </w:rPr>
-      </w:pPr>
-    </w:p>
-    <w:p>
-      <w:pPr>
-        <w:spacing w:after="0"/>
-        <w:jc w:val="center"/>
-        <w:rPr>
-          <w:b/>
-          <w:bCs/>
-        </w:rPr>
-      </w:pPr>
-    </w:p>
-    <w:p>
-      <w:pPr>
-        <w:spacing w:after="0"/>
-        <w:jc w:val="center"/>
-        <w:rPr>
-          <w:b/>
-          <w:bCs/>
-        </w:rPr>
-      </w:pPr>
-    </w:p>
-    <w:p>
       <w:r>
         <w:rPr>
           <w:rFonts w:ascii="Calibri" w:hAnsi="Calibri"/>
@@ -1608,234 +1141,6 @@
       </w:tr>
     </w:tbl>
     <w:p>
-      <w:pPr>
-        <w:spacing w:after="0"/>
-        <w:rPr>
-          <w:b/>
-          <w:bCs/>
-        </w:rPr>
-      </w:pPr>
-    </w:p>
-    <w:p>
-      <w:pPr>
-        <w:spacing w:after="0"/>
-        <w:jc w:val="center"/>
-        <w:rPr>
-          <w:b/>
-          <w:bCs/>
-        </w:rPr>
-      </w:pPr>
-    </w:p>
-    <w:p>
-      <w:pPr>
-        <w:spacing w:after="0"/>
-        <w:jc w:val="center"/>
-        <w:rPr>
-          <w:b/>
-          <w:bCs/>
-        </w:rPr>
-      </w:pPr>
-    </w:p>
-    <w:p>
-      <w:pPr>
-        <w:spacing w:after="0"/>
-        <w:jc w:val="center"/>
-        <w:rPr>
-          <w:b/>
-          <w:bCs/>
-        </w:rPr>
-      </w:pPr>
-    </w:p>
-    <w:p>
-      <w:pPr>
-        <w:spacing w:after="0"/>
-        <w:jc w:val="center"/>
-        <w:rPr>
-          <w:b/>
-          <w:bCs/>
-        </w:rPr>
-      </w:pPr>
-    </w:p>
-    <w:p>
-      <w:pPr>
-        <w:spacing w:after="0"/>
-        <w:jc w:val="center"/>
-        <w:rPr>
-          <w:b/>
-          <w:bCs/>
-        </w:rPr>
-      </w:pPr>
-    </w:p>
-    <w:p>
-      <w:pPr>
-        <w:spacing w:after="0"/>
-        <w:jc w:val="center"/>
-        <w:rPr>
-          <w:b/>
-          <w:bCs/>
-        </w:rPr>
-      </w:pPr>
-    </w:p>
-    <w:p>
-      <w:pPr>
-        <w:spacing w:after="0"/>
-        <w:jc w:val="center"/>
-        <w:rPr>
-          <w:b/>
-          <w:bCs/>
-        </w:rPr>
-      </w:pPr>
-    </w:p>
-    <w:p>
-      <w:pPr>
-        <w:spacing w:after="0"/>
-        <w:jc w:val="center"/>
-        <w:rPr>
-          <w:b/>
-          <w:bCs/>
-        </w:rPr>
-      </w:pPr>
-    </w:p>
-    <w:p>
-      <w:pPr>
-        <w:spacing w:after="0"/>
-        <w:jc w:val="center"/>
-        <w:rPr>
-          <w:b/>
-          <w:bCs/>
-        </w:rPr>
-      </w:pPr>
-    </w:p>
-    <w:p>
-      <w:pPr>
-        <w:spacing w:after="0"/>
-        <w:jc w:val="center"/>
-        <w:rPr>
-          <w:b/>
-          <w:bCs/>
-        </w:rPr>
-      </w:pPr>
-    </w:p>
-    <w:p>
-      <w:pPr>
-        <w:spacing w:after="0"/>
-        <w:jc w:val="center"/>
-        <w:rPr>
-          <w:b/>
-          <w:bCs/>
-        </w:rPr>
-      </w:pPr>
-    </w:p>
-    <w:p>
-      <w:pPr>
-        <w:spacing w:after="0"/>
-        <w:jc w:val="center"/>
-        <w:rPr>
-          <w:b/>
-          <w:bCs/>
-        </w:rPr>
-      </w:pPr>
-    </w:p>
-    <w:p>
-      <w:pPr>
-        <w:spacing w:after="0"/>
-        <w:jc w:val="center"/>
-        <w:rPr>
-          <w:b/>
-          <w:bCs/>
-        </w:rPr>
-      </w:pPr>
-    </w:p>
-    <w:p>
-      <w:pPr>
-        <w:spacing w:after="0"/>
-        <w:jc w:val="center"/>
-        <w:rPr>
-          <w:b/>
-          <w:bCs/>
-        </w:rPr>
-      </w:pPr>
-    </w:p>
-    <w:p>
-      <w:pPr>
-        <w:spacing w:after="0"/>
-        <w:jc w:val="center"/>
-        <w:rPr>
-          <w:b/>
-          <w:bCs/>
-        </w:rPr>
-      </w:pPr>
-    </w:p>
-    <w:p>
-      <w:pPr>
-        <w:spacing w:after="0"/>
-        <w:jc w:val="center"/>
-        <w:rPr>
-          <w:b/>
-          <w:bCs/>
-        </w:rPr>
-      </w:pPr>
-    </w:p>
-    <w:p>
-      <w:pPr>
-        <w:spacing w:after="0"/>
-        <w:jc w:val="center"/>
-        <w:rPr>
-          <w:b/>
-          <w:bCs/>
-        </w:rPr>
-      </w:pPr>
-    </w:p>
-    <w:p>
-      <w:pPr>
-        <w:spacing w:after="0"/>
-        <w:jc w:val="center"/>
-        <w:rPr>
-          <w:b/>
-          <w:bCs/>
-        </w:rPr>
-      </w:pPr>
-    </w:p>
-    <w:p>
-      <w:pPr>
-        <w:spacing w:after="0"/>
-        <w:jc w:val="center"/>
-        <w:rPr>
-          <w:b/>
-          <w:bCs/>
-        </w:rPr>
-      </w:pPr>
-    </w:p>
-    <w:p>
-      <w:pPr>
-        <w:spacing w:after="0"/>
-        <w:jc w:val="center"/>
-        <w:rPr>
-          <w:b/>
-          <w:bCs/>
-        </w:rPr>
-      </w:pPr>
-    </w:p>
-    <w:p>
-      <w:pPr>
-        <w:spacing w:after="0"/>
-        <w:jc w:val="center"/>
-        <w:rPr>
-          <w:b/>
-          <w:bCs/>
-        </w:rPr>
-      </w:pPr>
-    </w:p>
-    <w:p>
-      <w:pPr>
-        <w:spacing w:after="0"/>
-        <w:rPr>
-          <w:b/>
-          <w:bCs/>
-        </w:rPr>
-      </w:pPr>
-    </w:p>
-    <w:p>
       <w:r>
         <w:rPr>
           <w:rFonts w:ascii="Calibri" w:hAnsi="Calibri"/>
@@ -2057,11 +1362,6 @@
     </w:p>
     <w:p>
       <w:pPr>
-        <w:spacing w:after="0"/>
-      </w:pPr>
-    </w:p>
-    <w:p>
-      <w:pPr>
         <w:widowControl w:val="0"/>
         <w:pBdr>
           <w:top w:val="nil"/>
@@ -2070,146 +1370,18 @@
           <w:right w:val="nil"/>
           <w:between w:val="nil"/>
         </w:pBdr>
-        <w:spacing w:after="0" w:line="312" w:lineRule="auto"/>
+        <w:spacing w:after="40" w:line="240" w:lineRule="auto" w:before="280"/>
         <w:rPr>
           <w:color w:val="000000"/>
         </w:rPr>
       </w:pPr>
-    </w:p>
-    <w:p>
-      <w:pPr>
-        <w:widowControl w:val="0"/>
-        <w:pBdr>
-          <w:top w:val="nil"/>
-          <w:left w:val="nil"/>
-          <w:bottom w:val="nil"/>
-          <w:right w:val="nil"/>
-          <w:between w:val="nil"/>
-        </w:pBdr>
-        <w:spacing w:after="0" w:line="312" w:lineRule="auto"/>
-        <w:rPr>
-          <w:color w:val="000000"/>
-        </w:rPr>
-      </w:pPr>
-    </w:p>
-    <w:p>
-      <w:pPr>
-        <w:widowControl w:val="0"/>
-        <w:pBdr>
-          <w:top w:val="nil"/>
-          <w:left w:val="nil"/>
-          <w:bottom w:val="nil"/>
-          <w:right w:val="nil"/>
-          <w:between w:val="nil"/>
-        </w:pBdr>
-        <w:spacing w:after="0" w:line="312" w:lineRule="auto"/>
-        <w:rPr>
-          <w:color w:val="000000"/>
-        </w:rPr>
-      </w:pPr>
       <w:r>
         <w:rPr>
           <w:rFonts w:ascii="Calibri" w:hAnsi="Calibri"/>
-          <w:color w:val="000000"/>
+          <w:b/>
           <w:sz w:val="22"/>
         </w:rPr>
         <w:t>Prepared by:</w:t>
-      </w:r>
-      <w:r>
-        <w:rPr>
-          <w:rFonts w:ascii="Calibri" w:hAnsi="Calibri"/>
-          <w:noProof/>
-          <w:sz w:val="22"/>
-        </w:rPr>
-        <mc:AlternateContent>
-          <mc:Choice Requires="wps">
-            <w:drawing>
-              <wp:anchor distT="0" distB="0" distL="114300" distR="114300" simplePos="0" relativeHeight="251658240" behindDoc="0" locked="0" layoutInCell="1" hidden="0" allowOverlap="1" wp14:anchorId="2E35FB9D" wp14:editId="680291AC">
-                <wp:simplePos x="0" y="0"/>
-                <wp:positionH relativeFrom="column">
-                  <wp:posOffset>3726815</wp:posOffset>
-                </wp:positionH>
-                <wp:positionV relativeFrom="paragraph">
-                  <wp:posOffset>184785</wp:posOffset>
-                </wp:positionV>
-                <wp:extent cx="12700" cy="12700"/>
-                <wp:effectExtent l="0" t="0" r="0" b="0"/>
-                <wp:wrapNone/>
-                <wp:docPr id="3" name="Straight Arrow Connector 3"/>
-                <wp:cNvGraphicFramePr/>
-                <a:graphic xmlns:a="http://schemas.openxmlformats.org/drawingml/2006/main">
-                  <a:graphicData uri="http://schemas.microsoft.com/office/word/2010/wordprocessingShape">
-                    <wps:wsp>
-                      <wps:cNvCnPr/>
-                      <wps:spPr>
-                        <a:xfrm>
-                          <a:off x="4668129" y="3780000"/>
-                          <a:ext cx="1355743" cy="0"/>
-                        </a:xfrm>
-                        <a:prstGeom prst="straightConnector1">
-                          <a:avLst/>
-                        </a:prstGeom>
-                        <a:noFill/>
-                        <a:ln w="9525" cap="flat" cmpd="sng">
-                          <a:solidFill>
-                            <a:schemeClr val="dk1"/>
-                          </a:solidFill>
-                          <a:prstDash val="solid"/>
-                          <a:round/>
-                          <a:headEnd type="none" w="sm" len="sm"/>
-                          <a:tailEnd type="none" w="sm" len="sm"/>
-                        </a:ln>
-                      </wps:spPr>
-                      <wps:bodyPr/>
-                    </wps:wsp>
-                  </a:graphicData>
-                </a:graphic>
-              </wp:anchor>
-            </w:drawing>
-          </mc:Choice>
-          <mc:Fallback xmlns:cr="http://schemas.microsoft.com/office/comments/2020/reactions" xmlns="http://schemas.microsoft.com/office/tasks/2019/documenttasks" xmlns:dgm="http://schemas.openxmlformats.org/drawingml/2006/diagram" xmlns:lc="http://schemas.openxmlformats.org/drawingml/2006/lockedCanvas" xmlns:c="http://schemas.openxmlformats.org/drawingml/2006/chart" xmlns:pic="http://schemas.openxmlformats.org/drawingml/2006/picture" xmlns:a="http://schemas.openxmlformats.org/drawingml/2006/main" xmlns:sl="http://schemas.openxmlformats.org/schemaLibrary/2006/main">
-            <w:drawing>
-              <wp:anchor allowOverlap="1" behindDoc="0" distB="0" distT="0" distL="114300" distR="114300" hidden="0" layoutInCell="1" locked="0" relativeHeight="0" simplePos="0">
-                <wp:simplePos x="0" y="0"/>
-                <wp:positionH relativeFrom="column">
-                  <wp:posOffset>3726815</wp:posOffset>
-                </wp:positionH>
-                <wp:positionV relativeFrom="paragraph">
-                  <wp:posOffset>184785</wp:posOffset>
-                </wp:positionV>
-                <wp:extent cx="12700" cy="12700"/>
-                <wp:effectExtent b="0" l="0" r="0" t="0"/>
-                <wp:wrapNone/>
-                <wp:docPr id="3" name="image5.png"/>
-                <a:graphic>
-                  <a:graphicData uri="http://schemas.openxmlformats.org/drawingml/2006/picture">
-                    <pic:pic>
-                      <pic:nvPicPr>
-                        <pic:cNvPr id="0" name="image5.png"/>
-                        <pic:cNvPicPr preferRelativeResize="0"/>
-                      </pic:nvPicPr>
-                      <pic:blipFill>
-                        <a:blip r:embed="rId7"/>
-                        <a:srcRect/>
-                        <a:stretch>
-                          <a:fillRect/>
-                        </a:stretch>
-                      </pic:blipFill>
-                      <pic:spPr>
-                        <a:xfrm>
-                          <a:off x="0" y="0"/>
-                          <a:ext cx="12700" cy="12700"/>
-                        </a:xfrm>
-                        <a:prstGeom prst="rect"/>
-                        <a:ln/>
-                      </pic:spPr>
-                    </pic:pic>
-                  </a:graphicData>
-                </a:graphic>
-              </wp:anchor>
-            </w:drawing>
-          </mc:Fallback>
-        </mc:AlternateContent>
       </w:r>
     </w:p>
     <w:tbl>
@@ -2226,14 +1398,15 @@
         </w:tblBorders>
       </w:tblPr>
       <w:tblGrid>
-        <w:gridCol w:w="3120"/>
-        <w:gridCol w:w="3120"/>
-        <w:gridCol w:w="3120"/>
+        <w:gridCol w:w="2340"/>
+        <w:gridCol w:w="2340"/>
+        <w:gridCol w:w="2340"/>
+        <w:gridCol w:w="2340"/>
       </w:tblGrid>
       <w:tr>
         <w:tc>
           <w:tcPr>
-            <w:tcW w:type="dxa" w:w="3120"/>
+            <w:tcW w:type="dxa" w:w="2340"/>
             <w:tcMar>
               <w:top w:w="0" w:type="dxa"/>
               <w:bottom w:w="0" w:type="dxa"/>
@@ -2243,7 +1416,7 @@
           </w:tcPr>
           <w:p>
             <w:pPr>
-              <w:spacing w:before="320" w:after="20" w:line="240" w:lineRule="auto"/>
+              <w:spacing w:before="480" w:after="20" w:line="240" w:lineRule="auto"/>
             </w:pPr>
             <w:r>
               <w:rPr>
@@ -2251,7 +1424,7 @@
                 <w:b/>
                 <w:sz w:val="22"/>
               </w:rPr>
-              <w:t>EMANUEL MALBAROSA</w:t>
+              <w:t>CABANAG, ROSE MARIELLE P.</w:t>
             </w:r>
           </w:p>
           <w:p>
@@ -2263,13 +1436,13 @@
                 <w:rFonts w:ascii="Calibri" w:hAnsi="Calibri"/>
                 <w:sz w:val="22"/>
               </w:rPr>
-              <w:t>LITE PRESIDENT</w:t>
-            </w:r>
-          </w:p>
-        </w:tc>
-        <w:tc>
-          <w:tcPr>
-            <w:tcW w:type="dxa" w:w="3120"/>
+              <w:t>LITE TREASURER</w:t>
+            </w:r>
+          </w:p>
+        </w:tc>
+        <w:tc>
+          <w:tcPr>
+            <w:tcW w:type="dxa" w:w="2340"/>
             <w:tcMar>
               <w:top w:w="0" w:type="dxa"/>
               <w:bottom w:w="0" w:type="dxa"/>
@@ -2279,7 +1452,7 @@
           </w:tcPr>
           <w:p>
             <w:pPr>
-              <w:spacing w:before="320" w:after="20" w:line="240" w:lineRule="auto"/>
+              <w:spacing w:before="480" w:after="20" w:line="240" w:lineRule="auto"/>
             </w:pPr>
             <w:r>
               <w:rPr>
@@ -2287,7 +1460,7 @@
                 <w:b/>
                 <w:sz w:val="22"/>
               </w:rPr>
-              <w:t>ANDREI JOHN P. GERONIMO</w:t>
+              <w:t>SARA, RISHAME P.</w:t>
             </w:r>
           </w:p>
           <w:p>
@@ -2299,13 +1472,13 @@
                 <w:rFonts w:ascii="Calibri" w:hAnsi="Calibri"/>
                 <w:sz w:val="22"/>
               </w:rPr>
-              <w:t>LITE TREASURER</w:t>
-            </w:r>
-          </w:p>
-        </w:tc>
-        <w:tc>
-          <w:tcPr>
-            <w:tcW w:type="dxa" w:w="3120"/>
+              <w:t>LITE AUDITOR</w:t>
+            </w:r>
+          </w:p>
+        </w:tc>
+        <w:tc>
+          <w:tcPr>
+            <w:tcW w:type="dxa" w:w="2340"/>
             <w:tcMar>
               <w:top w:w="0" w:type="dxa"/>
               <w:bottom w:w="0" w:type="dxa"/>
@@ -2315,7 +1488,7 @@
           </w:tcPr>
           <w:p>
             <w:pPr>
-              <w:spacing w:before="320" w:after="20" w:line="240" w:lineRule="auto"/>
+              <w:spacing w:before="480" w:after="20" w:line="240" w:lineRule="auto"/>
             </w:pPr>
             <w:r>
               <w:rPr>
@@ -2323,7 +1496,7 @@
                 <w:b/>
                 <w:sz w:val="22"/>
               </w:rPr>
-              <w:t>CHRISTIAN REY C. KASILAG</w:t>
+              <w:t>BAJAMUNDE, JHELLIAM T.</w:t>
             </w:r>
           </w:p>
           <w:p>
@@ -2335,7 +1508,43 @@
                 <w:rFonts w:ascii="Calibri" w:hAnsi="Calibri"/>
                 <w:sz w:val="22"/>
               </w:rPr>
-              <w:t>LITE AUDITOR</w:t>
+              <w:t>LITE VICE PRESIDENT</w:t>
+            </w:r>
+          </w:p>
+        </w:tc>
+        <w:tc>
+          <w:tcPr>
+            <w:tcW w:type="dxa" w:w="2340"/>
+            <w:tcMar>
+              <w:top w:w="0" w:type="dxa"/>
+              <w:bottom w:w="0" w:type="dxa"/>
+              <w:left w:w="0" w:type="dxa"/>
+              <w:right w:w="120" w:type="dxa"/>
+            </w:tcMar>
+          </w:tcPr>
+          <w:p>
+            <w:pPr>
+              <w:spacing w:before="480" w:after="20" w:line="240" w:lineRule="auto"/>
+            </w:pPr>
+            <w:r>
+              <w:rPr>
+                <w:rFonts w:ascii="Calibri" w:hAnsi="Calibri"/>
+                <w:b/>
+                <w:sz w:val="22"/>
+              </w:rPr>
+              <w:t>GERONIMO, ANDREI JOHN P.</w:t>
+            </w:r>
+          </w:p>
+          <w:p>
+            <w:pPr>
+              <w:spacing w:before="0" w:after="80" w:line="240" w:lineRule="auto"/>
+            </w:pPr>
+            <w:r>
+              <w:rPr>
+                <w:rFonts w:ascii="Calibri" w:hAnsi="Calibri"/>
+                <w:sz w:val="22"/>
+              </w:rPr>
+              <w:t>LITE PRESIDENT</w:t>
             </w:r>
           </w:p>
         </w:tc>
@@ -2359,28 +1568,19 @@
     </w:p>
     <w:p>
       <w:pPr>
-        <w:spacing w:after="0"/>
+        <w:spacing w:after="40" w:before="320" w:line="240" w:lineRule="auto"/>
         <w:rPr>
           <w:sz w:val="24"/>
           <w:szCs w:val="24"/>
         </w:rPr>
       </w:pPr>
-    </w:p>
-    <w:p>
-      <w:pPr>
-        <w:spacing w:after="0"/>
-        <w:rPr>
-          <w:sz w:val="24"/>
-          <w:szCs w:val="24"/>
-        </w:rPr>
-      </w:pPr>
       <w:r>
         <w:rPr>
           <w:rFonts w:ascii="Calibri" w:hAnsi="Calibri"/>
+          <w:b/>
           <w:sz w:val="22"/>
-          <w:szCs w:val="24"/>
-        </w:rPr>
-        <w:t>Approved by:</w:t>
+        </w:rPr>
+        <w:t>Noted by:</w:t>
       </w:r>
     </w:p>
     <w:tbl>
@@ -2413,7 +1613,7 @@
           </w:tcPr>
           <w:p>
             <w:pPr>
-              <w:spacing w:before="320" w:after="20" w:line="240" w:lineRule="auto"/>
+              <w:spacing w:before="480" w:after="20" w:line="240" w:lineRule="auto"/>
             </w:pPr>
             <w:r>
               <w:rPr>
@@ -2449,13 +1649,28 @@
           </w:tcPr>
           <w:p>
             <w:pPr>
-              <w:spacing w:before="320" w:after="20" w:line="240" w:lineRule="auto"/>
-            </w:pPr>
+              <w:spacing w:before="480" w:after="20" w:line="240" w:lineRule="auto"/>
+            </w:pPr>
+            <w:r>
+              <w:rPr>
+                <w:rFonts w:ascii="Calibri" w:hAnsi="Calibri"/>
+                <w:b/>
+                <w:sz w:val="22"/>
+              </w:rPr>
+              <w:t>MS. KRIZIA MAE GENOVIA</w:t>
+            </w:r>
           </w:p>
           <w:p>
             <w:pPr>
               <w:spacing w:before="0" w:after="80" w:line="240" w:lineRule="auto"/>
             </w:pPr>
+            <w:r>
+              <w:rPr>
+                <w:rFonts w:ascii="Calibri" w:hAnsi="Calibri"/>
+                <w:sz w:val="22"/>
+              </w:rPr>
+              <w:t>LITE CLUB ADVISER</w:t>
+            </w:r>
           </w:p>
         </w:tc>
       </w:tr>
@@ -2469,175 +1684,12 @@
           <w:u w:val="single"/>
         </w:rPr>
       </w:pPr>
-    </w:p>
-    <w:p>
-      <w:pPr>
-        <w:spacing w:after="0"/>
-        <w:rPr>
-          <w:sz w:val="24"/>
-          <w:szCs w:val="24"/>
-        </w:rPr>
-      </w:pPr>
-    </w:p>
-    <w:p>
-      <w:pPr>
-        <w:spacing w:after="0"/>
-        <w:rPr>
-          <w:sz w:val="24"/>
-          <w:szCs w:val="24"/>
-        </w:rPr>
-      </w:pPr>
-      <w:r>
-        <w:rPr>
-          <w:rFonts w:ascii="Calibri" w:hAnsi="Calibri"/>
-          <w:sz w:val="22"/>
-          <w:szCs w:val="24"/>
-        </w:rPr>
-        <w:t>Noted by:</w:t>
-      </w:r>
-    </w:p>
-    <w:tbl>
-      <w:tblPr>
-        <w:tblW w:type="auto" w:w="0"/>
-        <w:tblLook w:firstColumn="1" w:firstRow="1" w:lastColumn="0" w:lastRow="0" w:noHBand="0" w:noVBand="1" w:val="04A0"/>
-        <w:tblBorders>
-          <w:top w:val="nil"/>
-          <w:left w:val="nil"/>
-          <w:bottom w:val="nil"/>
-          <w:right w:val="nil"/>
-          <w:insideH w:val="nil"/>
-          <w:insideV w:val="nil"/>
-        </w:tblBorders>
-      </w:tblPr>
-      <w:tblGrid>
-        <w:gridCol w:w="4680"/>
-        <w:gridCol w:w="4680"/>
-      </w:tblGrid>
-      <w:tr>
-        <w:tc>
-          <w:tcPr>
-            <w:tcW w:type="dxa" w:w="4680"/>
-            <w:tcMar>
-              <w:top w:w="0" w:type="dxa"/>
-              <w:bottom w:w="0" w:type="dxa"/>
-              <w:left w:w="0" w:type="dxa"/>
-              <w:right w:w="120" w:type="dxa"/>
-            </w:tcMar>
-          </w:tcPr>
-          <w:p>
-            <w:pPr>
-              <w:spacing w:before="320" w:after="20" w:line="240" w:lineRule="auto"/>
-            </w:pPr>
-            <w:r>
-              <w:rPr>
-                <w:rFonts w:ascii="Calibri" w:hAnsi="Calibri"/>
-                <w:b/>
-                <w:sz w:val="22"/>
-              </w:rPr>
-              <w:t>JOVYLYN ORTIZ-CESAR, MBA, MSIT</w:t>
-            </w:r>
-          </w:p>
-          <w:p>
-            <w:pPr>
-              <w:spacing w:before="0" w:after="80" w:line="240" w:lineRule="auto"/>
-            </w:pPr>
-            <w:r>
-              <w:rPr>
-                <w:rFonts w:ascii="Calibri" w:hAnsi="Calibri"/>
-                <w:sz w:val="22"/>
-              </w:rPr>
-              <w:t>PROGRAM DIRECTOR, BSIT</w:t>
-            </w:r>
-          </w:p>
-        </w:tc>
-        <w:tc>
-          <w:tcPr>
-            <w:tcW w:type="dxa" w:w="4680"/>
-            <w:tcMar>
-              <w:top w:w="0" w:type="dxa"/>
-              <w:bottom w:w="0" w:type="dxa"/>
-              <w:left w:w="0" w:type="dxa"/>
-              <w:right w:w="120" w:type="dxa"/>
-            </w:tcMar>
-          </w:tcPr>
-          <w:p>
-            <w:pPr>
-              <w:spacing w:before="320" w:after="20" w:line="240" w:lineRule="auto"/>
-            </w:pPr>
-            <w:r>
-              <w:rPr>
-                <w:rFonts w:ascii="Calibri" w:hAnsi="Calibri"/>
-                <w:b/>
-                <w:sz w:val="22"/>
-              </w:rPr>
-              <w:t>DR. EMRAIDA MARIE M. MANUCOM</w:t>
-            </w:r>
-          </w:p>
-          <w:p>
-            <w:pPr>
-              <w:spacing w:before="0" w:after="80" w:line="240" w:lineRule="auto"/>
-            </w:pPr>
-            <w:r>
-              <w:rPr>
-                <w:rFonts w:ascii="Calibri" w:hAnsi="Calibri"/>
-                <w:sz w:val="22"/>
-              </w:rPr>
-              <w:t>DEAN, COLLEGE OF COMPUTER STUDIES</w:t>
-            </w:r>
-          </w:p>
-        </w:tc>
-      </w:tr>
-    </w:tbl>
-    <w:p>
-      <w:pPr>
-        <w:spacing w:after="0"/>
-        <w:rPr>
-          <w:sz w:val="24"/>
-          <w:szCs w:val="24"/>
-          <w:u w:val="single"/>
-        </w:rPr>
-      </w:pPr>
-    </w:p>
-    <w:p>
-      <w:pPr>
-        <w:spacing w:after="0"/>
-        <w:rPr>
-          <w:sz w:val="24"/>
-          <w:szCs w:val="24"/>
-        </w:rPr>
-      </w:pPr>
-    </w:p>
-    <w:p>
-      <w:pPr>
-        <w:spacing w:after="0"/>
-      </w:pPr>
-      <w:r>
-        <w:rPr>
-          <w:rFonts w:ascii="Calibri" w:hAnsi="Calibri"/>
-          <w:sz w:val="22"/>
-        </w:rPr>
-        <w:tab/>
-      </w:r>
-      <w:r>
-        <w:rPr>
-          <w:rFonts w:ascii="Calibri" w:hAnsi="Calibri"/>
-          <w:sz w:val="22"/>
-        </w:rPr>
-        <w:tab/>
-      </w:r>
-      <w:r>
-        <w:rPr>
-          <w:rFonts w:ascii="Calibri" w:hAnsi="Calibri"/>
-          <w:sz w:val="22"/>
-        </w:rPr>
-        <w:tab/>
-      </w:r>
     </w:p>
     <w:sectPr>
       <w:headerReference w:type="default" r:id="rId8"/>
       <w:footerReference w:type="default" r:id="rId9"/>
       <w:pgSz w:w="12240" w:h="15840"/>
-      <w:pgMar w:top="2448" w:right="1440" w:bottom="1080" w:left="1440" w:header="720" w:footer="576" w:gutter="0"/>
+      <w:pgMar w:top="1584" w:right="1440" w:bottom="1080" w:left="1440" w:header="288" w:footer="504" w:gutter="0"/>
       <w:pgNumType w:start="1"/>
       <w:cols w:space="720"/>
     </w:sectPr>

</xml_diff>